<commit_message>
Refine CNY brief: own gear, pre-reg, festive UI
Drop PC and furniture rental from the estimate, note advance 5x5
registration and all-day cosplay photos, keep the 900k total, and
restyle the brief site with a stronger Chinese New Year look.

Co-authored-by: harakirijkee <harakirijkee@gmail.com>
</commit_message>
<xml_diff>
--- a/MLBB_CyberSaturday_CNY_Brief_Budget.docx
+++ b/MLBB_CyberSaturday_CNY_Brief_Budget.docx
@@ -10,7 +10,7 @@
         <w:rPr>
           <w:rFonts w:ascii="Arial" w:hAnsi="Arial" w:eastAsia="Arial"/>
           <w:b/>
-          <w:color w:val="8C141E"/>
+          <w:color w:val="C41E3A"/>
           <w:sz w:val="36"/>
         </w:rPr>
         <w:t>Зона Mobile Legends + Genshin Impact на «Киберсубботе»</w:t>
@@ -38,7 +38,7 @@
         <w:rPr>
           <w:rFonts w:ascii="Arial" w:hAnsi="Arial" w:eastAsia="Arial"/>
           <w:b/>
-          <w:color w:val="8C141E"/>
+          <w:color w:val="C41E3A"/>
           <w:sz w:val="32"/>
         </w:rPr>
         <w:t>1. Описание</w:t>
@@ -54,7 +54,7 @@
           <w:b w:val="0"/>
           <w:sz w:val="22"/>
         </w:rPr>
-        <w:t>Тематическая зона Mobile Legends и уголок Genshin Impact внутри фестиваля «Киберсуббота» в Сколково. Мероприятие приурочено к Китайскому Новому году (6 февраля 2027). В эти же даты у Genshin Impact проходит внутриигровой ивент (Lantern Rite / сезонный CNY-ивент) — это используем как смысловой и визуальный якорь зоны.</w:t>
+        <w:t>Тематическая зона Mobile Legends и уголок Genshin Impact внутри фестиваля «Киберсуббота» в Сколково. Мероприятие приурочено к Китайскому Новому году (6 февраля 2027). Команды на турнир 5×5 регистрируются заранее. ПК, столы и PlayStation — оборудование площадки (аренда не нужна). В эти же даты у Genshin Impact проходит внутриигровой CNY-ивент — используем как визуальный якорь зоны.</w:t>
       </w:r>
     </w:p>
     <w:p>
@@ -80,7 +80,7 @@
           <w:b w:val="0"/>
           <w:sz w:val="22"/>
         </w:rPr>
-        <w:t>турнир 5×5 с призовым фондом 40 000 ₽ и алмазами</w:t>
+        <w:t>турнир 5×5 (команды регистрируются заранее) с призовым фондом 40 000 ₽ и алмазами</w:t>
       </w:r>
     </w:p>
     <w:p>
@@ -119,7 +119,7 @@
           <w:b w:val="0"/>
           <w:sz w:val="22"/>
         </w:rPr>
-        <w:t>косплей (2 косплеера) и фотозона 3×2 м по нашему дизайну</w:t>
+        <w:t>2 косплеера и фотозона 3×2 м — фото с косплеерами доступны весь день</w:t>
       </w:r>
     </w:p>
     <w:p>
@@ -197,7 +197,7 @@
           <w:b w:val="0"/>
           <w:sz w:val="22"/>
         </w:rPr>
-        <w:t>2 игровых ПК с включёнными мини-играми Genshin</w:t>
+        <w:t>2 ПК площадки с включёнными мини-играми Genshin (своя техника, без аренды)</w:t>
       </w:r>
     </w:p>
     <w:p>
@@ -223,7 +223,7 @@
           <w:b w:val="0"/>
           <w:sz w:val="22"/>
         </w:rPr>
-        <w:t>1 косплеерша в зоне Genshin для фото и атмосферы</w:t>
+        <w:t>1 косплеерша в зоне Genshin — фото весь день</w:t>
       </w:r>
     </w:p>
     <w:p>
@@ -236,7 +236,7 @@
           <w:b w:val="0"/>
           <w:sz w:val="22"/>
         </w:rPr>
-        <w:t>Формат: турнир для зарегистрированных команд и открытые активности для гостей фестиваля. Анонсы в официальных сообществах Mobile Legends бесплатно. Мини-игры и запуск фонариков в Genshin во время сезонного ивента обычно бесплатны; в смету заложена небольшая сумма на внутриигровые покупки (Welkin / кристаллы / косметика события), чтобы демо выглядело аккуратно и «премиально».</w:t>
+        <w:t>Формат: турнир для заранее зарегистрированных команд и открытые активности для гостей фестиваля. Анонсы в официальных сообществах Mobile Legends бесплатно. Мини-игры и запуск фонариков в Genshin во время сезонного ивента обычно бесплатны; в смету заложена небольшая сумма на внутриигровые покупки (Welkin / кристаллы / косметика события).</w:t>
       </w:r>
     </w:p>
     <w:p>
@@ -247,10 +247,23 @@
         <w:rPr>
           <w:rFonts w:ascii="Arial" w:hAnsi="Arial" w:eastAsia="Arial"/>
           <w:b/>
-          <w:color w:val="8C141E"/>
+          <w:color w:val="C41E3A"/>
           <w:sz w:val="32"/>
         </w:rPr>
         <w:t>2. Расписание дня (6 февраля 2027)</w:t>
+      </w:r>
+    </w:p>
+    <w:p>
+      <w:pPr>
+        <w:spacing w:after="120"/>
+      </w:pPr>
+      <w:r>
+        <w:rPr>
+          <w:rFonts w:ascii="Arial" w:hAnsi="Arial" w:eastAsia="Arial"/>
+          <w:b w:val="0"/>
+          <w:sz w:val="22"/>
+        </w:rPr>
+        <w:t>Команды 5×5 — предрегистрация. Фото с косплеерами — весь день, без отдельного слота.</w:t>
       </w:r>
     </w:p>
     <w:tbl>
@@ -267,7 +280,7 @@
         <w:tc>
           <w:tcPr>
             <w:tcW w:type="dxa" w:w="4986"/>
-            <w:shd w:fill="8C141E" w:val="clear"/>
+            <w:shd w:fill="C41E3A" w:val="clear"/>
           </w:tcPr>
           <w:p>
             <w:r>
@@ -289,7 +302,7 @@
         <w:tc>
           <w:tcPr>
             <w:tcW w:type="dxa" w:w="4986"/>
-            <w:shd w:fill="8C141E" w:val="clear"/>
+            <w:shd w:fill="C41E3A" w:val="clear"/>
           </w:tcPr>
           <w:p>
             <w:r>
@@ -347,7 +360,7 @@
         <w:tc>
           <w:tcPr>
             <w:tcW w:type="dxa" w:w="4986"/>
-            <w:shd w:fill="F7F0E8" w:val="clear"/>
+            <w:shd w:fill="F7E8E8" w:val="clear"/>
           </w:tcPr>
           <w:p>
             <w:r/>
@@ -364,7 +377,7 @@
         <w:tc>
           <w:tcPr>
             <w:tcW w:type="dxa" w:w="4986"/>
-            <w:shd w:fill="F7F0E8" w:val="clear"/>
+            <w:shd w:fill="F7E8E8" w:val="clear"/>
           </w:tcPr>
           <w:p>
             <w:r/>
@@ -374,7 +387,7 @@
                 <w:b w:val="0"/>
                 <w:sz w:val="20"/>
               </w:rPr>
-              <w:t>Открытие зоны для гостей. Фотозона MLBB и уголок Genshin работают</w:t>
+              <w:t>Открытие зоны. Фотозона MLBB, уголок Genshin и фото с косплеерами — весь день</w:t>
             </w:r>
           </w:p>
         </w:tc>
@@ -417,7 +430,7 @@
         <w:tc>
           <w:tcPr>
             <w:tcW w:type="dxa" w:w="4986"/>
-            <w:shd w:fill="F7F0E8" w:val="clear"/>
+            <w:shd w:fill="F7E8E8" w:val="clear"/>
           </w:tcPr>
           <w:p>
             <w:r/>
@@ -434,7 +447,7 @@
         <w:tc>
           <w:tcPr>
             <w:tcW w:type="dxa" w:w="4986"/>
-            <w:shd w:fill="F7F0E8" w:val="clear"/>
+            <w:shd w:fill="F7E8E8" w:val="clear"/>
           </w:tcPr>
           <w:p>
             <w:r/>
@@ -444,7 +457,7 @@
                 <w:b w:val="0"/>
                 <w:sz w:val="20"/>
               </w:rPr>
-              <w:t>Регистрация и сид команд турнира 5×5</w:t>
+              <w:t>Чек-ин команд турнира 5×5 (регистрация заранее) и публикация сетки</w:t>
             </w:r>
           </w:p>
         </w:tc>
@@ -487,7 +500,7 @@
         <w:tc>
           <w:tcPr>
             <w:tcW w:type="dxa" w:w="4986"/>
-            <w:shd w:fill="F7F0E8" w:val="clear"/>
+            <w:shd w:fill="F7E8E8" w:val="clear"/>
           </w:tcPr>
           <w:p>
             <w:r/>
@@ -504,7 +517,7 @@
         <w:tc>
           <w:tcPr>
             <w:tcW w:type="dxa" w:w="4986"/>
-            <w:shd w:fill="F7F0E8" w:val="clear"/>
+            <w:shd w:fill="F7E8E8" w:val="clear"/>
           </w:tcPr>
           <w:p>
             <w:r/>
@@ -557,7 +570,7 @@
         <w:tc>
           <w:tcPr>
             <w:tcW w:type="dxa" w:w="4986"/>
-            <w:shd w:fill="F7F0E8" w:val="clear"/>
+            <w:shd w:fill="F7E8E8" w:val="clear"/>
           </w:tcPr>
           <w:p>
             <w:r/>
@@ -574,7 +587,7 @@
         <w:tc>
           <w:tcPr>
             <w:tcW w:type="dxa" w:w="4986"/>
-            <w:shd w:fill="F7F0E8" w:val="clear"/>
+            <w:shd w:fill="F7E8E8" w:val="clear"/>
           </w:tcPr>
           <w:p>
             <w:r/>
@@ -618,7 +631,7 @@
                 <w:b w:val="0"/>
                 <w:sz w:val="20"/>
               </w:rPr>
-              <w:t>Косплей-слот: фото с косплеерами MLBB и косплеершей Genshin</w:t>
+              <w:t>Открытые активности и мини-игры Genshin параллельно с сеткой</w:t>
             </w:r>
           </w:p>
         </w:tc>
@@ -627,7 +640,7 @@
         <w:tc>
           <w:tcPr>
             <w:tcW w:type="dxa" w:w="4986"/>
-            <w:shd w:fill="F7F0E8" w:val="clear"/>
+            <w:shd w:fill="F7E8E8" w:val="clear"/>
           </w:tcPr>
           <w:p>
             <w:r/>
@@ -644,7 +657,7 @@
         <w:tc>
           <w:tcPr>
             <w:tcW w:type="dxa" w:w="4986"/>
-            <w:shd w:fill="F7F0E8" w:val="clear"/>
+            <w:shd w:fill="F7E8E8" w:val="clear"/>
           </w:tcPr>
           <w:p>
             <w:r/>
@@ -697,7 +710,7 @@
         <w:tc>
           <w:tcPr>
             <w:tcW w:type="dxa" w:w="4986"/>
-            <w:shd w:fill="F7F0E8" w:val="clear"/>
+            <w:shd w:fill="F7E8E8" w:val="clear"/>
           </w:tcPr>
           <w:p>
             <w:r/>
@@ -714,7 +727,7 @@
         <w:tc>
           <w:tcPr>
             <w:tcW w:type="dxa" w:w="4986"/>
-            <w:shd w:fill="F7F0E8" w:val="clear"/>
+            <w:shd w:fill="F7E8E8" w:val="clear"/>
           </w:tcPr>
           <w:p>
             <w:r/>
@@ -767,7 +780,7 @@
         <w:tc>
           <w:tcPr>
             <w:tcW w:type="dxa" w:w="4986"/>
-            <w:shd w:fill="F7F0E8" w:val="clear"/>
+            <w:shd w:fill="F7E8E8" w:val="clear"/>
           </w:tcPr>
           <w:p>
             <w:r/>
@@ -784,7 +797,7 @@
         <w:tc>
           <w:tcPr>
             <w:tcW w:type="dxa" w:w="4986"/>
-            <w:shd w:fill="F7F0E8" w:val="clear"/>
+            <w:shd w:fill="F7E8E8" w:val="clear"/>
           </w:tcPr>
           <w:p>
             <w:r/>
@@ -794,7 +807,7 @@
                 <w:b w:val="0"/>
                 <w:sz w:val="20"/>
               </w:rPr>
-              <w:t>Закрытие активностей, финальные фото</w:t>
+              <w:t>Закрытие активностей</w:t>
             </w:r>
           </w:p>
         </w:tc>
@@ -843,7 +856,7 @@
         <w:rPr>
           <w:rFonts w:ascii="Arial" w:hAnsi="Arial" w:eastAsia="Arial"/>
           <w:b/>
-          <w:color w:val="8C141E"/>
+          <w:color w:val="C41E3A"/>
           <w:sz w:val="32"/>
         </w:rPr>
         <w:t>3. Смета</w:t>
@@ -859,7 +872,7 @@
           <w:b w:val="0"/>
           <w:sz w:val="22"/>
         </w:rPr>
-        <w:t>Итоговый бюджет зоны: 900 000 ₽ (включая возвращаемый залог за телефоны 40 000 ₽).</w:t>
+        <w:t>Итоговый бюджет зоны: 900 000 ₽ (включая возвращаемый залог за телефоны 40 000 ₽). ПК, столы и PlayStation — оборудование площадки, в смету не входят.</w:t>
       </w:r>
     </w:p>
     <w:tbl>
@@ -877,7 +890,7 @@
         <w:tc>
           <w:tcPr>
             <w:tcW w:type="dxa" w:w="3324"/>
-            <w:shd w:fill="8C141E" w:val="clear"/>
+            <w:shd w:fill="C41E3A" w:val="clear"/>
           </w:tcPr>
           <w:p>
             <w:r>
@@ -899,7 +912,7 @@
         <w:tc>
           <w:tcPr>
             <w:tcW w:type="dxa" w:w="3324"/>
-            <w:shd w:fill="8C141E" w:val="clear"/>
+            <w:shd w:fill="C41E3A" w:val="clear"/>
           </w:tcPr>
           <w:p>
             <w:r>
@@ -921,7 +934,7 @@
         <w:tc>
           <w:tcPr>
             <w:tcW w:type="dxa" w:w="3324"/>
-            <w:shd w:fill="8C141E" w:val="clear"/>
+            <w:shd w:fill="C41E3A" w:val="clear"/>
           </w:tcPr>
           <w:p>
             <w:r>
@@ -970,7 +983,7 @@
                 <w:b w:val="0"/>
                 <w:sz w:val="18"/>
               </w:rPr>
-              <w:t>длинный день, не полные 12 ч подряд</w:t>
+              <w:t>фото с гостями весь день</w:t>
             </w:r>
           </w:p>
         </w:tc>
@@ -995,7 +1008,7 @@
         <w:tc>
           <w:tcPr>
             <w:tcW w:type="dxa" w:w="3324"/>
-            <w:shd w:fill="F7F0E8" w:val="clear"/>
+            <w:shd w:fill="F7E8E8" w:val="clear"/>
           </w:tcPr>
           <w:p>
             <w:r/>
@@ -1012,7 +1025,7 @@
         <w:tc>
           <w:tcPr>
             <w:tcW w:type="dxa" w:w="3324"/>
-            <w:shd w:fill="F7F0E8" w:val="clear"/>
+            <w:shd w:fill="F7E8E8" w:val="clear"/>
           </w:tcPr>
           <w:p>
             <w:r/>
@@ -1022,14 +1035,14 @@
                 <w:b w:val="0"/>
                 <w:sz w:val="18"/>
               </w:rPr>
-              <w:t>зона Genshin Impact, фото и атмосфера</w:t>
+              <w:t>зона Genshin Impact, фото весь день</w:t>
             </w:r>
           </w:p>
         </w:tc>
         <w:tc>
           <w:tcPr>
             <w:tcW w:type="dxa" w:w="3324"/>
-            <w:shd w:fill="F7F0E8" w:val="clear"/>
+            <w:shd w:fill="F7E8E8" w:val="clear"/>
           </w:tcPr>
           <w:p>
             <w:r/>
@@ -1098,7 +1111,7 @@
         <w:tc>
           <w:tcPr>
             <w:tcW w:type="dxa" w:w="3324"/>
-            <w:shd w:fill="F7F0E8" w:val="clear"/>
+            <w:shd w:fill="F7E8E8" w:val="clear"/>
           </w:tcPr>
           <w:p>
             <w:r/>
@@ -1115,7 +1128,7 @@
         <w:tc>
           <w:tcPr>
             <w:tcW w:type="dxa" w:w="3324"/>
-            <w:shd w:fill="F7F0E8" w:val="clear"/>
+            <w:shd w:fill="F7E8E8" w:val="clear"/>
           </w:tcPr>
           <w:p>
             <w:r/>
@@ -1125,14 +1138,14 @@
                 <w:b w:val="0"/>
                 <w:sz w:val="18"/>
               </w:rPr>
-              <w:t>красивое оформление в стиле Lantern Rite / CNY: панели, ткань, фонари, фотофон</w:t>
+              <w:t>Lantern Rite / CNY: панели, ткань, фонари, фотофон</w:t>
             </w:r>
           </w:p>
         </w:tc>
         <w:tc>
           <w:tcPr>
             <w:tcW w:type="dxa" w:w="3324"/>
-            <w:shd w:fill="F7F0E8" w:val="clear"/>
+            <w:shd w:fill="F7E8E8" w:val="clear"/>
           </w:tcPr>
           <w:p>
             <w:r/>
@@ -1142,7 +1155,7 @@
                 <w:b w:val="0"/>
                 <w:sz w:val="20"/>
               </w:rPr>
-              <w:t>160 000</w:t>
+              <w:t>190 000</w:t>
             </w:r>
           </w:p>
         </w:tc>
@@ -1192,7 +1205,7 @@
                 <w:b w:val="0"/>
                 <w:sz w:val="20"/>
               </w:rPr>
-              <w:t>40 000</w:t>
+              <w:t>50 000</w:t>
             </w:r>
           </w:p>
         </w:tc>
@@ -1201,59 +1214,7 @@
         <w:tc>
           <w:tcPr>
             <w:tcW w:type="dxa" w:w="3324"/>
-            <w:shd w:fill="F7F0E8" w:val="clear"/>
-          </w:tcPr>
-          <w:p>
-            <w:r/>
-            <w:r>
-              <w:rPr>
-                <w:rFonts w:ascii="Arial" w:hAnsi="Arial" w:eastAsia="Arial"/>
-                <w:b w:val="0"/>
-                <w:sz w:val="20"/>
-              </w:rPr>
-              <w:t>Мебель и стойки уголка Genshin</w:t>
-            </w:r>
-          </w:p>
-        </w:tc>
-        <w:tc>
-          <w:tcPr>
-            <w:tcW w:type="dxa" w:w="3324"/>
-            <w:shd w:fill="F7F0E8" w:val="clear"/>
-          </w:tcPr>
-          <w:p>
-            <w:r/>
-            <w:r>
-              <w:rPr>
-                <w:rFonts w:ascii="Arial" w:hAnsi="Arial" w:eastAsia="Arial"/>
-                <w:b w:val="0"/>
-                <w:sz w:val="18"/>
-              </w:rPr>
-              <w:t>столы под ПК, подставка ТВ, мягкая зона</w:t>
-            </w:r>
-          </w:p>
-        </w:tc>
-        <w:tc>
-          <w:tcPr>
-            <w:tcW w:type="dxa" w:w="3324"/>
-            <w:shd w:fill="F7F0E8" w:val="clear"/>
-          </w:tcPr>
-          <w:p>
-            <w:r/>
-            <w:r>
-              <w:rPr>
-                <w:rFonts w:ascii="Arial" w:hAnsi="Arial" w:eastAsia="Arial"/>
-                <w:b w:val="0"/>
-                <w:sz w:val="20"/>
-              </w:rPr>
-              <w:t>25 000</w:t>
-            </w:r>
-          </w:p>
-        </w:tc>
-      </w:tr>
-      <w:tr>
-        <w:tc>
-          <w:tcPr>
-            <w:tcW w:type="dxa" w:w="3324"/>
+            <w:shd w:fill="F7E8E8" w:val="clear"/>
           </w:tcPr>
           <w:p>
             <w:r/>
@@ -1270,6 +1231,7 @@
         <w:tc>
           <w:tcPr>
             <w:tcW w:type="dxa" w:w="3324"/>
+            <w:shd w:fill="F7E8E8" w:val="clear"/>
           </w:tcPr>
           <w:p>
             <w:r/>
@@ -1286,6 +1248,7 @@
         <w:tc>
           <w:tcPr>
             <w:tcW w:type="dxa" w:w="3324"/>
+            <w:shd w:fill="F7E8E8" w:val="clear"/>
           </w:tcPr>
           <w:p>
             <w:r/>
@@ -1304,7 +1267,6 @@
         <w:tc>
           <w:tcPr>
             <w:tcW w:type="dxa" w:w="3324"/>
-            <w:shd w:fill="F7F0E8" w:val="clear"/>
           </w:tcPr>
           <w:p>
             <w:r/>
@@ -1321,7 +1283,6 @@
         <w:tc>
           <w:tcPr>
             <w:tcW w:type="dxa" w:w="3324"/>
-            <w:shd w:fill="F7F0E8" w:val="clear"/>
           </w:tcPr>
           <w:p>
             <w:r/>
@@ -1338,7 +1299,6 @@
         <w:tc>
           <w:tcPr>
             <w:tcW w:type="dxa" w:w="3324"/>
-            <w:shd w:fill="F7F0E8" w:val="clear"/>
           </w:tcPr>
           <w:p>
             <w:r/>
@@ -1357,6 +1317,7 @@
         <w:tc>
           <w:tcPr>
             <w:tcW w:type="dxa" w:w="3324"/>
+            <w:shd w:fill="F7E8E8" w:val="clear"/>
           </w:tcPr>
           <w:p>
             <w:r/>
@@ -1373,6 +1334,7 @@
         <w:tc>
           <w:tcPr>
             <w:tcW w:type="dxa" w:w="3324"/>
+            <w:shd w:fill="F7E8E8" w:val="clear"/>
           </w:tcPr>
           <w:p>
             <w:r/>
@@ -1389,6 +1351,7 @@
         <w:tc>
           <w:tcPr>
             <w:tcW w:type="dxa" w:w="3324"/>
+            <w:shd w:fill="F7E8E8" w:val="clear"/>
           </w:tcPr>
           <w:p>
             <w:r/>
@@ -1407,7 +1370,6 @@
         <w:tc>
           <w:tcPr>
             <w:tcW w:type="dxa" w:w="3324"/>
-            <w:shd w:fill="F7F0E8" w:val="clear"/>
           </w:tcPr>
           <w:p>
             <w:r/>
@@ -1418,57 +1380,6 @@
                 <w:sz w:val="20"/>
               </w:rPr>
               <w:t>Денежный приз турнира 5×5</w:t>
-            </w:r>
-          </w:p>
-        </w:tc>
-        <w:tc>
-          <w:tcPr>
-            <w:tcW w:type="dxa" w:w="3324"/>
-            <w:shd w:fill="F7F0E8" w:val="clear"/>
-          </w:tcPr>
-          <w:p>
-            <w:r/>
-            <w:r>
-              <w:rPr>
-                <w:rFonts w:ascii="Arial" w:hAnsi="Arial" w:eastAsia="Arial"/>
-                <w:b w:val="0"/>
-                <w:sz w:val="18"/>
-              </w:rPr>
-            </w:r>
-          </w:p>
-        </w:tc>
-        <w:tc>
-          <w:tcPr>
-            <w:tcW w:type="dxa" w:w="3324"/>
-            <w:shd w:fill="F7F0E8" w:val="clear"/>
-          </w:tcPr>
-          <w:p>
-            <w:r/>
-            <w:r>
-              <w:rPr>
-                <w:rFonts w:ascii="Arial" w:hAnsi="Arial" w:eastAsia="Arial"/>
-                <w:b w:val="0"/>
-                <w:sz w:val="20"/>
-              </w:rPr>
-              <w:t>40 000</w:t>
-            </w:r>
-          </w:p>
-        </w:tc>
-      </w:tr>
-      <w:tr>
-        <w:tc>
-          <w:tcPr>
-            <w:tcW w:type="dxa" w:w="3324"/>
-          </w:tcPr>
-          <w:p>
-            <w:r/>
-            <w:r>
-              <w:rPr>
-                <w:rFonts w:ascii="Arial" w:hAnsi="Arial" w:eastAsia="Arial"/>
-                <w:b w:val="0"/>
-                <w:sz w:val="20"/>
-              </w:rPr>
-              <w:t>Бинго и расходники</w:t>
             </w:r>
           </w:p>
         </w:tc>
@@ -1499,7 +1410,7 @@
                 <w:b w:val="0"/>
                 <w:sz w:val="20"/>
               </w:rPr>
-              <w:t>15 000</w:t>
+              <w:t>40 000</w:t>
             </w:r>
           </w:p>
         </w:tc>
@@ -1508,7 +1419,7 @@
         <w:tc>
           <w:tcPr>
             <w:tcW w:type="dxa" w:w="3324"/>
-            <w:shd w:fill="F7F0E8" w:val="clear"/>
+            <w:shd w:fill="F7E8E8" w:val="clear"/>
           </w:tcPr>
           <w:p>
             <w:r/>
@@ -1518,14 +1429,14 @@
                 <w:b w:val="0"/>
                 <w:sz w:val="20"/>
               </w:rPr>
-              <w:t>Аренда игровых ПК ×2</w:t>
+              <w:t>Бинго и расходники</w:t>
             </w:r>
           </w:p>
         </w:tc>
         <w:tc>
           <w:tcPr>
             <w:tcW w:type="dxa" w:w="3324"/>
-            <w:shd w:fill="F7F0E8" w:val="clear"/>
+            <w:shd w:fill="F7E8E8" w:val="clear"/>
           </w:tcPr>
           <w:p>
             <w:r/>
@@ -1535,14 +1446,13 @@
                 <w:b w:val="0"/>
                 <w:sz w:val="18"/>
               </w:rPr>
-              <w:t>мини-игры Genshin на зоне</w:t>
             </w:r>
           </w:p>
         </w:tc>
         <w:tc>
           <w:tcPr>
             <w:tcW w:type="dxa" w:w="3324"/>
-            <w:shd w:fill="F7F0E8" w:val="clear"/>
+            <w:shd w:fill="F7E8E8" w:val="clear"/>
           </w:tcPr>
           <w:p>
             <w:r/>
@@ -1552,7 +1462,7 @@
                 <w:b w:val="0"/>
                 <w:sz w:val="20"/>
               </w:rPr>
-              <w:t>30 000</w:t>
+              <w:t>15 000</w:t>
             </w:r>
           </w:p>
         </w:tc>
@@ -1586,7 +1496,7 @@
                 <w:b w:val="0"/>
                 <w:sz w:val="18"/>
               </w:rPr>
-              <w:t>запуск фонариков / showcase ивента</w:t>
+              <w:t>запуск фонариков / showcase; ПК и столы — оборудование площадки</w:t>
             </w:r>
           </w:p>
         </w:tc>
@@ -1611,7 +1521,7 @@
         <w:tc>
           <w:tcPr>
             <w:tcW w:type="dxa" w:w="3324"/>
-            <w:shd w:fill="F7F0E8" w:val="clear"/>
+            <w:shd w:fill="F7E8E8" w:val="clear"/>
           </w:tcPr>
           <w:p>
             <w:r/>
@@ -1628,7 +1538,7 @@
         <w:tc>
           <w:tcPr>
             <w:tcW w:type="dxa" w:w="3324"/>
-            <w:shd w:fill="F7F0E8" w:val="clear"/>
+            <w:shd w:fill="F7E8E8" w:val="clear"/>
           </w:tcPr>
           <w:p>
             <w:r/>
@@ -1638,14 +1548,14 @@
                 <w:b w:val="0"/>
                 <w:sz w:val="18"/>
               </w:rPr>
-              <w:t>Welkin / кристаллы / косметика события; сами мини-игры и фонарики в ивенте обычно бесплатны</w:t>
+              <w:t>Welkin / кристаллы / косметика события; мини-игры и фонарики обычно бесплатны</w:t>
             </w:r>
           </w:p>
         </w:tc>
         <w:tc>
           <w:tcPr>
             <w:tcW w:type="dxa" w:w="3324"/>
-            <w:shd w:fill="F7F0E8" w:val="clear"/>
+            <w:shd w:fill="F7E8E8" w:val="clear"/>
           </w:tcPr>
           <w:p>
             <w:r/>
@@ -1713,7 +1623,7 @@
         <w:tc>
           <w:tcPr>
             <w:tcW w:type="dxa" w:w="3324"/>
-            <w:shd w:fill="F7F0E8" w:val="clear"/>
+            <w:shd w:fill="F7E8E8" w:val="clear"/>
           </w:tcPr>
           <w:p>
             <w:r/>
@@ -1730,7 +1640,7 @@
         <w:tc>
           <w:tcPr>
             <w:tcW w:type="dxa" w:w="3324"/>
-            <w:shd w:fill="F7F0E8" w:val="clear"/>
+            <w:shd w:fill="F7E8E8" w:val="clear"/>
           </w:tcPr>
           <w:p>
             <w:r/>
@@ -1747,7 +1657,7 @@
         <w:tc>
           <w:tcPr>
             <w:tcW w:type="dxa" w:w="3324"/>
-            <w:shd w:fill="F7F0E8" w:val="clear"/>
+            <w:shd w:fill="F7E8E8" w:val="clear"/>
           </w:tcPr>
           <w:p>
             <w:r/>
@@ -1816,7 +1726,7 @@
         <w:tc>
           <w:tcPr>
             <w:tcW w:type="dxa" w:w="3324"/>
-            <w:shd w:fill="F7F0E8" w:val="clear"/>
+            <w:shd w:fill="F7E8E8" w:val="clear"/>
           </w:tcPr>
           <w:p>
             <w:r/>
@@ -1833,7 +1743,7 @@
         <w:tc>
           <w:tcPr>
             <w:tcW w:type="dxa" w:w="3324"/>
-            <w:shd w:fill="F7F0E8" w:val="clear"/>
+            <w:shd w:fill="F7E8E8" w:val="clear"/>
           </w:tcPr>
           <w:p>
             <w:r/>
@@ -1850,7 +1760,7 @@
         <w:tc>
           <w:tcPr>
             <w:tcW w:type="dxa" w:w="3324"/>
-            <w:shd w:fill="F7F0E8" w:val="clear"/>
+            <w:shd w:fill="F7E8E8" w:val="clear"/>
           </w:tcPr>
           <w:p>
             <w:r/>
@@ -1919,7 +1829,7 @@
         <w:tc>
           <w:tcPr>
             <w:tcW w:type="dxa" w:w="3324"/>
-            <w:shd w:fill="F7F0E8" w:val="clear"/>
+            <w:shd w:fill="F7E8E8" w:val="clear"/>
           </w:tcPr>
           <w:p>
             <w:r/>
@@ -1936,7 +1846,7 @@
         <w:tc>
           <w:tcPr>
             <w:tcW w:type="dxa" w:w="3324"/>
-            <w:shd w:fill="F7F0E8" w:val="clear"/>
+            <w:shd w:fill="F7E8E8" w:val="clear"/>
           </w:tcPr>
           <w:p>
             <w:r/>
@@ -1953,7 +1863,7 @@
         <w:tc>
           <w:tcPr>
             <w:tcW w:type="dxa" w:w="3324"/>
-            <w:shd w:fill="F7F0E8" w:val="clear"/>
+            <w:shd w:fill="F7E8E8" w:val="clear"/>
           </w:tcPr>
           <w:p>
             <w:r/>
@@ -2022,7 +1932,7 @@
         <w:tc>
           <w:tcPr>
             <w:tcW w:type="dxa" w:w="3324"/>
-            <w:shd w:fill="F7F0E8" w:val="clear"/>
+            <w:shd w:fill="F7E8E8" w:val="clear"/>
           </w:tcPr>
           <w:p>
             <w:r/>
@@ -2039,7 +1949,7 @@
         <w:tc>
           <w:tcPr>
             <w:tcW w:type="dxa" w:w="3324"/>
-            <w:shd w:fill="F7F0E8" w:val="clear"/>
+            <w:shd w:fill="F7E8E8" w:val="clear"/>
           </w:tcPr>
           <w:p>
             <w:r/>
@@ -2055,7 +1965,7 @@
         <w:tc>
           <w:tcPr>
             <w:tcW w:type="dxa" w:w="3324"/>
-            <w:shd w:fill="F7F0E8" w:val="clear"/>
+            <w:shd w:fill="F7E8E8" w:val="clear"/>
           </w:tcPr>
           <w:p>
             <w:r/>
@@ -2114,7 +2024,7 @@
                 <w:b w:val="0"/>
                 <w:sz w:val="20"/>
               </w:rPr>
-              <w:t>35 550</w:t>
+              <w:t>50 550</w:t>
             </w:r>
           </w:p>
         </w:tc>
@@ -2123,7 +2033,7 @@
         <w:tc>
           <w:tcPr>
             <w:tcW w:type="dxa" w:w="3324"/>
-            <w:shd w:fill="E8D5C4" w:val="clear"/>
+            <w:shd w:fill="F0C14B" w:val="clear"/>
           </w:tcPr>
           <w:p>
             <w:r/>
@@ -2140,7 +2050,7 @@
         <w:tc>
           <w:tcPr>
             <w:tcW w:type="dxa" w:w="3324"/>
-            <w:shd w:fill="E8D5C4" w:val="clear"/>
+            <w:shd w:fill="F0C14B" w:val="clear"/>
           </w:tcPr>
           <w:p>
             <w:r/>
@@ -2156,7 +2066,7 @@
         <w:tc>
           <w:tcPr>
             <w:tcW w:type="dxa" w:w="3324"/>
-            <w:shd w:fill="E8D5C4" w:val="clear"/>
+            <w:shd w:fill="F0C14B" w:val="clear"/>
           </w:tcPr>
           <w:p>
             <w:r/>
@@ -2183,7 +2093,7 @@
           <w:b w:val="0"/>
           <w:sz w:val="22"/>
         </w:rPr>
-        <w:t>Комментарий по Genshin: сезонный CNY-ивент обычно даёт бесплатные мини-игры и механики запуска фонариков. Покупка внутри игры нужна скорее для косметики/комфорта демо, а не как обязательное условие запуска зоны. Основная статья — физический декор уголка и косплеерша.</w:t>
+        <w:t>Комментарий по Genshin: сезонный CNY-ивент обычно даёт бесплатные мини-игры и механики запуска фонариков. Покупка внутри игры нужна скорее для косметики/комфорта демо. Основная статья — физический декор уголка и косплеерша. ПК и столы не арендуем.</w:t>
       </w:r>
     </w:p>
     <w:p>
@@ -2194,7 +2104,7 @@
         <w:rPr>
           <w:rFonts w:ascii="Arial" w:hAnsi="Arial" w:eastAsia="Arial"/>
           <w:b/>
-          <w:color w:val="8C141E"/>
+          <w:color w:val="C41E3A"/>
           <w:sz w:val="32"/>
         </w:rPr>
         <w:t>4. Ожидаемые метрики (цель)</w:t>
@@ -2214,7 +2124,7 @@
         <w:tc>
           <w:tcPr>
             <w:tcW w:type="dxa" w:w="4986"/>
-            <w:shd w:fill="8C141E" w:val="clear"/>
+            <w:shd w:fill="C41E3A" w:val="clear"/>
           </w:tcPr>
           <w:p>
             <w:r>
@@ -2236,7 +2146,7 @@
         <w:tc>
           <w:tcPr>
             <w:tcW w:type="dxa" w:w="4986"/>
-            <w:shd w:fill="8C141E" w:val="clear"/>
+            <w:shd w:fill="C41E3A" w:val="clear"/>
           </w:tcPr>
           <w:p>
             <w:r>
@@ -2294,7 +2204,7 @@
         <w:tc>
           <w:tcPr>
             <w:tcW w:type="dxa" w:w="4986"/>
-            <w:shd w:fill="F7F0E8" w:val="clear"/>
+            <w:shd w:fill="F7E8E8" w:val="clear"/>
           </w:tcPr>
           <w:p>
             <w:r/>
@@ -2311,7 +2221,7 @@
         <w:tc>
           <w:tcPr>
             <w:tcW w:type="dxa" w:w="4986"/>
-            <w:shd w:fill="F7F0E8" w:val="clear"/>
+            <w:shd w:fill="F7E8E8" w:val="clear"/>
           </w:tcPr>
           <w:p>
             <w:r/>
@@ -2339,7 +2249,7 @@
                 <w:b w:val="0"/>
                 <w:sz w:val="20"/>
               </w:rPr>
-              <w:t>Команды в турнире 5×5</w:t>
+              <w:t>Команды в турнире 5×5 (предрегистрация)</w:t>
             </w:r>
           </w:p>
         </w:tc>
@@ -2364,7 +2274,7 @@
         <w:tc>
           <w:tcPr>
             <w:tcW w:type="dxa" w:w="4986"/>
-            <w:shd w:fill="F7F0E8" w:val="clear"/>
+            <w:shd w:fill="F7E8E8" w:val="clear"/>
           </w:tcPr>
           <w:p>
             <w:r/>
@@ -2381,7 +2291,7 @@
         <w:tc>
           <w:tcPr>
             <w:tcW w:type="dxa" w:w="4986"/>
-            <w:shd w:fill="F7F0E8" w:val="clear"/>
+            <w:shd w:fill="F7E8E8" w:val="clear"/>
           </w:tcPr>
           <w:p>
             <w:r/>
@@ -2434,7 +2344,7 @@
         <w:tc>
           <w:tcPr>
             <w:tcW w:type="dxa" w:w="4986"/>
-            <w:shd w:fill="F7F0E8" w:val="clear"/>
+            <w:shd w:fill="F7E8E8" w:val="clear"/>
           </w:tcPr>
           <w:p>
             <w:r/>
@@ -2451,7 +2361,7 @@
         <w:tc>
           <w:tcPr>
             <w:tcW w:type="dxa" w:w="4986"/>
-            <w:shd w:fill="F7F0E8" w:val="clear"/>
+            <w:shd w:fill="F7E8E8" w:val="clear"/>
           </w:tcPr>
           <w:p>
             <w:r/>
@@ -2504,7 +2414,7 @@
         <w:tc>
           <w:tcPr>
             <w:tcW w:type="dxa" w:w="4986"/>
-            <w:shd w:fill="F7F0E8" w:val="clear"/>
+            <w:shd w:fill="F7E8E8" w:val="clear"/>
           </w:tcPr>
           <w:p>
             <w:r/>
@@ -2521,7 +2431,7 @@
         <w:tc>
           <w:tcPr>
             <w:tcW w:type="dxa" w:w="4986"/>
-            <w:shd w:fill="F7F0E8" w:val="clear"/>
+            <w:shd w:fill="F7E8E8" w:val="clear"/>
           </w:tcPr>
           <w:p>
             <w:r/>
@@ -2574,7 +2484,7 @@
         <w:tc>
           <w:tcPr>
             <w:tcW w:type="dxa" w:w="4986"/>
-            <w:shd w:fill="F7F0E8" w:val="clear"/>
+            <w:shd w:fill="F7E8E8" w:val="clear"/>
           </w:tcPr>
           <w:p>
             <w:r/>
@@ -2591,7 +2501,7 @@
         <w:tc>
           <w:tcPr>
             <w:tcW w:type="dxa" w:w="4986"/>
-            <w:shd w:fill="F7F0E8" w:val="clear"/>
+            <w:shd w:fill="F7E8E8" w:val="clear"/>
           </w:tcPr>
           <w:p>
             <w:r/>

</xml_diff>

<commit_message>
Clean brief copy and redistribute removed budget lines
Drop ads, stream, sound, and TV rental; move their amounts into decor
and ops. Strip AI-like captions and anglicisms; keep activities open
all day and regenerate the Word brief.

Co-authored-by: harakirijkee <harakirijkee@gmail.com>
</commit_message>
<xml_diff>
--- a/MLBB_CyberSaturday_CNY_Brief_Budget.docx
+++ b/MLBB_CyberSaturday_CNY_Brief_Budget.docx
@@ -54,7 +54,7 @@
           <w:b w:val="0"/>
           <w:sz w:val="22"/>
         </w:rPr>
-        <w:t>Тематическая зона Mobile Legends и уголок Genshin Impact внутри фестиваля «Киберсуббота» в Сколково. Мероприятие приурочено к Китайскому Новому году (6 февраля 2027). Команды на турнир 5×5 регистрируются заранее. ПК, столы и PlayStation — оборудование площадки (аренда не нужна). В эти же даты у Genshin Impact проходит внутриигровой CNY-ивент — используем как визуальный якорь зоны.</w:t>
+        <w:t>Зона Mobile Legends и уголок Genshin Impact внутри фестиваля «Киберсуббота» в Сколково. Мероприятие приурочено к Китайскому Новому году (6 февраля 2027). Команды на турнир 5×5 регистрируются заранее. Компьютеры, столы, телевизоры, звук и приставка — оборудование площадки. Активности доступны всё время работы зоны.</w:t>
       </w:r>
     </w:p>
     <w:p>
@@ -80,7 +80,7 @@
           <w:b w:val="0"/>
           <w:sz w:val="22"/>
         </w:rPr>
-        <w:t>турнир 5×5 (команды регистрируются заранее) с призовым фондом 40 000 ₽ и алмазами</w:t>
+        <w:t>турнир 5×5: команды регистрируются заранее, приз 40 000 ₽ и алмазы</w:t>
       </w:r>
     </w:p>
     <w:p>
@@ -119,7 +119,7 @@
           <w:b w:val="0"/>
           <w:sz w:val="22"/>
         </w:rPr>
-        <w:t>2 косплеера и фотозона 3×2 м — фото с косплеерами доступны весь день</w:t>
+        <w:t>2 косплеера и фотозона 3×2 м — фото весь день</w:t>
       </w:r>
     </w:p>
     <w:p>
@@ -132,7 +132,7 @@
           <w:b w:val="0"/>
           <w:sz w:val="22"/>
         </w:rPr>
-        <w:t>зона отдыха с PlayStation 5 (оборудование площадки)</w:t>
+        <w:t>зона отдыха с приставкой (оборудование площадки)</w:t>
       </w:r>
     </w:p>
     <w:p>
@@ -145,7 +145,7 @@
           <w:b w:val="0"/>
           <w:sz w:val="22"/>
         </w:rPr>
-        <w:t>медийный гость (появление на зоне, фото/стрим)</w:t>
+        <w:t>медийный гость</w:t>
       </w:r>
     </w:p>
     <w:p>
@@ -184,7 +184,7 @@
           <w:b w:val="0"/>
           <w:sz w:val="22"/>
         </w:rPr>
-        <w:t>красивый декор в стилистике ивента (Lantern Rite / Китайский Новый год)</w:t>
+        <w:t>декор в стиле китайского Нового года и игрового праздника фонарей</w:t>
       </w:r>
     </w:p>
     <w:p>
@@ -197,7 +197,7 @@
           <w:b w:val="0"/>
           <w:sz w:val="22"/>
         </w:rPr>
-        <w:t>2 ПК площадки с включёнными мини-играми Genshin (своя техника, без аренды)</w:t>
+        <w:t>2 компьютера площадки с мини-играми Genshin Impact</w:t>
       </w:r>
     </w:p>
     <w:p>
@@ -210,7 +210,7 @@
           <w:b w:val="0"/>
           <w:sz w:val="22"/>
         </w:rPr>
-        <w:t>ТВ: запуск китайских фонариков из внутриигрового ивента</w:t>
+        <w:t>телевизор площадки: запуск фонариков из игрового события</w:t>
       </w:r>
     </w:p>
     <w:p>
@@ -223,20 +223,7 @@
           <w:b w:val="0"/>
           <w:sz w:val="22"/>
         </w:rPr>
-        <w:t>1 косплеерша в зоне Genshin — фото весь день</w:t>
-      </w:r>
-    </w:p>
-    <w:p>
-      <w:pPr>
-        <w:spacing w:after="120"/>
-      </w:pPr>
-      <w:r>
-        <w:rPr>
-          <w:rFonts w:ascii="Arial" w:hAnsi="Arial" w:eastAsia="Arial"/>
-          <w:b w:val="0"/>
-          <w:sz w:val="22"/>
-        </w:rPr>
-        <w:t>Формат: турнир для заранее зарегистрированных команд и открытые активности для гостей фестиваля. Анонсы в официальных сообществах Mobile Legends бесплатно. Мини-игры и запуск фонариков в Genshin во время сезонного ивента обычно бесплатны; в смету заложена небольшая сумма на внутриигровые покупки (Welkin / кристаллы / косметика события).</w:t>
+        <w:t>1 косплеерша — фото весь день</w:t>
       </w:r>
     </w:p>
     <w:p>
@@ -263,7 +250,7 @@
           <w:b w:val="0"/>
           <w:sz w:val="22"/>
         </w:rPr>
-        <w:t>Команды 5×5 — предрегистрация. Фото с косплеерами — весь день, без отдельного слота.</w:t>
+        <w:t>Свободная игра, мини-игры, фотозона, косплей и фонарики доступны всё время работы зоны.</w:t>
       </w:r>
     </w:p>
     <w:tbl>
@@ -351,7 +338,7 @@
                 <w:b w:val="0"/>
                 <w:sz w:val="20"/>
               </w:rPr>
-              <w:t>Монтаж финал, прогрев ПК/ТВ, чек стрима, брифинг команды</w:t>
+              <w:t>Подготовка зоны, проверка техники, брифинг</w:t>
             </w:r>
           </w:p>
         </w:tc>
@@ -387,7 +374,7 @@
                 <w:b w:val="0"/>
                 <w:sz w:val="20"/>
               </w:rPr>
-              <w:t>Открытие зоны. Фотозона MLBB, уголок Genshin и фото с косплеерами — весь день</w:t>
+              <w:t>Открытие зоны</w:t>
             </w:r>
           </w:p>
         </w:tc>
@@ -405,7 +392,7 @@
                 <w:b/>
                 <w:sz w:val="20"/>
               </w:rPr>
-              <w:t>11:30</w:t>
+              <w:t>12:30</w:t>
             </w:r>
           </w:p>
         </w:tc>
@@ -421,7 +408,7 @@
                 <w:b w:val="0"/>
                 <w:sz w:val="20"/>
               </w:rPr>
-              <w:t>Старт открытых активностей: «царь горы», викторина, мини-игры Genshin, фонарики на ТВ</w:t>
+              <w:t>Сверка команд турнира 5×5 и публикация сетки</w:t>
             </w:r>
           </w:p>
         </w:tc>
@@ -440,7 +427,7 @@
                 <w:b/>
                 <w:sz w:val="20"/>
               </w:rPr>
-              <w:t>12:30</w:t>
+              <w:t>13:00</w:t>
             </w:r>
           </w:p>
         </w:tc>
@@ -457,7 +444,7 @@
                 <w:b w:val="0"/>
                 <w:sz w:val="20"/>
               </w:rPr>
-              <w:t>Чек-ин команд турнира 5×5 (регистрация заранее) и публикация сетки</w:t>
+              <w:t>Старт турнира 5×5</w:t>
             </w:r>
           </w:p>
         </w:tc>
@@ -475,7 +462,7 @@
                 <w:b/>
                 <w:sz w:val="20"/>
               </w:rPr>
-              <w:t>13:00</w:t>
+              <w:t>14:30</w:t>
             </w:r>
           </w:p>
         </w:tc>
@@ -491,7 +478,7 @@
                 <w:b w:val="0"/>
                 <w:sz w:val="20"/>
               </w:rPr>
-              <w:t>Старт турнира MLBB 5×5 (групповой этап)</w:t>
+              <w:t>Бинго и викторина</w:t>
             </w:r>
           </w:p>
         </w:tc>
@@ -510,7 +497,7 @@
                 <w:b/>
                 <w:sz w:val="20"/>
               </w:rPr>
-              <w:t>14:30</w:t>
+              <w:t>15:30</w:t>
             </w:r>
           </w:p>
         </w:tc>
@@ -527,7 +514,7 @@
                 <w:b w:val="0"/>
                 <w:sz w:val="20"/>
               </w:rPr>
-              <w:t>Бинго и викторина с розыгрышем алмазов</w:t>
+              <w:t>Медийный гость на зоне</w:t>
             </w:r>
           </w:p>
         </w:tc>
@@ -545,7 +532,7 @@
                 <w:b/>
                 <w:sz w:val="20"/>
               </w:rPr>
-              <w:t>15:30</w:t>
+              <w:t>16:30</w:t>
             </w:r>
           </w:p>
         </w:tc>
@@ -561,77 +548,7 @@
                 <w:b w:val="0"/>
                 <w:sz w:val="20"/>
               </w:rPr>
-              <w:t>Медийный гость на зоне: фото, общение, короткие активности</w:t>
-            </w:r>
-          </w:p>
-        </w:tc>
-      </w:tr>
-      <w:tr>
-        <w:tc>
-          <w:tcPr>
-            <w:tcW w:type="dxa" w:w="4986"/>
-            <w:shd w:fill="F7E8E8" w:val="clear"/>
-          </w:tcPr>
-          <w:p>
-            <w:r/>
-            <w:r>
-              <w:rPr>
-                <w:rFonts w:ascii="Arial" w:hAnsi="Arial" w:eastAsia="Arial"/>
-                <w:b/>
-                <w:sz w:val="20"/>
-              </w:rPr>
-              <w:t>16:30</w:t>
-            </w:r>
-          </w:p>
-        </w:tc>
-        <w:tc>
-          <w:tcPr>
-            <w:tcW w:type="dxa" w:w="4986"/>
-            <w:shd w:fill="F7E8E8" w:val="clear"/>
-          </w:tcPr>
-          <w:p>
-            <w:r/>
-            <w:r>
-              <w:rPr>
-                <w:rFonts w:ascii="Arial" w:hAnsi="Arial" w:eastAsia="Arial"/>
-                <w:b w:val="0"/>
-                <w:sz w:val="20"/>
-              </w:rPr>
-              <w:t>Четвертьфиналы / сетка на вылет</w:t>
-            </w:r>
-          </w:p>
-        </w:tc>
-      </w:tr>
-      <w:tr>
-        <w:tc>
-          <w:tcPr>
-            <w:tcW w:type="dxa" w:w="4986"/>
-          </w:tcPr>
-          <w:p>
-            <w:r/>
-            <w:r>
-              <w:rPr>
-                <w:rFonts w:ascii="Arial" w:hAnsi="Arial" w:eastAsia="Arial"/>
-                <w:b/>
-                <w:sz w:val="20"/>
-              </w:rPr>
-              <w:t>17:30</w:t>
-            </w:r>
-          </w:p>
-        </w:tc>
-        <w:tc>
-          <w:tcPr>
-            <w:tcW w:type="dxa" w:w="4986"/>
-          </w:tcPr>
-          <w:p>
-            <w:r/>
-            <w:r>
-              <w:rPr>
-                <w:rFonts w:ascii="Arial" w:hAnsi="Arial" w:eastAsia="Arial"/>
-                <w:b w:val="0"/>
-                <w:sz w:val="20"/>
-              </w:rPr>
-              <w:t>Открытые активности и мини-игры Genshin параллельно с сеткой</w:t>
+              <w:t>Игры на вылет, турнир 5×5</w:t>
             </w:r>
           </w:p>
         </w:tc>
@@ -667,7 +584,7 @@
                 <w:b w:val="0"/>
                 <w:sz w:val="20"/>
               </w:rPr>
-              <w:t>Полуфиналы турнира 5×5</w:t>
+              <w:t>Полуфиналы</w:t>
             </w:r>
           </w:p>
         </w:tc>
@@ -701,7 +618,7 @@
                 <w:b w:val="0"/>
                 <w:sz w:val="20"/>
               </w:rPr>
-              <w:t>Финал турнира 5×5</w:t>
+              <w:t>Финал</w:t>
             </w:r>
           </w:p>
         </w:tc>
@@ -737,7 +654,7 @@
                 <w:b w:val="0"/>
                 <w:sz w:val="20"/>
               </w:rPr>
-              <w:t>Награждение победителей (деньги + алмазы)</w:t>
+              <w:t>Награждение</w:t>
             </w:r>
           </w:p>
         </w:tc>
@@ -755,7 +672,7 @@
                 <w:b/>
                 <w:sz w:val="20"/>
               </w:rPr>
-              <w:t>20:30</w:t>
+              <w:t>21:30</w:t>
             </w:r>
           </w:p>
         </w:tc>
@@ -771,7 +688,7 @@
                 <w:b w:val="0"/>
                 <w:sz w:val="20"/>
               </w:rPr>
-              <w:t>Open play: царь горы, Genshin-мини-игры, фонарики</w:t>
+              <w:t>Закрытие зоны</w:t>
             </w:r>
           </w:p>
         </w:tc>
@@ -790,7 +707,7 @@
                 <w:b/>
                 <w:sz w:val="20"/>
               </w:rPr>
-              <w:t>21:30</w:t>
+              <w:t>21:45–22:30</w:t>
             </w:r>
           </w:p>
         </w:tc>
@@ -807,41 +724,7 @@
                 <w:b w:val="0"/>
                 <w:sz w:val="20"/>
               </w:rPr>
-              <w:t>Закрытие активностей</w:t>
-            </w:r>
-          </w:p>
-        </w:tc>
-      </w:tr>
-      <w:tr>
-        <w:tc>
-          <w:tcPr>
-            <w:tcW w:type="dxa" w:w="4986"/>
-          </w:tcPr>
-          <w:p>
-            <w:r/>
-            <w:r>
-              <w:rPr>
-                <w:rFonts w:ascii="Arial" w:hAnsi="Arial" w:eastAsia="Arial"/>
-                <w:b/>
-                <w:sz w:val="20"/>
-              </w:rPr>
-              <w:t>21:45–22:30</w:t>
-            </w:r>
-          </w:p>
-        </w:tc>
-        <w:tc>
-          <w:tcPr>
-            <w:tcW w:type="dxa" w:w="4986"/>
-          </w:tcPr>
-          <w:p>
-            <w:r/>
-            <w:r>
-              <w:rPr>
-                <w:rFonts w:ascii="Arial" w:hAnsi="Arial" w:eastAsia="Arial"/>
-                <w:b w:val="0"/>
-                <w:sz w:val="20"/>
-              </w:rPr>
-              <w:t>Демонтаж зон</w:t>
+              <w:t>Демонтаж</w:t>
             </w:r>
           </w:p>
         </w:tc>
@@ -872,7 +755,7 @@
           <w:b w:val="0"/>
           <w:sz w:val="22"/>
         </w:rPr>
-        <w:t>Итоговый бюджет зоны: 900 000 ₽ (включая возвращаемый залог за телефоны 40 000 ₽). ПК, столы и PlayStation — оборудование площадки, в смету не входят.</w:t>
+        <w:t>Итоговый бюджет зоны: 900 000 ₽ (включая возвращаемый залог за телефоны 40 000 ₽).</w:t>
       </w:r>
     </w:p>
     <w:tbl>
@@ -967,7 +850,7 @@
                 <w:b w:val="0"/>
                 <w:sz w:val="20"/>
               </w:rPr>
-              <w:t>Косплееры MLBB (2 чел., ~8 ч)</w:t>
+              <w:t>Косплееры Mobile Legends (2 чел.)</w:t>
             </w:r>
           </w:p>
         </w:tc>
@@ -983,7 +866,7 @@
                 <w:b w:val="0"/>
                 <w:sz w:val="18"/>
               </w:rPr>
-              <w:t>фото с гостями весь день</w:t>
+              <w:t>фото весь день</w:t>
             </w:r>
           </w:p>
         </w:tc>
@@ -1018,7 +901,7 @@
                 <w:b w:val="0"/>
                 <w:sz w:val="20"/>
               </w:rPr>
-              <w:t>Косплеерша Genshin (1 чел., ~8 ч)</w:t>
+              <w:t>Косплеерша Genshin Impact (1 чел.)</w:t>
             </w:r>
           </w:p>
         </w:tc>
@@ -1035,7 +918,7 @@
                 <w:b w:val="0"/>
                 <w:sz w:val="18"/>
               </w:rPr>
-              <w:t>зона Genshin Impact, фото весь день</w:t>
+              <w:t>фото весь день</w:t>
             </w:r>
           </w:p>
         </w:tc>
@@ -1070,7 +953,7 @@
                 <w:b w:val="0"/>
                 <w:sz w:val="20"/>
               </w:rPr>
-              <w:t>Фотозона MLBB 3×2 м</w:t>
+              <w:t>Фотозона Mobile Legends 3×2 м</w:t>
             </w:r>
           </w:p>
         </w:tc>
@@ -1086,7 +969,7 @@
                 <w:b w:val="0"/>
                 <w:sz w:val="18"/>
               </w:rPr>
-              <w:t>каркас + печать + монтаж</w:t>
+              <w:t>каркас, печать, монтаж</w:t>
             </w:r>
           </w:p>
         </w:tc>
@@ -1102,7 +985,7 @@
                 <w:b w:val="0"/>
                 <w:sz w:val="20"/>
               </w:rPr>
-              <w:t>20 000</w:t>
+              <w:t>30 000</w:t>
             </w:r>
           </w:p>
         </w:tc>
@@ -1138,7 +1021,7 @@
                 <w:b w:val="0"/>
                 <w:sz w:val="18"/>
               </w:rPr>
-              <w:t>Lantern Rite / CNY: панели, ткань, фонари, фотофон</w:t>
+              <w:t>панели, ткань, фонари, фотофон</w:t>
             </w:r>
           </w:p>
         </w:tc>
@@ -1155,7 +1038,7 @@
                 <w:b w:val="0"/>
                 <w:sz w:val="20"/>
               </w:rPr>
-              <w:t>190 000</w:t>
+              <w:t>260 000</w:t>
             </w:r>
           </w:p>
         </w:tc>
@@ -1173,7 +1056,7 @@
                 <w:b w:val="0"/>
                 <w:sz w:val="20"/>
               </w:rPr>
-              <w:t>Декор общий под Китайский Новый год</w:t>
+              <w:t>Декор под Китайский Новый год</w:t>
             </w:r>
           </w:p>
         </w:tc>
@@ -1189,7 +1072,7 @@
                 <w:b w:val="0"/>
                 <w:sz w:val="18"/>
               </w:rPr>
-              <w:t>зона MLBB + общие проходы</w:t>
+              <w:t>зона Mobile Legends и проходы</w:t>
             </w:r>
           </w:p>
         </w:tc>
@@ -1205,7 +1088,7 @@
                 <w:b w:val="0"/>
                 <w:sz w:val="20"/>
               </w:rPr>
-              <w:t>50 000</w:t>
+              <w:t>75 000</w:t>
             </w:r>
           </w:p>
         </w:tc>
@@ -1241,7 +1124,7 @@
                 <w:b w:val="0"/>
                 <w:sz w:val="18"/>
               </w:rPr>
-              <w:t>декор + техника, 2 рейса</w:t>
+              <w:t>декор и техника, 2 рейса</w:t>
             </w:r>
           </w:p>
         </w:tc>
@@ -1276,7 +1159,7 @@
                 <w:b w:val="0"/>
                 <w:sz w:val="20"/>
               </w:rPr>
-              <w:t>Ведущий (~10 ч)</w:t>
+              <w:t>Ведущий</w:t>
             </w:r>
           </w:p>
         </w:tc>
@@ -1292,7 +1175,7 @@
                 <w:b w:val="0"/>
                 <w:sz w:val="18"/>
               </w:rPr>
-              <w:t>с учётом пауз</w:t>
+              <w:t>около 10 часов</w:t>
             </w:r>
           </w:p>
         </w:tc>
@@ -1308,7 +1191,7 @@
                 <w:b w:val="0"/>
                 <w:sz w:val="20"/>
               </w:rPr>
-              <w:t>55 000</w:t>
+              <w:t>65 000</w:t>
             </w:r>
           </w:p>
         </w:tc>
@@ -1327,7 +1210,7 @@
                 <w:b w:val="0"/>
                 <w:sz w:val="20"/>
               </w:rPr>
-              <w:t>Алмазы MLBB 15 000 шт.</w:t>
+              <w:t>Алмазы Mobile Legends 15 000 шт.</w:t>
             </w:r>
           </w:p>
         </w:tc>
@@ -1344,7 +1227,7 @@
                 <w:b w:val="0"/>
                 <w:sz w:val="18"/>
               </w:rPr>
-              <w:t>призы активностей и турнира</w:t>
+              <w:t>призы</w:t>
             </w:r>
           </w:p>
         </w:tc>
@@ -1480,7 +1363,7 @@
                 <w:b w:val="0"/>
                 <w:sz w:val="20"/>
               </w:rPr>
-              <w:t>Аренда ТВ 55–65″ + стойка</w:t>
+              <w:t>Покупки в Genshin Impact для зоны</w:t>
             </w:r>
           </w:p>
         </w:tc>
@@ -1496,7 +1379,7 @@
                 <w:b w:val="0"/>
                 <w:sz w:val="18"/>
               </w:rPr>
-              <w:t>запуск фонариков / showcase; ПК и столы — оборудование площадки</w:t>
+              <w:t>валюта и оформление</w:t>
             </w:r>
           </w:p>
         </w:tc>
@@ -1512,7 +1395,7 @@
                 <w:b w:val="0"/>
                 <w:sz w:val="20"/>
               </w:rPr>
-              <w:t>20 000</w:t>
+              <w:t>12 000</w:t>
             </w:r>
           </w:p>
         </w:tc>
@@ -1531,7 +1414,7 @@
                 <w:b w:val="0"/>
                 <w:sz w:val="20"/>
               </w:rPr>
-              <w:t>Внутриигровые покупки Genshin</w:t>
+              <w:t>Зарядка для телефонов</w:t>
             </w:r>
           </w:p>
         </w:tc>
@@ -1548,7 +1431,6 @@
                 <w:b w:val="0"/>
                 <w:sz w:val="18"/>
               </w:rPr>
-              <w:t>Welkin / кристаллы / косметика события; мини-игры и фонарики обычно бесплатны</w:t>
             </w:r>
           </w:p>
         </w:tc>
@@ -1583,7 +1465,7 @@
                 <w:b w:val="0"/>
                 <w:sz w:val="20"/>
               </w:rPr>
-              <w:t>Зарядка для телефонов</w:t>
+              <w:t>Аренда 14 смартфонов</w:t>
             </w:r>
           </w:p>
         </w:tc>
@@ -1599,6 +1481,7 @@
                 <w:b w:val="0"/>
                 <w:sz w:val="18"/>
               </w:rPr>
+              <w:t>2 суток, с резервом</w:t>
             </w:r>
           </w:p>
         </w:tc>
@@ -1614,7 +1497,7 @@
                 <w:b w:val="0"/>
                 <w:sz w:val="20"/>
               </w:rPr>
-              <w:t>12 000</w:t>
+              <w:t>15 900</w:t>
             </w:r>
           </w:p>
         </w:tc>
@@ -1633,7 +1516,7 @@
                 <w:b w:val="0"/>
                 <w:sz w:val="20"/>
               </w:rPr>
-              <w:t>Аренда 14 смартфонов (2 суток)</w:t>
+              <w:t>Залог за телефоны</w:t>
             </w:r>
           </w:p>
         </w:tc>
@@ -1650,213 +1533,7 @@
                 <w:b w:val="0"/>
                 <w:sz w:val="18"/>
               </w:rPr>
-              <w:t>10 + 2 + 2 резерв</w:t>
-            </w:r>
-          </w:p>
-        </w:tc>
-        <w:tc>
-          <w:tcPr>
-            <w:tcW w:type="dxa" w:w="3324"/>
-            <w:shd w:fill="F7E8E8" w:val="clear"/>
-          </w:tcPr>
-          <w:p>
-            <w:r/>
-            <w:r>
-              <w:rPr>
-                <w:rFonts w:ascii="Arial" w:hAnsi="Arial" w:eastAsia="Arial"/>
-                <w:b w:val="0"/>
-                <w:sz w:val="20"/>
-              </w:rPr>
-              <w:t>15 900</w:t>
-            </w:r>
-          </w:p>
-        </w:tc>
-      </w:tr>
-      <w:tr>
-        <w:tc>
-          <w:tcPr>
-            <w:tcW w:type="dxa" w:w="3324"/>
-          </w:tcPr>
-          <w:p>
-            <w:r/>
-            <w:r>
-              <w:rPr>
-                <w:rFonts w:ascii="Arial" w:hAnsi="Arial" w:eastAsia="Arial"/>
-                <w:b w:val="0"/>
-                <w:sz w:val="20"/>
-              </w:rPr>
-              <w:t>Залог за телефоны (возвращаемый)</w:t>
-            </w:r>
-          </w:p>
-        </w:tc>
-        <w:tc>
-          <w:tcPr>
-            <w:tcW w:type="dxa" w:w="3324"/>
-          </w:tcPr>
-          <w:p>
-            <w:r/>
-            <w:r>
-              <w:rPr>
-                <w:rFonts w:ascii="Arial" w:hAnsi="Arial" w:eastAsia="Arial"/>
-                <w:b w:val="0"/>
-                <w:sz w:val="18"/>
-              </w:rPr>
-              <w:t>возвращается после ивента</w:t>
-            </w:r>
-          </w:p>
-        </w:tc>
-        <w:tc>
-          <w:tcPr>
-            <w:tcW w:type="dxa" w:w="3324"/>
-          </w:tcPr>
-          <w:p>
-            <w:r/>
-            <w:r>
-              <w:rPr>
-                <w:rFonts w:ascii="Arial" w:hAnsi="Arial" w:eastAsia="Arial"/>
-                <w:b w:val="0"/>
-                <w:sz w:val="20"/>
-              </w:rPr>
-              <w:t>40 000</w:t>
-            </w:r>
-          </w:p>
-        </w:tc>
-      </w:tr>
-      <w:tr>
-        <w:tc>
-          <w:tcPr>
-            <w:tcW w:type="dxa" w:w="3324"/>
-            <w:shd w:fill="F7E8E8" w:val="clear"/>
-          </w:tcPr>
-          <w:p>
-            <w:r/>
-            <w:r>
-              <w:rPr>
-                <w:rFonts w:ascii="Arial" w:hAnsi="Arial" w:eastAsia="Arial"/>
-                <w:b w:val="0"/>
-                <w:sz w:val="20"/>
-              </w:rPr>
-              <w:t>Медийный гость</w:t>
-            </w:r>
-          </w:p>
-        </w:tc>
-        <w:tc>
-          <w:tcPr>
-            <w:tcW w:type="dxa" w:w="3324"/>
-            <w:shd w:fill="F7E8E8" w:val="clear"/>
-          </w:tcPr>
-          <w:p>
-            <w:r/>
-            <w:r>
-              <w:rPr>
-                <w:rFonts w:ascii="Arial" w:hAnsi="Arial" w:eastAsia="Arial"/>
-                <w:b w:val="0"/>
-                <w:sz w:val="18"/>
-              </w:rPr>
-              <w:t>появление на зоне, фото / стрим</w:t>
-            </w:r>
-          </w:p>
-        </w:tc>
-        <w:tc>
-          <w:tcPr>
-            <w:tcW w:type="dxa" w:w="3324"/>
-            <w:shd w:fill="F7E8E8" w:val="clear"/>
-          </w:tcPr>
-          <w:p>
-            <w:r/>
-            <w:r>
-              <w:rPr>
-                <w:rFonts w:ascii="Arial" w:hAnsi="Arial" w:eastAsia="Arial"/>
-                <w:b w:val="0"/>
-                <w:sz w:val="20"/>
-              </w:rPr>
-              <w:t>70 000</w:t>
-            </w:r>
-          </w:p>
-        </w:tc>
-      </w:tr>
-      <w:tr>
-        <w:tc>
-          <w:tcPr>
-            <w:tcW w:type="dxa" w:w="3324"/>
-          </w:tcPr>
-          <w:p>
-            <w:r/>
-            <w:r>
-              <w:rPr>
-                <w:rFonts w:ascii="Arial" w:hAnsi="Arial" w:eastAsia="Arial"/>
-                <w:b w:val="0"/>
-                <w:sz w:val="20"/>
-              </w:rPr>
-              <w:t>Реклама и промо</w:t>
-            </w:r>
-          </w:p>
-        </w:tc>
-        <w:tc>
-          <w:tcPr>
-            <w:tcW w:type="dxa" w:w="3324"/>
-          </w:tcPr>
-          <w:p>
-            <w:r/>
-            <w:r>
-              <w:rPr>
-                <w:rFonts w:ascii="Arial" w:hAnsi="Arial" w:eastAsia="Arial"/>
-                <w:b w:val="0"/>
-                <w:sz w:val="18"/>
-              </w:rPr>
-              <w:t>таргет + креативы; анонсы в офиц. пабликах MLBB — 0 ₽</w:t>
-            </w:r>
-          </w:p>
-        </w:tc>
-        <w:tc>
-          <w:tcPr>
-            <w:tcW w:type="dxa" w:w="3324"/>
-          </w:tcPr>
-          <w:p>
-            <w:r/>
-            <w:r>
-              <w:rPr>
-                <w:rFonts w:ascii="Arial" w:hAnsi="Arial" w:eastAsia="Arial"/>
-                <w:b w:val="0"/>
-                <w:sz w:val="20"/>
-              </w:rPr>
-              <w:t>60 000</w:t>
-            </w:r>
-          </w:p>
-        </w:tc>
-      </w:tr>
-      <w:tr>
-        <w:tc>
-          <w:tcPr>
-            <w:tcW w:type="dxa" w:w="3324"/>
-            <w:shd w:fill="F7E8E8" w:val="clear"/>
-          </w:tcPr>
-          <w:p>
-            <w:r/>
-            <w:r>
-              <w:rPr>
-                <w:rFonts w:ascii="Arial" w:hAnsi="Arial" w:eastAsia="Arial"/>
-                <w:b w:val="0"/>
-                <w:sz w:val="20"/>
-              </w:rPr>
-              <w:t>Трансляция (оператор + техника)</w:t>
-            </w:r>
-          </w:p>
-        </w:tc>
-        <w:tc>
-          <w:tcPr>
-            <w:tcW w:type="dxa" w:w="3324"/>
-            <w:shd w:fill="F7E8E8" w:val="clear"/>
-          </w:tcPr>
-          <w:p>
-            <w:r/>
-            <w:r>
-              <w:rPr>
-                <w:rFonts w:ascii="Arial" w:hAnsi="Arial" w:eastAsia="Arial"/>
-                <w:b w:val="0"/>
-                <w:sz w:val="18"/>
-              </w:rPr>
-              <w:t>10–12 часов эфира</w:t>
+              <w:t>возвращается</w:t>
             </w:r>
           </w:p>
         </w:tc>
@@ -1891,7 +1568,7 @@
                 <w:b w:val="0"/>
                 <w:sz w:val="20"/>
               </w:rPr>
-              <w:t>Монтаж / демонтаж зон</w:t>
+              <w:t>Медийный гость</w:t>
             </w:r>
           </w:p>
         </w:tc>
@@ -1907,7 +1584,6 @@
                 <w:b w:val="0"/>
                 <w:sz w:val="18"/>
               </w:rPr>
-              <w:t>MLBB + Genshin</w:t>
             </w:r>
           </w:p>
         </w:tc>
@@ -1923,7 +1599,7 @@
                 <w:b w:val="0"/>
                 <w:sz w:val="20"/>
               </w:rPr>
-              <w:t>40 000</w:t>
+              <w:t>85 000</w:t>
             </w:r>
           </w:p>
         </w:tc>
@@ -1942,7 +1618,7 @@
                 <w:b w:val="0"/>
                 <w:sz w:val="20"/>
               </w:rPr>
-              <w:t>Звук / микрофоны ведущего</w:t>
+              <w:t>Монтаж и демонтаж зон</w:t>
             </w:r>
           </w:p>
         </w:tc>
@@ -1975,7 +1651,7 @@
                 <w:b w:val="0"/>
                 <w:sz w:val="20"/>
               </w:rPr>
-              <w:t>20 000</w:t>
+              <w:t>50 000</w:t>
             </w:r>
           </w:p>
         </w:tc>
@@ -2083,19 +1759,6 @@
       </w:tr>
     </w:tbl>
     <w:p/>
-    <w:p>
-      <w:pPr>
-        <w:spacing w:after="120"/>
-      </w:pPr>
-      <w:r>
-        <w:rPr>
-          <w:rFonts w:ascii="Arial" w:hAnsi="Arial" w:eastAsia="Arial"/>
-          <w:b w:val="0"/>
-          <w:sz w:val="22"/>
-        </w:rPr>
-        <w:t>Комментарий по Genshin: сезонный CNY-ивент обычно даёт бесплатные мини-игры и механики запуска фонариков. Покупка внутри игры нужна скорее для косметики/комфорта демо. Основная статья — физический декор уголка и косплеерша. ПК и столы не арендуем.</w:t>
-      </w:r>
-    </w:p>
     <w:p>
       <w:pPr>
         <w:pStyle w:val="Heading1"/>
@@ -2249,7 +1912,7 @@
                 <w:b w:val="0"/>
                 <w:sz w:val="20"/>
               </w:rPr>
-              <w:t>Команды в турнире 5×5 (предрегистрация)</w:t>
+              <w:t>Команды в турнире 5×5</w:t>
             </w:r>
           </w:p>
         </w:tc>
@@ -2319,7 +1982,7 @@
                 <w:b w:val="0"/>
                 <w:sz w:val="20"/>
               </w:rPr>
-              <w:t>Фото у зоны / с косплеем</w:t>
+              <w:t>Фото у зоны и с косплеем</w:t>
             </w:r>
           </w:p>
         </w:tc>
@@ -2354,7 +2017,7 @@
                 <w:b w:val="0"/>
                 <w:sz w:val="20"/>
               </w:rPr>
-              <w:t>Гости уголка Genshin (мини-игры / фонарики)</w:t>
+              <w:t>Гости уголка Genshin Impact</w:t>
             </w:r>
           </w:p>
         </w:tc>
@@ -2529,7 +2192,7 @@
                 <w:b w:val="0"/>
                 <w:sz w:val="20"/>
               </w:rPr>
-              <w:t>Короткие ролики / охват за неделю</w:t>
+              <w:t>Короткие ролики за неделю</w:t>
             </w:r>
           </w:p>
         </w:tc>
@@ -2545,7 +2208,7 @@
                 <w:b w:val="0"/>
                 <w:sz w:val="20"/>
               </w:rPr>
-              <w:t>10–14 шт. / 10–20 тыс.</w:t>
+              <w:t>10–14 шт. / 10–20 тыс. охват</w:t>
             </w:r>
           </w:p>
         </w:tc>

</xml_diff>

<commit_message>
Note official MLBB community placement for the event
Co-authored-by: harakirijkee <harakirijkee@gmail.com>
</commit_message>
<xml_diff>
--- a/MLBB_CyberSaturday_CNY_Brief_Budget.docx
+++ b/MLBB_CyberSaturday_CNY_Brief_Budget.docx
@@ -54,7 +54,7 @@
           <w:b w:val="0"/>
           <w:sz w:val="22"/>
         </w:rPr>
-        <w:t>Зона Mobile Legends и уголок Genshin Impact внутри фестиваля «Киберсуббота» в Сколково. Мероприятие приурочено к Китайскому Новому году (6 февраля 2027). Команды на турнир 5×5 регистрируются заранее. Компьютеры, столы, телевизоры, звук и приставка — оборудование площадки. Активности доступны всё время работы зоны.</w:t>
+        <w:t>Зона Mobile Legends и уголок Genshin Impact внутри фестиваля «Киберсуббота» в Сколково. Мероприятие приурочено к Китайскому Новому году (6 февраля 2027). Команды на турнир 5×5 регистрируются заранее. Компьютеры, столы, телевизоры, звук и приставка — оборудование площадки. Активности доступны всё время работы зоны. Ивент получит размещение в официальных пабликах Mobile Legends.</w:t>
       </w:r>
     </w:p>
     <w:p>
@@ -159,6 +159,19 @@
           <w:sz w:val="22"/>
         </w:rPr>
         <w:t>трансляция с площадки</w:t>
+      </w:r>
+    </w:p>
+    <w:p>
+      <w:pPr>
+        <w:pStyle w:val="ListBullet"/>
+      </w:pPr>
+      <w:r>
+        <w:rPr>
+          <w:rFonts w:ascii="Arial" w:hAnsi="Arial" w:eastAsia="Arial"/>
+          <w:b w:val="0"/>
+          <w:sz w:val="22"/>
+        </w:rPr>
+        <w:t>размещение ивента в официальных пабликах Mobile Legends</w:t>
       </w:r>
     </w:p>
     <w:p>

</xml_diff>

<commit_message>
Sync Word brief with rebalanced 70k Genshin decor
Co-authored-by: harakirijkee <harakirijkee@gmail.com>
</commit_message>
<xml_diff>
--- a/MLBB_CyberSaturday_CNY_Brief_Budget.docx
+++ b/MLBB_CyberSaturday_CNY_Brief_Budget.docx
@@ -54,7 +54,7 @@
           <w:b w:val="0"/>
           <w:sz w:val="22"/>
         </w:rPr>
-        <w:t>Зона Mobile Legends и уголок Genshin Impact внутри фестиваля «Киберсуббота» в Сколково. Мероприятие приурочено к Китайскому Новому году (6 февраля 2027). Команды на турнир 5×5 регистрируются заранее. Компьютеры, столы, телевизоры, звук и приставка — оборудование площадки. Активности доступны всё время работы зоны. Ивент получит размещение в официальных пабликах Mobile Legends.</w:t>
+        <w:t>Зона Mobile Legends и уголок Genshin Impact внутри фестиваля «Киберсуббота» в Сколково. Мероприятие приурочено к Китайскому Новому году (6 февраля 2027). Команды на турнир 5×5 регистрируются заранее. Активности доступны всё время работы зоны. Ивент получит размещение в официальных пабликах Mobile Legends.</w:t>
       </w:r>
     </w:p>
     <w:p>
@@ -132,7 +132,7 @@
           <w:b w:val="0"/>
           <w:sz w:val="22"/>
         </w:rPr>
-        <w:t>зона отдыха с приставкой (оборудование площадки)</w:t>
+        <w:t>зона отдыха с приставкой</w:t>
       </w:r>
     </w:p>
     <w:p>
@@ -210,7 +210,7 @@
           <w:b w:val="0"/>
           <w:sz w:val="22"/>
         </w:rPr>
-        <w:t>2 компьютера площадки с мини-играми Genshin Impact</w:t>
+        <w:t>2 компьютера с мини-играми Genshin Impact</w:t>
       </w:r>
     </w:p>
     <w:p>
@@ -223,7 +223,7 @@
           <w:b w:val="0"/>
           <w:sz w:val="22"/>
         </w:rPr>
-        <w:t>телевизор площадки: запуск фонариков из игрового события</w:t>
+        <w:t>телевизор: запуск фонариков из игрового события</w:t>
       </w:r>
     </w:p>
     <w:p>
@@ -263,7 +263,7 @@
           <w:b w:val="0"/>
           <w:sz w:val="22"/>
         </w:rPr>
-        <w:t>Свободная игра, мини-игры, фотозона, косплей и фонарики доступны всё время работы зоны.</w:t>
+        <w:t>Мини-игры, фотозона, косплей и фонарики доступны всё время работы зоны.</w:t>
       </w:r>
     </w:p>
     <w:tbl>
@@ -895,7 +895,7 @@
                 <w:b w:val="0"/>
                 <w:sz w:val="20"/>
               </w:rPr>
-              <w:t>70 400</w:t>
+              <w:t>90 000</w:t>
             </w:r>
           </w:p>
         </w:tc>
@@ -948,7 +948,7 @@
                 <w:b w:val="0"/>
                 <w:sz w:val="20"/>
               </w:rPr>
-              <w:t>40 000</w:t>
+              <w:t>50 000</w:t>
             </w:r>
           </w:p>
         </w:tc>
@@ -998,7 +998,7 @@
                 <w:b w:val="0"/>
                 <w:sz w:val="20"/>
               </w:rPr>
-              <w:t>30 000</w:t>
+              <w:t>45 000</w:t>
             </w:r>
           </w:p>
         </w:tc>
@@ -1051,7 +1051,7 @@
                 <w:b w:val="0"/>
                 <w:sz w:val="20"/>
               </w:rPr>
-              <w:t>260 000</w:t>
+              <w:t>70 000</w:t>
             </w:r>
           </w:p>
         </w:tc>
@@ -1101,7 +1101,7 @@
                 <w:b w:val="0"/>
                 <w:sz w:val="20"/>
               </w:rPr>
-              <w:t>75 000</w:t>
+              <w:t>100 000</w:t>
             </w:r>
           </w:p>
         </w:tc>
@@ -1154,7 +1154,7 @@
                 <w:b w:val="0"/>
                 <w:sz w:val="20"/>
               </w:rPr>
-              <w:t>15 000</w:t>
+              <w:t>25 000</w:t>
             </w:r>
           </w:p>
         </w:tc>
@@ -1204,7 +1204,7 @@
                 <w:b w:val="0"/>
                 <w:sz w:val="20"/>
               </w:rPr>
-              <w:t>65 000</w:t>
+              <w:t>80 000</w:t>
             </w:r>
           </w:p>
         </w:tc>
@@ -1306,7 +1306,7 @@
                 <w:b w:val="0"/>
                 <w:sz w:val="20"/>
               </w:rPr>
-              <w:t>40 000</w:t>
+              <w:t>50 000</w:t>
             </w:r>
           </w:p>
         </w:tc>
@@ -1358,7 +1358,7 @@
                 <w:b w:val="0"/>
                 <w:sz w:val="20"/>
               </w:rPr>
-              <w:t>15 000</w:t>
+              <w:t>25 000</w:t>
             </w:r>
           </w:p>
         </w:tc>
@@ -1460,7 +1460,7 @@
                 <w:b w:val="0"/>
                 <w:sz w:val="20"/>
               </w:rPr>
-              <w:t>12 000</w:t>
+              <w:t>20 000</w:t>
             </w:r>
           </w:p>
         </w:tc>
@@ -1612,7 +1612,7 @@
                 <w:b w:val="0"/>
                 <w:sz w:val="20"/>
               </w:rPr>
-              <w:t>85 000</w:t>
+              <w:t>110 000</w:t>
             </w:r>
           </w:p>
         </w:tc>
@@ -1664,7 +1664,7 @@
                 <w:b w:val="0"/>
                 <w:sz w:val="20"/>
               </w:rPr>
-              <w:t>50 000</w:t>
+              <w:t>70 000</w:t>
             </w:r>
           </w:p>
         </w:tc>
@@ -1713,7 +1713,7 @@
                 <w:b w:val="0"/>
                 <w:sz w:val="20"/>
               </w:rPr>
-              <w:t>50 550</w:t>
+              <w:t>72 950</w:t>
             </w:r>
           </w:p>
         </w:tc>

</xml_diff>

<commit_message>
Rebuild 900k estimate from venue KP rates
Include arena rental, admins, full broadcast crew, studio light and
TVs; leave residual for event production. Ship sectioned Excel KP
format plus updated brief site and Word file. No PC rental.

Co-authored-by: harakirijkee <harakirijkee@gmail.com>
</commit_message>
<xml_diff>
--- a/MLBB_CyberSaturday_CNY_Brief_Budget.docx
+++ b/MLBB_CyberSaturday_CNY_Brief_Budget.docx
@@ -10,10 +10,10 @@
         <w:rPr>
           <w:rFonts w:ascii="Arial" w:hAnsi="Arial" w:eastAsia="Arial"/>
           <w:b/>
-          <w:color w:val="C41E3A"/>
-          <w:sz w:val="36"/>
+          <w:color w:val="1F4E79"/>
+          <w:sz w:val="32"/>
         </w:rPr>
-        <w:t>Зона Mobile Legends + Genshin Impact на «Киберсубботе»</w:t>
+        <w:t>Смета зоны Mobile Legends + Genshin Impact</w:t>
       </w:r>
     </w:p>
     <w:p>
@@ -27,243 +27,17 @@
           <w:color w:val="505050"/>
           <w:sz w:val="22"/>
         </w:rPr>
-        <w:t>Китайский Новый год · Сколково · 6 февраля 2027 · Бюджет 900 000 ₽</w:t>
+        <w:t>Киберсуббота · Сколково · 6 февраля 2027 · 900 000 ₽</w:t>
       </w:r>
     </w:p>
     <w:p>
-      <w:pPr>
-        <w:pStyle w:val="Heading1"/>
-      </w:pPr>
-      <w:r>
-        <w:rPr>
-          <w:rFonts w:ascii="Arial" w:hAnsi="Arial" w:eastAsia="Arial"/>
-          <w:b/>
-          <w:color w:val="C41E3A"/>
-          <w:sz w:val="32"/>
-        </w:rPr>
-        <w:t>1. Описание</w:t>
-      </w:r>
-    </w:p>
-    <w:p>
-      <w:pPr>
-        <w:spacing w:after="120"/>
-      </w:pPr>
       <w:r>
         <w:rPr>
           <w:rFonts w:ascii="Arial" w:hAnsi="Arial" w:eastAsia="Arial"/>
           <w:b w:val="0"/>
-          <w:sz w:val="22"/>
+          <w:sz w:val="20"/>
         </w:rPr>
-        <w:t>Зона Mobile Legends и уголок Genshin Impact внутри фестиваля «Киберсуббота» в Сколково. Мероприятие приурочено к Китайскому Новому году (6 февраля 2027). Команды на турнир 5×5 регистрируются заранее. Активности доступны всё время работы зоны. Ивент получит размещение в официальных пабликах Mobile Legends.</w:t>
-      </w:r>
-    </w:p>
-    <w:p>
-      <w:pPr>
-        <w:spacing w:after="120"/>
-      </w:pPr>
-      <w:r>
-        <w:rPr>
-          <w:rFonts w:ascii="Arial" w:hAnsi="Arial" w:eastAsia="Arial"/>
-          <w:b/>
-          <w:sz w:val="22"/>
-        </w:rPr>
-        <w:t>На зоне Mobile Legends:</w:t>
-      </w:r>
-    </w:p>
-    <w:p>
-      <w:pPr>
-        <w:pStyle w:val="ListBullet"/>
-      </w:pPr>
-      <w:r>
-        <w:rPr>
-          <w:rFonts w:ascii="Arial" w:hAnsi="Arial" w:eastAsia="Arial"/>
-          <w:b w:val="0"/>
-          <w:sz w:val="22"/>
-        </w:rPr>
-        <w:t>турнир 5×5: команды регистрируются заранее, приз 40 000 ₽ и алмазы</w:t>
-      </w:r>
-    </w:p>
-    <w:p>
-      <w:pPr>
-        <w:pStyle w:val="ListBullet"/>
-      </w:pPr>
-      <w:r>
-        <w:rPr>
-          <w:rFonts w:ascii="Arial" w:hAnsi="Arial" w:eastAsia="Arial"/>
-          <w:b w:val="0"/>
-          <w:sz w:val="22"/>
-        </w:rPr>
-        <w:t>«царь горы» 1×1 за алмазы</w:t>
-      </w:r>
-    </w:p>
-    <w:p>
-      <w:pPr>
-        <w:pStyle w:val="ListBullet"/>
-      </w:pPr>
-      <w:r>
-        <w:rPr>
-          <w:rFonts w:ascii="Arial" w:hAnsi="Arial" w:eastAsia="Arial"/>
-          <w:b w:val="0"/>
-          <w:sz w:val="22"/>
-        </w:rPr>
-        <w:t>викторина, бинго, конкурс рисунков</w:t>
-      </w:r>
-    </w:p>
-    <w:p>
-      <w:pPr>
-        <w:pStyle w:val="ListBullet"/>
-      </w:pPr>
-      <w:r>
-        <w:rPr>
-          <w:rFonts w:ascii="Arial" w:hAnsi="Arial" w:eastAsia="Arial"/>
-          <w:b w:val="0"/>
-          <w:sz w:val="22"/>
-        </w:rPr>
-        <w:t>2 косплеера и фотозона 3×2 м — фото весь день</w:t>
-      </w:r>
-    </w:p>
-    <w:p>
-      <w:pPr>
-        <w:pStyle w:val="ListBullet"/>
-      </w:pPr>
-      <w:r>
-        <w:rPr>
-          <w:rFonts w:ascii="Arial" w:hAnsi="Arial" w:eastAsia="Arial"/>
-          <w:b w:val="0"/>
-          <w:sz w:val="22"/>
-        </w:rPr>
-        <w:t>зона отдыха с приставкой</w:t>
-      </w:r>
-    </w:p>
-    <w:p>
-      <w:pPr>
-        <w:pStyle w:val="ListBullet"/>
-      </w:pPr>
-      <w:r>
-        <w:rPr>
-          <w:rFonts w:ascii="Arial" w:hAnsi="Arial" w:eastAsia="Arial"/>
-          <w:b w:val="0"/>
-          <w:sz w:val="22"/>
-        </w:rPr>
-        <w:t>медийный гость</w:t>
-      </w:r>
-    </w:p>
-    <w:p>
-      <w:pPr>
-        <w:pStyle w:val="ListBullet"/>
-      </w:pPr>
-      <w:r>
-        <w:rPr>
-          <w:rFonts w:ascii="Arial" w:hAnsi="Arial" w:eastAsia="Arial"/>
-          <w:b w:val="0"/>
-          <w:sz w:val="22"/>
-        </w:rPr>
-        <w:t>трансляция с площадки</w:t>
-      </w:r>
-    </w:p>
-    <w:p>
-      <w:pPr>
-        <w:pStyle w:val="ListBullet"/>
-      </w:pPr>
-      <w:r>
-        <w:rPr>
-          <w:rFonts w:ascii="Arial" w:hAnsi="Arial" w:eastAsia="Arial"/>
-          <w:b w:val="0"/>
-          <w:sz w:val="22"/>
-        </w:rPr>
-        <w:t>размещение ивента в официальных пабликах Mobile Legends</w:t>
-      </w:r>
-    </w:p>
-    <w:p>
-      <w:pPr>
-        <w:spacing w:after="120"/>
-      </w:pPr>
-      <w:r>
-        <w:rPr>
-          <w:rFonts w:ascii="Arial" w:hAnsi="Arial" w:eastAsia="Arial"/>
-          <w:b/>
-          <w:sz w:val="22"/>
-        </w:rPr>
-        <w:t>Уголок Genshin Impact:</w:t>
-      </w:r>
-    </w:p>
-    <w:p>
-      <w:pPr>
-        <w:pStyle w:val="ListBullet"/>
-      </w:pPr>
-      <w:r>
-        <w:rPr>
-          <w:rFonts w:ascii="Arial" w:hAnsi="Arial" w:eastAsia="Arial"/>
-          <w:b w:val="0"/>
-          <w:sz w:val="22"/>
-        </w:rPr>
-        <w:t>декор в стиле китайского Нового года и игрового праздника фонарей</w:t>
-      </w:r>
-    </w:p>
-    <w:p>
-      <w:pPr>
-        <w:pStyle w:val="ListBullet"/>
-      </w:pPr>
-      <w:r>
-        <w:rPr>
-          <w:rFonts w:ascii="Arial" w:hAnsi="Arial" w:eastAsia="Arial"/>
-          <w:b w:val="0"/>
-          <w:sz w:val="22"/>
-        </w:rPr>
-        <w:t>2 компьютера с мини-играми Genshin Impact</w:t>
-      </w:r>
-    </w:p>
-    <w:p>
-      <w:pPr>
-        <w:pStyle w:val="ListBullet"/>
-      </w:pPr>
-      <w:r>
-        <w:rPr>
-          <w:rFonts w:ascii="Arial" w:hAnsi="Arial" w:eastAsia="Arial"/>
-          <w:b w:val="0"/>
-          <w:sz w:val="22"/>
-        </w:rPr>
-        <w:t>телевизор: запуск фонариков из игрового события</w:t>
-      </w:r>
-    </w:p>
-    <w:p>
-      <w:pPr>
-        <w:pStyle w:val="ListBullet"/>
-      </w:pPr>
-      <w:r>
-        <w:rPr>
-          <w:rFonts w:ascii="Arial" w:hAnsi="Arial" w:eastAsia="Arial"/>
-          <w:b w:val="0"/>
-          <w:sz w:val="22"/>
-        </w:rPr>
-        <w:t>1 косплеерша — фото весь день</w:t>
-      </w:r>
-    </w:p>
-    <w:p>
-      <w:pPr>
-        <w:pStyle w:val="Heading1"/>
-      </w:pPr>
-      <w:r>
-        <w:rPr>
-          <w:rFonts w:ascii="Arial" w:hAnsi="Arial" w:eastAsia="Arial"/>
-          <w:b/>
-          <w:color w:val="C41E3A"/>
-          <w:sz w:val="32"/>
-        </w:rPr>
-        <w:t>2. Расписание дня (6 февраля 2027)</w:t>
-      </w:r>
-    </w:p>
-    <w:p>
-      <w:pPr>
-        <w:spacing w:after="120"/>
-      </w:pPr>
-      <w:r>
-        <w:rPr>
-          <w:rFonts w:ascii="Arial" w:hAnsi="Arial" w:eastAsia="Arial"/>
-          <w:b w:val="0"/>
-          <w:sz w:val="22"/>
-        </w:rPr>
-        <w:t>Мини-игры, фотозона, косплей и фонарики доступны всё время работы зоны.</w:t>
+        <w:t>Команды на турнир 5×5 регистрируются заранее. Активности доступны всё время работы зоны. Ивент получит размещение в официальных пабликах Mobile Legends. Компьютеры не арендуем.</w:t>
       </w:r>
     </w:p>
     <w:tbl>
@@ -273,14 +47,16 @@
         <w:tblLook w:firstColumn="1" w:firstRow="1" w:lastColumn="0" w:lastRow="0" w:noHBand="0" w:noVBand="1" w:val="04A0"/>
       </w:tblPr>
       <w:tblGrid>
-        <w:gridCol w:w="4986"/>
-        <w:gridCol w:w="4986"/>
+        <w:gridCol w:w="2635"/>
+        <w:gridCol w:w="2635"/>
+        <w:gridCol w:w="2635"/>
+        <w:gridCol w:w="2635"/>
       </w:tblGrid>
       <w:tr>
         <w:tc>
           <w:tcPr>
-            <w:tcW w:type="dxa" w:w="4986"/>
-            <w:shd w:fill="C41E3A" w:val="clear"/>
+            <w:tcW w:type="dxa" w:w="2635"/>
+            <w:shd w:fill="1F4E79" w:val="clear"/>
           </w:tcPr>
           <w:p>
             <w:r>
@@ -293,16 +69,16 @@
                 <w:rFonts w:ascii="Arial" w:hAnsi="Arial" w:eastAsia="Arial"/>
                 <w:b/>
                 <w:color w:val="FFFFFF"/>
-                <w:sz w:val="20"/>
+                <w:sz w:val="18"/>
               </w:rPr>
-              <w:t>Время</w:t>
+              <w:t>Наименование</w:t>
             </w:r>
           </w:p>
         </w:tc>
         <w:tc>
           <w:tcPr>
-            <w:tcW w:type="dxa" w:w="4986"/>
-            <w:shd w:fill="C41E3A" w:val="clear"/>
+            <w:tcW w:type="dxa" w:w="2635"/>
+            <w:shd w:fill="1F4E79" w:val="clear"/>
           </w:tcPr>
           <w:p>
             <w:r>
@@ -315,478 +91,16 @@
                 <w:rFonts w:ascii="Arial" w:hAnsi="Arial" w:eastAsia="Arial"/>
                 <w:b/>
                 <w:color w:val="FFFFFF"/>
-                <w:sz w:val="20"/>
+                <w:sz w:val="18"/>
               </w:rPr>
-              <w:t>Активность</w:t>
-            </w:r>
-          </w:p>
-        </w:tc>
-      </w:tr>
-      <w:tr>
-        <w:tc>
-          <w:tcPr>
-            <w:tcW w:type="dxa" w:w="4986"/>
-          </w:tcPr>
-          <w:p>
-            <w:r/>
-            <w:r>
-              <w:rPr>
-                <w:rFonts w:ascii="Arial" w:hAnsi="Arial" w:eastAsia="Arial"/>
-                <w:b/>
-                <w:sz w:val="20"/>
-              </w:rPr>
-              <w:t>10:00–11:00</w:t>
+              <w:t>Описание</w:t>
             </w:r>
           </w:p>
         </w:tc>
         <w:tc>
           <w:tcPr>
-            <w:tcW w:type="dxa" w:w="4986"/>
-          </w:tcPr>
-          <w:p>
-            <w:r/>
-            <w:r>
-              <w:rPr>
-                <w:rFonts w:ascii="Arial" w:hAnsi="Arial" w:eastAsia="Arial"/>
-                <w:b w:val="0"/>
-                <w:sz w:val="20"/>
-              </w:rPr>
-              <w:t>Подготовка зоны, проверка техники, брифинг</w:t>
-            </w:r>
-          </w:p>
-        </w:tc>
-      </w:tr>
-      <w:tr>
-        <w:tc>
-          <w:tcPr>
-            <w:tcW w:type="dxa" w:w="4986"/>
-            <w:shd w:fill="F7E8E8" w:val="clear"/>
-          </w:tcPr>
-          <w:p>
-            <w:r/>
-            <w:r>
-              <w:rPr>
-                <w:rFonts w:ascii="Arial" w:hAnsi="Arial" w:eastAsia="Arial"/>
-                <w:b/>
-                <w:sz w:val="20"/>
-              </w:rPr>
-              <w:t>11:00</w:t>
-            </w:r>
-          </w:p>
-        </w:tc>
-        <w:tc>
-          <w:tcPr>
-            <w:tcW w:type="dxa" w:w="4986"/>
-            <w:shd w:fill="F7E8E8" w:val="clear"/>
-          </w:tcPr>
-          <w:p>
-            <w:r/>
-            <w:r>
-              <w:rPr>
-                <w:rFonts w:ascii="Arial" w:hAnsi="Arial" w:eastAsia="Arial"/>
-                <w:b w:val="0"/>
-                <w:sz w:val="20"/>
-              </w:rPr>
-              <w:t>Открытие зоны</w:t>
-            </w:r>
-          </w:p>
-        </w:tc>
-      </w:tr>
-      <w:tr>
-        <w:tc>
-          <w:tcPr>
-            <w:tcW w:type="dxa" w:w="4986"/>
-          </w:tcPr>
-          <w:p>
-            <w:r/>
-            <w:r>
-              <w:rPr>
-                <w:rFonts w:ascii="Arial" w:hAnsi="Arial" w:eastAsia="Arial"/>
-                <w:b/>
-                <w:sz w:val="20"/>
-              </w:rPr>
-              <w:t>12:30</w:t>
-            </w:r>
-          </w:p>
-        </w:tc>
-        <w:tc>
-          <w:tcPr>
-            <w:tcW w:type="dxa" w:w="4986"/>
-          </w:tcPr>
-          <w:p>
-            <w:r/>
-            <w:r>
-              <w:rPr>
-                <w:rFonts w:ascii="Arial" w:hAnsi="Arial" w:eastAsia="Arial"/>
-                <w:b w:val="0"/>
-                <w:sz w:val="20"/>
-              </w:rPr>
-              <w:t>Сверка команд турнира 5×5 и публикация сетки</w:t>
-            </w:r>
-          </w:p>
-        </w:tc>
-      </w:tr>
-      <w:tr>
-        <w:tc>
-          <w:tcPr>
-            <w:tcW w:type="dxa" w:w="4986"/>
-            <w:shd w:fill="F7E8E8" w:val="clear"/>
-          </w:tcPr>
-          <w:p>
-            <w:r/>
-            <w:r>
-              <w:rPr>
-                <w:rFonts w:ascii="Arial" w:hAnsi="Arial" w:eastAsia="Arial"/>
-                <w:b/>
-                <w:sz w:val="20"/>
-              </w:rPr>
-              <w:t>13:00</w:t>
-            </w:r>
-          </w:p>
-        </w:tc>
-        <w:tc>
-          <w:tcPr>
-            <w:tcW w:type="dxa" w:w="4986"/>
-            <w:shd w:fill="F7E8E8" w:val="clear"/>
-          </w:tcPr>
-          <w:p>
-            <w:r/>
-            <w:r>
-              <w:rPr>
-                <w:rFonts w:ascii="Arial" w:hAnsi="Arial" w:eastAsia="Arial"/>
-                <w:b w:val="0"/>
-                <w:sz w:val="20"/>
-              </w:rPr>
-              <w:t>Старт турнира 5×5</w:t>
-            </w:r>
-          </w:p>
-        </w:tc>
-      </w:tr>
-      <w:tr>
-        <w:tc>
-          <w:tcPr>
-            <w:tcW w:type="dxa" w:w="4986"/>
-          </w:tcPr>
-          <w:p>
-            <w:r/>
-            <w:r>
-              <w:rPr>
-                <w:rFonts w:ascii="Arial" w:hAnsi="Arial" w:eastAsia="Arial"/>
-                <w:b/>
-                <w:sz w:val="20"/>
-              </w:rPr>
-              <w:t>14:30</w:t>
-            </w:r>
-          </w:p>
-        </w:tc>
-        <w:tc>
-          <w:tcPr>
-            <w:tcW w:type="dxa" w:w="4986"/>
-          </w:tcPr>
-          <w:p>
-            <w:r/>
-            <w:r>
-              <w:rPr>
-                <w:rFonts w:ascii="Arial" w:hAnsi="Arial" w:eastAsia="Arial"/>
-                <w:b w:val="0"/>
-                <w:sz w:val="20"/>
-              </w:rPr>
-              <w:t>Бинго и викторина</w:t>
-            </w:r>
-          </w:p>
-        </w:tc>
-      </w:tr>
-      <w:tr>
-        <w:tc>
-          <w:tcPr>
-            <w:tcW w:type="dxa" w:w="4986"/>
-            <w:shd w:fill="F7E8E8" w:val="clear"/>
-          </w:tcPr>
-          <w:p>
-            <w:r/>
-            <w:r>
-              <w:rPr>
-                <w:rFonts w:ascii="Arial" w:hAnsi="Arial" w:eastAsia="Arial"/>
-                <w:b/>
-                <w:sz w:val="20"/>
-              </w:rPr>
-              <w:t>15:30</w:t>
-            </w:r>
-          </w:p>
-        </w:tc>
-        <w:tc>
-          <w:tcPr>
-            <w:tcW w:type="dxa" w:w="4986"/>
-            <w:shd w:fill="F7E8E8" w:val="clear"/>
-          </w:tcPr>
-          <w:p>
-            <w:r/>
-            <w:r>
-              <w:rPr>
-                <w:rFonts w:ascii="Arial" w:hAnsi="Arial" w:eastAsia="Arial"/>
-                <w:b w:val="0"/>
-                <w:sz w:val="20"/>
-              </w:rPr>
-              <w:t>Медийный гость на зоне</w:t>
-            </w:r>
-          </w:p>
-        </w:tc>
-      </w:tr>
-      <w:tr>
-        <w:tc>
-          <w:tcPr>
-            <w:tcW w:type="dxa" w:w="4986"/>
-          </w:tcPr>
-          <w:p>
-            <w:r/>
-            <w:r>
-              <w:rPr>
-                <w:rFonts w:ascii="Arial" w:hAnsi="Arial" w:eastAsia="Arial"/>
-                <w:b/>
-                <w:sz w:val="20"/>
-              </w:rPr>
-              <w:t>16:30</w:t>
-            </w:r>
-          </w:p>
-        </w:tc>
-        <w:tc>
-          <w:tcPr>
-            <w:tcW w:type="dxa" w:w="4986"/>
-          </w:tcPr>
-          <w:p>
-            <w:r/>
-            <w:r>
-              <w:rPr>
-                <w:rFonts w:ascii="Arial" w:hAnsi="Arial" w:eastAsia="Arial"/>
-                <w:b w:val="0"/>
-                <w:sz w:val="20"/>
-              </w:rPr>
-              <w:t>Игры на вылет, турнир 5×5</w:t>
-            </w:r>
-          </w:p>
-        </w:tc>
-      </w:tr>
-      <w:tr>
-        <w:tc>
-          <w:tcPr>
-            <w:tcW w:type="dxa" w:w="4986"/>
-            <w:shd w:fill="F7E8E8" w:val="clear"/>
-          </w:tcPr>
-          <w:p>
-            <w:r/>
-            <w:r>
-              <w:rPr>
-                <w:rFonts w:ascii="Arial" w:hAnsi="Arial" w:eastAsia="Arial"/>
-                <w:b/>
-                <w:sz w:val="20"/>
-              </w:rPr>
-              <w:t>18:30</w:t>
-            </w:r>
-          </w:p>
-        </w:tc>
-        <w:tc>
-          <w:tcPr>
-            <w:tcW w:type="dxa" w:w="4986"/>
-            <w:shd w:fill="F7E8E8" w:val="clear"/>
-          </w:tcPr>
-          <w:p>
-            <w:r/>
-            <w:r>
-              <w:rPr>
-                <w:rFonts w:ascii="Arial" w:hAnsi="Arial" w:eastAsia="Arial"/>
-                <w:b w:val="0"/>
-                <w:sz w:val="20"/>
-              </w:rPr>
-              <w:t>Полуфиналы</w:t>
-            </w:r>
-          </w:p>
-        </w:tc>
-      </w:tr>
-      <w:tr>
-        <w:tc>
-          <w:tcPr>
-            <w:tcW w:type="dxa" w:w="4986"/>
-          </w:tcPr>
-          <w:p>
-            <w:r/>
-            <w:r>
-              <w:rPr>
-                <w:rFonts w:ascii="Arial" w:hAnsi="Arial" w:eastAsia="Arial"/>
-                <w:b/>
-                <w:sz w:val="20"/>
-              </w:rPr>
-              <w:t>19:30</w:t>
-            </w:r>
-          </w:p>
-        </w:tc>
-        <w:tc>
-          <w:tcPr>
-            <w:tcW w:type="dxa" w:w="4986"/>
-          </w:tcPr>
-          <w:p>
-            <w:r/>
-            <w:r>
-              <w:rPr>
-                <w:rFonts w:ascii="Arial" w:hAnsi="Arial" w:eastAsia="Arial"/>
-                <w:b w:val="0"/>
-                <w:sz w:val="20"/>
-              </w:rPr>
-              <w:t>Финал</w:t>
-            </w:r>
-          </w:p>
-        </w:tc>
-      </w:tr>
-      <w:tr>
-        <w:tc>
-          <w:tcPr>
-            <w:tcW w:type="dxa" w:w="4986"/>
-            <w:shd w:fill="F7E8E8" w:val="clear"/>
-          </w:tcPr>
-          <w:p>
-            <w:r/>
-            <w:r>
-              <w:rPr>
-                <w:rFonts w:ascii="Arial" w:hAnsi="Arial" w:eastAsia="Arial"/>
-                <w:b/>
-                <w:sz w:val="20"/>
-              </w:rPr>
-              <w:t>20:15</w:t>
-            </w:r>
-          </w:p>
-        </w:tc>
-        <w:tc>
-          <w:tcPr>
-            <w:tcW w:type="dxa" w:w="4986"/>
-            <w:shd w:fill="F7E8E8" w:val="clear"/>
-          </w:tcPr>
-          <w:p>
-            <w:r/>
-            <w:r>
-              <w:rPr>
-                <w:rFonts w:ascii="Arial" w:hAnsi="Arial" w:eastAsia="Arial"/>
-                <w:b w:val="0"/>
-                <w:sz w:val="20"/>
-              </w:rPr>
-              <w:t>Награждение</w:t>
-            </w:r>
-          </w:p>
-        </w:tc>
-      </w:tr>
-      <w:tr>
-        <w:tc>
-          <w:tcPr>
-            <w:tcW w:type="dxa" w:w="4986"/>
-          </w:tcPr>
-          <w:p>
-            <w:r/>
-            <w:r>
-              <w:rPr>
-                <w:rFonts w:ascii="Arial" w:hAnsi="Arial" w:eastAsia="Arial"/>
-                <w:b/>
-                <w:sz w:val="20"/>
-              </w:rPr>
-              <w:t>21:30</w:t>
-            </w:r>
-          </w:p>
-        </w:tc>
-        <w:tc>
-          <w:tcPr>
-            <w:tcW w:type="dxa" w:w="4986"/>
-          </w:tcPr>
-          <w:p>
-            <w:r/>
-            <w:r>
-              <w:rPr>
-                <w:rFonts w:ascii="Arial" w:hAnsi="Arial" w:eastAsia="Arial"/>
-                <w:b w:val="0"/>
-                <w:sz w:val="20"/>
-              </w:rPr>
-              <w:t>Закрытие зоны</w:t>
-            </w:r>
-          </w:p>
-        </w:tc>
-      </w:tr>
-      <w:tr>
-        <w:tc>
-          <w:tcPr>
-            <w:tcW w:type="dxa" w:w="4986"/>
-            <w:shd w:fill="F7E8E8" w:val="clear"/>
-          </w:tcPr>
-          <w:p>
-            <w:r/>
-            <w:r>
-              <w:rPr>
-                <w:rFonts w:ascii="Arial" w:hAnsi="Arial" w:eastAsia="Arial"/>
-                <w:b/>
-                <w:sz w:val="20"/>
-              </w:rPr>
-              <w:t>21:45–22:30</w:t>
-            </w:r>
-          </w:p>
-        </w:tc>
-        <w:tc>
-          <w:tcPr>
-            <w:tcW w:type="dxa" w:w="4986"/>
-            <w:shd w:fill="F7E8E8" w:val="clear"/>
-          </w:tcPr>
-          <w:p>
-            <w:r/>
-            <w:r>
-              <w:rPr>
-                <w:rFonts w:ascii="Arial" w:hAnsi="Arial" w:eastAsia="Arial"/>
-                <w:b w:val="0"/>
-                <w:sz w:val="20"/>
-              </w:rPr>
-              <w:t>Демонтаж</w:t>
-            </w:r>
-          </w:p>
-        </w:tc>
-      </w:tr>
-    </w:tbl>
-    <w:p/>
-    <w:p>
-      <w:pPr>
-        <w:pStyle w:val="Heading1"/>
-      </w:pPr>
-      <w:r>
-        <w:rPr>
-          <w:rFonts w:ascii="Arial" w:hAnsi="Arial" w:eastAsia="Arial"/>
-          <w:b/>
-          <w:color w:val="C41E3A"/>
-          <w:sz w:val="32"/>
-        </w:rPr>
-        <w:t>3. Смета</w:t>
-      </w:r>
-    </w:p>
-    <w:p>
-      <w:pPr>
-        <w:spacing w:after="120"/>
-      </w:pPr>
-      <w:r>
-        <w:rPr>
-          <w:rFonts w:ascii="Arial" w:hAnsi="Arial" w:eastAsia="Arial"/>
-          <w:b w:val="0"/>
-          <w:sz w:val="22"/>
-        </w:rPr>
-        <w:t>Итоговый бюджет зоны: 900 000 ₽ (включая возвращаемый залог за телефоны 40 000 ₽).</w:t>
-      </w:r>
-    </w:p>
-    <w:tbl>
-      <w:tblPr>
-        <w:tblStyle w:val="TableGrid"/>
-        <w:tblW w:type="auto" w:w="0"/>
-        <w:tblLook w:firstColumn="1" w:firstRow="1" w:lastColumn="0" w:lastRow="0" w:noHBand="0" w:noVBand="1" w:val="04A0"/>
-      </w:tblPr>
-      <w:tblGrid>
-        <w:gridCol w:w="3324"/>
-        <w:gridCol w:w="3324"/>
-        <w:gridCol w:w="3324"/>
-      </w:tblGrid>
-      <w:tr>
-        <w:tc>
-          <w:tcPr>
-            <w:tcW w:type="dxa" w:w="3324"/>
-            <w:shd w:fill="C41E3A" w:val="clear"/>
+            <w:tcW w:type="dxa" w:w="2635"/>
+            <w:shd w:fill="1F4E79" w:val="clear"/>
           </w:tcPr>
           <w:p>
             <w:r>
@@ -799,16 +113,16 @@
                 <w:rFonts w:ascii="Arial" w:hAnsi="Arial" w:eastAsia="Arial"/>
                 <w:b/>
                 <w:color w:val="FFFFFF"/>
-                <w:sz w:val="20"/>
+                <w:sz w:val="18"/>
               </w:rPr>
-              <w:t>Статья</w:t>
+              <w:t>Кол-во</w:t>
             </w:r>
           </w:p>
         </w:tc>
         <w:tc>
           <w:tcPr>
-            <w:tcW w:type="dxa" w:w="3324"/>
-            <w:shd w:fill="C41E3A" w:val="clear"/>
+            <w:tcW w:type="dxa" w:w="2635"/>
+            <w:shd w:fill="1F4E79" w:val="clear"/>
           </w:tcPr>
           <w:p>
             <w:r>
@@ -821,16 +135,18 @@
                 <w:rFonts w:ascii="Arial" w:hAnsi="Arial" w:eastAsia="Arial"/>
                 <w:b/>
                 <w:color w:val="FFFFFF"/>
-                <w:sz w:val="20"/>
+                <w:sz w:val="18"/>
               </w:rPr>
-              <w:t>Комментарий</w:t>
+              <w:t>Стоимость, ₽</w:t>
             </w:r>
           </w:p>
         </w:tc>
+      </w:tr>
+      <w:tr>
         <w:tc>
           <w:tcPr>
-            <w:tcW w:type="dxa" w:w="3324"/>
-            <w:shd w:fill="C41E3A" w:val="clear"/>
+            <w:tcW w:type="dxa" w:w="2635"/>
+            <w:shd w:fill="2E75B6" w:val="clear"/>
           </w:tcPr>
           <w:p>
             <w:r>
@@ -843,33 +159,38 @@
                 <w:rFonts w:ascii="Arial" w:hAnsi="Arial" w:eastAsia="Arial"/>
                 <w:b/>
                 <w:color w:val="FFFFFF"/>
-                <w:sz w:val="20"/>
+                <w:sz w:val="18"/>
               </w:rPr>
-              <w:t>Сумма, ₽</w:t>
+              <w:t>1. Аренда локаций</w:t>
             </w:r>
           </w:p>
+        </w:tc>
+        <w:tc>
+          <w:tcPr>
+            <w:tcW w:type="dxa" w:w="2635"/>
+            <w:shd w:fill="2E75B6" w:val="clear"/>
+          </w:tcPr>
+          <w:p/>
+        </w:tc>
+        <w:tc>
+          <w:tcPr>
+            <w:tcW w:type="dxa" w:w="2635"/>
+            <w:shd w:fill="2E75B6" w:val="clear"/>
+          </w:tcPr>
+          <w:p/>
+        </w:tc>
+        <w:tc>
+          <w:tcPr>
+            <w:tcW w:type="dxa" w:w="2635"/>
+            <w:shd w:fill="2E75B6" w:val="clear"/>
+          </w:tcPr>
+          <w:p/>
         </w:tc>
       </w:tr>
       <w:tr>
         <w:tc>
           <w:tcPr>
-            <w:tcW w:type="dxa" w:w="3324"/>
-          </w:tcPr>
-          <w:p>
-            <w:r/>
-            <w:r>
-              <w:rPr>
-                <w:rFonts w:ascii="Arial" w:hAnsi="Arial" w:eastAsia="Arial"/>
-                <w:b w:val="0"/>
-                <w:sz w:val="20"/>
-              </w:rPr>
-              <w:t>Косплееры Mobile Legends (2 чел.)</w:t>
-            </w:r>
-          </w:p>
-        </w:tc>
-        <w:tc>
-          <w:tcPr>
-            <w:tcW w:type="dxa" w:w="3324"/>
+            <w:tcW w:type="dxa" w:w="2635"/>
           </w:tcPr>
           <w:p>
             <w:r/>
@@ -879,13 +200,13 @@
                 <w:b w:val="0"/>
                 <w:sz w:val="18"/>
               </w:rPr>
-              <w:t>фото весь день</w:t>
+              <w:t>1. Аренда площадки</w:t>
             </w:r>
           </w:p>
         </w:tc>
         <w:tc>
           <w:tcPr>
-            <w:tcW w:type="dxa" w:w="3324"/>
+            <w:tcW w:type="dxa" w:w="2635"/>
           </w:tcPr>
           <w:p>
             <w:r/>
@@ -893,35 +214,15 @@
               <w:rPr>
                 <w:rFonts w:ascii="Arial" w:hAnsi="Arial" w:eastAsia="Arial"/>
                 <w:b w:val="0"/>
-                <w:sz w:val="20"/>
+                <w:sz w:val="16"/>
               </w:rPr>
-              <w:t>90 000</w:t>
-            </w:r>
-          </w:p>
-        </w:tc>
-      </w:tr>
-      <w:tr>
-        <w:tc>
-          <w:tcPr>
-            <w:tcW w:type="dxa" w:w="3324"/>
-            <w:shd w:fill="F7E8E8" w:val="clear"/>
-          </w:tcPr>
-          <w:p>
-            <w:r/>
-            <w:r>
-              <w:rPr>
-                <w:rFonts w:ascii="Arial" w:hAnsi="Arial" w:eastAsia="Arial"/>
-                <w:b w:val="0"/>
-                <w:sz w:val="20"/>
-              </w:rPr>
-              <w:t>Косплеерша Genshin Impact (1 чел.)</w:t>
+              <w:t>День мероприятия</w:t>
             </w:r>
           </w:p>
         </w:tc>
         <w:tc>
           <w:tcPr>
-            <w:tcW w:type="dxa" w:w="3324"/>
-            <w:shd w:fill="F7E8E8" w:val="clear"/>
+            <w:tcW w:type="dxa" w:w="2635"/>
           </w:tcPr>
           <w:p>
             <w:r/>
@@ -931,48 +232,13 @@
                 <w:b w:val="0"/>
                 <w:sz w:val="18"/>
               </w:rPr>
-              <w:t>фото весь день</w:t>
+              <w:t>1 сутки</w:t>
             </w:r>
           </w:p>
         </w:tc>
         <w:tc>
           <w:tcPr>
-            <w:tcW w:type="dxa" w:w="3324"/>
-            <w:shd w:fill="F7E8E8" w:val="clear"/>
-          </w:tcPr>
-          <w:p>
-            <w:r/>
-            <w:r>
-              <w:rPr>
-                <w:rFonts w:ascii="Arial" w:hAnsi="Arial" w:eastAsia="Arial"/>
-                <w:b w:val="0"/>
-                <w:sz w:val="20"/>
-              </w:rPr>
-              <w:t>50 000</w:t>
-            </w:r>
-          </w:p>
-        </w:tc>
-      </w:tr>
-      <w:tr>
-        <w:tc>
-          <w:tcPr>
-            <w:tcW w:type="dxa" w:w="3324"/>
-          </w:tcPr>
-          <w:p>
-            <w:r/>
-            <w:r>
-              <w:rPr>
-                <w:rFonts w:ascii="Arial" w:hAnsi="Arial" w:eastAsia="Arial"/>
-                <w:b w:val="0"/>
-                <w:sz w:val="20"/>
-              </w:rPr>
-              <w:t>Фотозона Mobile Legends 3×2 м</w:t>
-            </w:r>
-          </w:p>
-        </w:tc>
-        <w:tc>
-          <w:tcPr>
-            <w:tcW w:type="dxa" w:w="3324"/>
+            <w:tcW w:type="dxa" w:w="2635"/>
           </w:tcPr>
           <w:p>
             <w:r/>
@@ -982,23 +248,7 @@
                 <w:b w:val="0"/>
                 <w:sz w:val="18"/>
               </w:rPr>
-              <w:t>каркас, печать, монтаж</w:t>
-            </w:r>
-          </w:p>
-        </w:tc>
-        <w:tc>
-          <w:tcPr>
-            <w:tcW w:type="dxa" w:w="3324"/>
-          </w:tcPr>
-          <w:p>
-            <w:r/>
-            <w:r>
-              <w:rPr>
-                <w:rFonts w:ascii="Arial" w:hAnsi="Arial" w:eastAsia="Arial"/>
-                <w:b w:val="0"/>
-                <w:sz w:val="20"/>
-              </w:rPr>
-              <w:t>45 000</w:t>
+              <w:t>348 000</w:t>
             </w:r>
           </w:p>
         </w:tc>
@@ -1006,52 +256,49 @@
       <w:tr>
         <w:tc>
           <w:tcPr>
-            <w:tcW w:type="dxa" w:w="3324"/>
-            <w:shd w:fill="F7E8E8" w:val="clear"/>
+            <w:tcW w:type="dxa" w:w="2635"/>
+            <w:shd w:fill="D6EAF8" w:val="clear"/>
           </w:tcPr>
           <w:p>
             <w:r/>
             <w:r>
               <w:rPr>
                 <w:rFonts w:ascii="Arial" w:hAnsi="Arial" w:eastAsia="Arial"/>
-                <w:b w:val="0"/>
-                <w:sz w:val="20"/>
+                <w:b/>
+                <w:sz w:val="18"/>
               </w:rPr>
-              <w:t>Декор зоны Genshin Impact</w:t>
+              <w:t>Итого: 1. Аренда локаций</w:t>
             </w:r>
           </w:p>
         </w:tc>
         <w:tc>
           <w:tcPr>
-            <w:tcW w:type="dxa" w:w="3324"/>
-            <w:shd w:fill="F7E8E8" w:val="clear"/>
+            <w:tcW w:type="dxa" w:w="2635"/>
+            <w:shd w:fill="D6EAF8" w:val="clear"/>
+          </w:tcPr>
+          <w:p/>
+        </w:tc>
+        <w:tc>
+          <w:tcPr>
+            <w:tcW w:type="dxa" w:w="2635"/>
+            <w:shd w:fill="D6EAF8" w:val="clear"/>
+          </w:tcPr>
+          <w:p/>
+        </w:tc>
+        <w:tc>
+          <w:tcPr>
+            <w:tcW w:type="dxa" w:w="2635"/>
+            <w:shd w:fill="D6EAF8" w:val="clear"/>
           </w:tcPr>
           <w:p>
             <w:r/>
             <w:r>
               <w:rPr>
                 <w:rFonts w:ascii="Arial" w:hAnsi="Arial" w:eastAsia="Arial"/>
-                <w:b w:val="0"/>
+                <w:b/>
                 <w:sz w:val="18"/>
               </w:rPr>
-              <w:t>панели, ткань, фонари, фотофон</w:t>
-            </w:r>
-          </w:p>
-        </w:tc>
-        <w:tc>
-          <w:tcPr>
-            <w:tcW w:type="dxa" w:w="3324"/>
-            <w:shd w:fill="F7E8E8" w:val="clear"/>
-          </w:tcPr>
-          <w:p>
-            <w:r/>
-            <w:r>
-              <w:rPr>
-                <w:rFonts w:ascii="Arial" w:hAnsi="Arial" w:eastAsia="Arial"/>
-                <w:b w:val="0"/>
-                <w:sz w:val="20"/>
-              </w:rPr>
-              <w:t>70 000</w:t>
+              <w:t>348 000</w:t>
             </w:r>
           </w:p>
         </w:tc>
@@ -1059,748 +306,8 @@
       <w:tr>
         <w:tc>
           <w:tcPr>
-            <w:tcW w:type="dxa" w:w="3324"/>
-          </w:tcPr>
-          <w:p>
-            <w:r/>
-            <w:r>
-              <w:rPr>
-                <w:rFonts w:ascii="Arial" w:hAnsi="Arial" w:eastAsia="Arial"/>
-                <w:b w:val="0"/>
-                <w:sz w:val="20"/>
-              </w:rPr>
-              <w:t>Декор под Китайский Новый год</w:t>
-            </w:r>
-          </w:p>
-        </w:tc>
-        <w:tc>
-          <w:tcPr>
-            <w:tcW w:type="dxa" w:w="3324"/>
-          </w:tcPr>
-          <w:p>
-            <w:r/>
-            <w:r>
-              <w:rPr>
-                <w:rFonts w:ascii="Arial" w:hAnsi="Arial" w:eastAsia="Arial"/>
-                <w:b w:val="0"/>
-                <w:sz w:val="18"/>
-              </w:rPr>
-              <w:t>зона Mobile Legends и проходы</w:t>
-            </w:r>
-          </w:p>
-        </w:tc>
-        <w:tc>
-          <w:tcPr>
-            <w:tcW w:type="dxa" w:w="3324"/>
-          </w:tcPr>
-          <w:p>
-            <w:r/>
-            <w:r>
-              <w:rPr>
-                <w:rFonts w:ascii="Arial" w:hAnsi="Arial" w:eastAsia="Arial"/>
-                <w:b w:val="0"/>
-                <w:sz w:val="20"/>
-              </w:rPr>
-              <w:t>100 000</w:t>
-            </w:r>
-          </w:p>
-        </w:tc>
-      </w:tr>
-      <w:tr>
-        <w:tc>
-          <w:tcPr>
-            <w:tcW w:type="dxa" w:w="3324"/>
-            <w:shd w:fill="F7E8E8" w:val="clear"/>
-          </w:tcPr>
-          <w:p>
-            <w:r/>
-            <w:r>
-              <w:rPr>
-                <w:rFonts w:ascii="Arial" w:hAnsi="Arial" w:eastAsia="Arial"/>
-                <w:b w:val="0"/>
-                <w:sz w:val="20"/>
-              </w:rPr>
-              <w:t>Доставка в Сколково</w:t>
-            </w:r>
-          </w:p>
-        </w:tc>
-        <w:tc>
-          <w:tcPr>
-            <w:tcW w:type="dxa" w:w="3324"/>
-            <w:shd w:fill="F7E8E8" w:val="clear"/>
-          </w:tcPr>
-          <w:p>
-            <w:r/>
-            <w:r>
-              <w:rPr>
-                <w:rFonts w:ascii="Arial" w:hAnsi="Arial" w:eastAsia="Arial"/>
-                <w:b w:val="0"/>
-                <w:sz w:val="18"/>
-              </w:rPr>
-              <w:t>декор и техника, 2 рейса</w:t>
-            </w:r>
-          </w:p>
-        </w:tc>
-        <w:tc>
-          <w:tcPr>
-            <w:tcW w:type="dxa" w:w="3324"/>
-            <w:shd w:fill="F7E8E8" w:val="clear"/>
-          </w:tcPr>
-          <w:p>
-            <w:r/>
-            <w:r>
-              <w:rPr>
-                <w:rFonts w:ascii="Arial" w:hAnsi="Arial" w:eastAsia="Arial"/>
-                <w:b w:val="0"/>
-                <w:sz w:val="20"/>
-              </w:rPr>
-              <w:t>25 000</w:t>
-            </w:r>
-          </w:p>
-        </w:tc>
-      </w:tr>
-      <w:tr>
-        <w:tc>
-          <w:tcPr>
-            <w:tcW w:type="dxa" w:w="3324"/>
-          </w:tcPr>
-          <w:p>
-            <w:r/>
-            <w:r>
-              <w:rPr>
-                <w:rFonts w:ascii="Arial" w:hAnsi="Arial" w:eastAsia="Arial"/>
-                <w:b w:val="0"/>
-                <w:sz w:val="20"/>
-              </w:rPr>
-              <w:t>Ведущий</w:t>
-            </w:r>
-          </w:p>
-        </w:tc>
-        <w:tc>
-          <w:tcPr>
-            <w:tcW w:type="dxa" w:w="3324"/>
-          </w:tcPr>
-          <w:p>
-            <w:r/>
-            <w:r>
-              <w:rPr>
-                <w:rFonts w:ascii="Arial" w:hAnsi="Arial" w:eastAsia="Arial"/>
-                <w:b w:val="0"/>
-                <w:sz w:val="18"/>
-              </w:rPr>
-              <w:t>около 10 часов</w:t>
-            </w:r>
-          </w:p>
-        </w:tc>
-        <w:tc>
-          <w:tcPr>
-            <w:tcW w:type="dxa" w:w="3324"/>
-          </w:tcPr>
-          <w:p>
-            <w:r/>
-            <w:r>
-              <w:rPr>
-                <w:rFonts w:ascii="Arial" w:hAnsi="Arial" w:eastAsia="Arial"/>
-                <w:b w:val="0"/>
-                <w:sz w:val="20"/>
-              </w:rPr>
-              <w:t>80 000</w:t>
-            </w:r>
-          </w:p>
-        </w:tc>
-      </w:tr>
-      <w:tr>
-        <w:tc>
-          <w:tcPr>
-            <w:tcW w:type="dxa" w:w="3324"/>
-            <w:shd w:fill="F7E8E8" w:val="clear"/>
-          </w:tcPr>
-          <w:p>
-            <w:r/>
-            <w:r>
-              <w:rPr>
-                <w:rFonts w:ascii="Arial" w:hAnsi="Arial" w:eastAsia="Arial"/>
-                <w:b w:val="0"/>
-                <w:sz w:val="20"/>
-              </w:rPr>
-              <w:t>Алмазы Mobile Legends 15 000 шт.</w:t>
-            </w:r>
-          </w:p>
-        </w:tc>
-        <w:tc>
-          <w:tcPr>
-            <w:tcW w:type="dxa" w:w="3324"/>
-            <w:shd w:fill="F7E8E8" w:val="clear"/>
-          </w:tcPr>
-          <w:p>
-            <w:r/>
-            <w:r>
-              <w:rPr>
-                <w:rFonts w:ascii="Arial" w:hAnsi="Arial" w:eastAsia="Arial"/>
-                <w:b w:val="0"/>
-                <w:sz w:val="18"/>
-              </w:rPr>
-              <w:t>призы</w:t>
-            </w:r>
-          </w:p>
-        </w:tc>
-        <w:tc>
-          <w:tcPr>
-            <w:tcW w:type="dxa" w:w="3324"/>
-            <w:shd w:fill="F7E8E8" w:val="clear"/>
-          </w:tcPr>
-          <w:p>
-            <w:r/>
-            <w:r>
-              <w:rPr>
-                <w:rFonts w:ascii="Arial" w:hAnsi="Arial" w:eastAsia="Arial"/>
-                <w:b w:val="0"/>
-                <w:sz w:val="20"/>
-              </w:rPr>
-              <w:t>24 150</w:t>
-            </w:r>
-          </w:p>
-        </w:tc>
-      </w:tr>
-      <w:tr>
-        <w:tc>
-          <w:tcPr>
-            <w:tcW w:type="dxa" w:w="3324"/>
-          </w:tcPr>
-          <w:p>
-            <w:r/>
-            <w:r>
-              <w:rPr>
-                <w:rFonts w:ascii="Arial" w:hAnsi="Arial" w:eastAsia="Arial"/>
-                <w:b w:val="0"/>
-                <w:sz w:val="20"/>
-              </w:rPr>
-              <w:t>Денежный приз турнира 5×5</w:t>
-            </w:r>
-          </w:p>
-        </w:tc>
-        <w:tc>
-          <w:tcPr>
-            <w:tcW w:type="dxa" w:w="3324"/>
-          </w:tcPr>
-          <w:p>
-            <w:r/>
-            <w:r>
-              <w:rPr>
-                <w:rFonts w:ascii="Arial" w:hAnsi="Arial" w:eastAsia="Arial"/>
-                <w:b w:val="0"/>
-                <w:sz w:val="18"/>
-              </w:rPr>
-            </w:r>
-          </w:p>
-        </w:tc>
-        <w:tc>
-          <w:tcPr>
-            <w:tcW w:type="dxa" w:w="3324"/>
-          </w:tcPr>
-          <w:p>
-            <w:r/>
-            <w:r>
-              <w:rPr>
-                <w:rFonts w:ascii="Arial" w:hAnsi="Arial" w:eastAsia="Arial"/>
-                <w:b w:val="0"/>
-                <w:sz w:val="20"/>
-              </w:rPr>
-              <w:t>50 000</w:t>
-            </w:r>
-          </w:p>
-        </w:tc>
-      </w:tr>
-      <w:tr>
-        <w:tc>
-          <w:tcPr>
-            <w:tcW w:type="dxa" w:w="3324"/>
-            <w:shd w:fill="F7E8E8" w:val="clear"/>
-          </w:tcPr>
-          <w:p>
-            <w:r/>
-            <w:r>
-              <w:rPr>
-                <w:rFonts w:ascii="Arial" w:hAnsi="Arial" w:eastAsia="Arial"/>
-                <w:b w:val="0"/>
-                <w:sz w:val="20"/>
-              </w:rPr>
-              <w:t>Бинго и расходники</w:t>
-            </w:r>
-          </w:p>
-        </w:tc>
-        <w:tc>
-          <w:tcPr>
-            <w:tcW w:type="dxa" w:w="3324"/>
-            <w:shd w:fill="F7E8E8" w:val="clear"/>
-          </w:tcPr>
-          <w:p>
-            <w:r/>
-            <w:r>
-              <w:rPr>
-                <w:rFonts w:ascii="Arial" w:hAnsi="Arial" w:eastAsia="Arial"/>
-                <w:b w:val="0"/>
-                <w:sz w:val="18"/>
-              </w:rPr>
-            </w:r>
-          </w:p>
-        </w:tc>
-        <w:tc>
-          <w:tcPr>
-            <w:tcW w:type="dxa" w:w="3324"/>
-            <w:shd w:fill="F7E8E8" w:val="clear"/>
-          </w:tcPr>
-          <w:p>
-            <w:r/>
-            <w:r>
-              <w:rPr>
-                <w:rFonts w:ascii="Arial" w:hAnsi="Arial" w:eastAsia="Arial"/>
-                <w:b w:val="0"/>
-                <w:sz w:val="20"/>
-              </w:rPr>
-              <w:t>25 000</w:t>
-            </w:r>
-          </w:p>
-        </w:tc>
-      </w:tr>
-      <w:tr>
-        <w:tc>
-          <w:tcPr>
-            <w:tcW w:type="dxa" w:w="3324"/>
-          </w:tcPr>
-          <w:p>
-            <w:r/>
-            <w:r>
-              <w:rPr>
-                <w:rFonts w:ascii="Arial" w:hAnsi="Arial" w:eastAsia="Arial"/>
-                <w:b w:val="0"/>
-                <w:sz w:val="20"/>
-              </w:rPr>
-              <w:t>Покупки в Genshin Impact для зоны</w:t>
-            </w:r>
-          </w:p>
-        </w:tc>
-        <w:tc>
-          <w:tcPr>
-            <w:tcW w:type="dxa" w:w="3324"/>
-          </w:tcPr>
-          <w:p>
-            <w:r/>
-            <w:r>
-              <w:rPr>
-                <w:rFonts w:ascii="Arial" w:hAnsi="Arial" w:eastAsia="Arial"/>
-                <w:b w:val="0"/>
-                <w:sz w:val="18"/>
-              </w:rPr>
-              <w:t>валюта и оформление</w:t>
-            </w:r>
-          </w:p>
-        </w:tc>
-        <w:tc>
-          <w:tcPr>
-            <w:tcW w:type="dxa" w:w="3324"/>
-          </w:tcPr>
-          <w:p>
-            <w:r/>
-            <w:r>
-              <w:rPr>
-                <w:rFonts w:ascii="Arial" w:hAnsi="Arial" w:eastAsia="Arial"/>
-                <w:b w:val="0"/>
-                <w:sz w:val="20"/>
-              </w:rPr>
-              <w:t>12 000</w:t>
-            </w:r>
-          </w:p>
-        </w:tc>
-      </w:tr>
-      <w:tr>
-        <w:tc>
-          <w:tcPr>
-            <w:tcW w:type="dxa" w:w="3324"/>
-            <w:shd w:fill="F7E8E8" w:val="clear"/>
-          </w:tcPr>
-          <w:p>
-            <w:r/>
-            <w:r>
-              <w:rPr>
-                <w:rFonts w:ascii="Arial" w:hAnsi="Arial" w:eastAsia="Arial"/>
-                <w:b w:val="0"/>
-                <w:sz w:val="20"/>
-              </w:rPr>
-              <w:t>Зарядка для телефонов</w:t>
-            </w:r>
-          </w:p>
-        </w:tc>
-        <w:tc>
-          <w:tcPr>
-            <w:tcW w:type="dxa" w:w="3324"/>
-            <w:shd w:fill="F7E8E8" w:val="clear"/>
-          </w:tcPr>
-          <w:p>
-            <w:r/>
-            <w:r>
-              <w:rPr>
-                <w:rFonts w:ascii="Arial" w:hAnsi="Arial" w:eastAsia="Arial"/>
-                <w:b w:val="0"/>
-                <w:sz w:val="18"/>
-              </w:rPr>
-            </w:r>
-          </w:p>
-        </w:tc>
-        <w:tc>
-          <w:tcPr>
-            <w:tcW w:type="dxa" w:w="3324"/>
-            <w:shd w:fill="F7E8E8" w:val="clear"/>
-          </w:tcPr>
-          <w:p>
-            <w:r/>
-            <w:r>
-              <w:rPr>
-                <w:rFonts w:ascii="Arial" w:hAnsi="Arial" w:eastAsia="Arial"/>
-                <w:b w:val="0"/>
-                <w:sz w:val="20"/>
-              </w:rPr>
-              <w:t>20 000</w:t>
-            </w:r>
-          </w:p>
-        </w:tc>
-      </w:tr>
-      <w:tr>
-        <w:tc>
-          <w:tcPr>
-            <w:tcW w:type="dxa" w:w="3324"/>
-          </w:tcPr>
-          <w:p>
-            <w:r/>
-            <w:r>
-              <w:rPr>
-                <w:rFonts w:ascii="Arial" w:hAnsi="Arial" w:eastAsia="Arial"/>
-                <w:b w:val="0"/>
-                <w:sz w:val="20"/>
-              </w:rPr>
-              <w:t>Аренда 14 смартфонов</w:t>
-            </w:r>
-          </w:p>
-        </w:tc>
-        <w:tc>
-          <w:tcPr>
-            <w:tcW w:type="dxa" w:w="3324"/>
-          </w:tcPr>
-          <w:p>
-            <w:r/>
-            <w:r>
-              <w:rPr>
-                <w:rFonts w:ascii="Arial" w:hAnsi="Arial" w:eastAsia="Arial"/>
-                <w:b w:val="0"/>
-                <w:sz w:val="18"/>
-              </w:rPr>
-              <w:t>2 суток, с резервом</w:t>
-            </w:r>
-          </w:p>
-        </w:tc>
-        <w:tc>
-          <w:tcPr>
-            <w:tcW w:type="dxa" w:w="3324"/>
-          </w:tcPr>
-          <w:p>
-            <w:r/>
-            <w:r>
-              <w:rPr>
-                <w:rFonts w:ascii="Arial" w:hAnsi="Arial" w:eastAsia="Arial"/>
-                <w:b w:val="0"/>
-                <w:sz w:val="20"/>
-              </w:rPr>
-              <w:t>15 900</w:t>
-            </w:r>
-          </w:p>
-        </w:tc>
-      </w:tr>
-      <w:tr>
-        <w:tc>
-          <w:tcPr>
-            <w:tcW w:type="dxa" w:w="3324"/>
-            <w:shd w:fill="F7E8E8" w:val="clear"/>
-          </w:tcPr>
-          <w:p>
-            <w:r/>
-            <w:r>
-              <w:rPr>
-                <w:rFonts w:ascii="Arial" w:hAnsi="Arial" w:eastAsia="Arial"/>
-                <w:b w:val="0"/>
-                <w:sz w:val="20"/>
-              </w:rPr>
-              <w:t>Залог за телефоны</w:t>
-            </w:r>
-          </w:p>
-        </w:tc>
-        <w:tc>
-          <w:tcPr>
-            <w:tcW w:type="dxa" w:w="3324"/>
-            <w:shd w:fill="F7E8E8" w:val="clear"/>
-          </w:tcPr>
-          <w:p>
-            <w:r/>
-            <w:r>
-              <w:rPr>
-                <w:rFonts w:ascii="Arial" w:hAnsi="Arial" w:eastAsia="Arial"/>
-                <w:b w:val="0"/>
-                <w:sz w:val="18"/>
-              </w:rPr>
-              <w:t>возвращается</w:t>
-            </w:r>
-          </w:p>
-        </w:tc>
-        <w:tc>
-          <w:tcPr>
-            <w:tcW w:type="dxa" w:w="3324"/>
-            <w:shd w:fill="F7E8E8" w:val="clear"/>
-          </w:tcPr>
-          <w:p>
-            <w:r/>
-            <w:r>
-              <w:rPr>
-                <w:rFonts w:ascii="Arial" w:hAnsi="Arial" w:eastAsia="Arial"/>
-                <w:b w:val="0"/>
-                <w:sz w:val="20"/>
-              </w:rPr>
-              <w:t>40 000</w:t>
-            </w:r>
-          </w:p>
-        </w:tc>
-      </w:tr>
-      <w:tr>
-        <w:tc>
-          <w:tcPr>
-            <w:tcW w:type="dxa" w:w="3324"/>
-          </w:tcPr>
-          <w:p>
-            <w:r/>
-            <w:r>
-              <w:rPr>
-                <w:rFonts w:ascii="Arial" w:hAnsi="Arial" w:eastAsia="Arial"/>
-                <w:b w:val="0"/>
-                <w:sz w:val="20"/>
-              </w:rPr>
-              <w:t>Медийный гость</w:t>
-            </w:r>
-          </w:p>
-        </w:tc>
-        <w:tc>
-          <w:tcPr>
-            <w:tcW w:type="dxa" w:w="3324"/>
-          </w:tcPr>
-          <w:p>
-            <w:r/>
-            <w:r>
-              <w:rPr>
-                <w:rFonts w:ascii="Arial" w:hAnsi="Arial" w:eastAsia="Arial"/>
-                <w:b w:val="0"/>
-                <w:sz w:val="18"/>
-              </w:rPr>
-            </w:r>
-          </w:p>
-        </w:tc>
-        <w:tc>
-          <w:tcPr>
-            <w:tcW w:type="dxa" w:w="3324"/>
-          </w:tcPr>
-          <w:p>
-            <w:r/>
-            <w:r>
-              <w:rPr>
-                <w:rFonts w:ascii="Arial" w:hAnsi="Arial" w:eastAsia="Arial"/>
-                <w:b w:val="0"/>
-                <w:sz w:val="20"/>
-              </w:rPr>
-              <w:t>110 000</w:t>
-            </w:r>
-          </w:p>
-        </w:tc>
-      </w:tr>
-      <w:tr>
-        <w:tc>
-          <w:tcPr>
-            <w:tcW w:type="dxa" w:w="3324"/>
-            <w:shd w:fill="F7E8E8" w:val="clear"/>
-          </w:tcPr>
-          <w:p>
-            <w:r/>
-            <w:r>
-              <w:rPr>
-                <w:rFonts w:ascii="Arial" w:hAnsi="Arial" w:eastAsia="Arial"/>
-                <w:b w:val="0"/>
-                <w:sz w:val="20"/>
-              </w:rPr>
-              <w:t>Монтаж и демонтаж зон</w:t>
-            </w:r>
-          </w:p>
-        </w:tc>
-        <w:tc>
-          <w:tcPr>
-            <w:tcW w:type="dxa" w:w="3324"/>
-            <w:shd w:fill="F7E8E8" w:val="clear"/>
-          </w:tcPr>
-          <w:p>
-            <w:r/>
-            <w:r>
-              <w:rPr>
-                <w:rFonts w:ascii="Arial" w:hAnsi="Arial" w:eastAsia="Arial"/>
-                <w:b w:val="0"/>
-                <w:sz w:val="18"/>
-              </w:rPr>
-            </w:r>
-          </w:p>
-        </w:tc>
-        <w:tc>
-          <w:tcPr>
-            <w:tcW w:type="dxa" w:w="3324"/>
-            <w:shd w:fill="F7E8E8" w:val="clear"/>
-          </w:tcPr>
-          <w:p>
-            <w:r/>
-            <w:r>
-              <w:rPr>
-                <w:rFonts w:ascii="Arial" w:hAnsi="Arial" w:eastAsia="Arial"/>
-                <w:b w:val="0"/>
-                <w:sz w:val="20"/>
-              </w:rPr>
-              <w:t>70 000</w:t>
-            </w:r>
-          </w:p>
-        </w:tc>
-      </w:tr>
-      <w:tr>
-        <w:tc>
-          <w:tcPr>
-            <w:tcW w:type="dxa" w:w="3324"/>
-          </w:tcPr>
-          <w:p>
-            <w:r/>
-            <w:r>
-              <w:rPr>
-                <w:rFonts w:ascii="Arial" w:hAnsi="Arial" w:eastAsia="Arial"/>
-                <w:b w:val="0"/>
-                <w:sz w:val="20"/>
-              </w:rPr>
-              <w:t>Запас на непредвиденное</w:t>
-            </w:r>
-          </w:p>
-        </w:tc>
-        <w:tc>
-          <w:tcPr>
-            <w:tcW w:type="dxa" w:w="3324"/>
-          </w:tcPr>
-          <w:p>
-            <w:r/>
-            <w:r>
-              <w:rPr>
-                <w:rFonts w:ascii="Arial" w:hAnsi="Arial" w:eastAsia="Arial"/>
-                <w:b w:val="0"/>
-                <w:sz w:val="18"/>
-              </w:rPr>
-            </w:r>
-          </w:p>
-        </w:tc>
-        <w:tc>
-          <w:tcPr>
-            <w:tcW w:type="dxa" w:w="3324"/>
-          </w:tcPr>
-          <w:p>
-            <w:r/>
-            <w:r>
-              <w:rPr>
-                <w:rFonts w:ascii="Arial" w:hAnsi="Arial" w:eastAsia="Arial"/>
-                <w:b w:val="0"/>
-                <w:sz w:val="20"/>
-              </w:rPr>
-              <w:t>72 950</w:t>
-            </w:r>
-          </w:p>
-        </w:tc>
-      </w:tr>
-      <w:tr>
-        <w:tc>
-          <w:tcPr>
-            <w:tcW w:type="dxa" w:w="3324"/>
-            <w:shd w:fill="F0C14B" w:val="clear"/>
-          </w:tcPr>
-          <w:p>
-            <w:r/>
-            <w:r>
-              <w:rPr>
-                <w:rFonts w:ascii="Arial" w:hAnsi="Arial" w:eastAsia="Arial"/>
-                <w:b/>
-                <w:sz w:val="20"/>
-              </w:rPr>
-              <w:t>Итого</w:t>
-            </w:r>
-          </w:p>
-        </w:tc>
-        <w:tc>
-          <w:tcPr>
-            <w:tcW w:type="dxa" w:w="3324"/>
-            <w:shd w:fill="F0C14B" w:val="clear"/>
-          </w:tcPr>
-          <w:p>
-            <w:r/>
-            <w:r>
-              <w:rPr>
-                <w:rFonts w:ascii="Arial" w:hAnsi="Arial" w:eastAsia="Arial"/>
-                <w:b w:val="0"/>
-                <w:sz w:val="18"/>
-              </w:rPr>
-            </w:r>
-          </w:p>
-        </w:tc>
-        <w:tc>
-          <w:tcPr>
-            <w:tcW w:type="dxa" w:w="3324"/>
-            <w:shd w:fill="F0C14B" w:val="clear"/>
-          </w:tcPr>
-          <w:p>
-            <w:r/>
-            <w:r>
-              <w:rPr>
-                <w:rFonts w:ascii="Arial" w:hAnsi="Arial" w:eastAsia="Arial"/>
-                <w:b/>
-                <w:sz w:val="20"/>
-              </w:rPr>
-              <w:t>900 000</w:t>
-            </w:r>
-          </w:p>
-        </w:tc>
-      </w:tr>
-    </w:tbl>
-    <w:p/>
-    <w:p>
-      <w:pPr>
-        <w:pStyle w:val="Heading1"/>
-      </w:pPr>
-      <w:r>
-        <w:rPr>
-          <w:rFonts w:ascii="Arial" w:hAnsi="Arial" w:eastAsia="Arial"/>
-          <w:b/>
-          <w:color w:val="C41E3A"/>
-          <w:sz w:val="32"/>
-        </w:rPr>
-        <w:t>4. Ожидаемые метрики (цель)</w:t>
-      </w:r>
-    </w:p>
-    <w:tbl>
-      <w:tblPr>
-        <w:tblStyle w:val="TableGrid"/>
-        <w:tblW w:type="auto" w:w="0"/>
-        <w:tblLook w:firstColumn="1" w:firstRow="1" w:lastColumn="0" w:lastRow="0" w:noHBand="0" w:noVBand="1" w:val="04A0"/>
-      </w:tblPr>
-      <w:tblGrid>
-        <w:gridCol w:w="4986"/>
-        <w:gridCol w:w="4986"/>
-      </w:tblGrid>
-      <w:tr>
-        <w:tc>
-          <w:tcPr>
-            <w:tcW w:type="dxa" w:w="4986"/>
-            <w:shd w:fill="C41E3A" w:val="clear"/>
+            <w:tcW w:type="dxa" w:w="2635"/>
+            <w:shd w:fill="2E75B6" w:val="clear"/>
           </w:tcPr>
           <w:p>
             <w:r>
@@ -1813,16 +320,221 @@
                 <w:rFonts w:ascii="Arial" w:hAnsi="Arial" w:eastAsia="Arial"/>
                 <w:b/>
                 <w:color w:val="FFFFFF"/>
-                <w:sz w:val="20"/>
+                <w:sz w:val="18"/>
               </w:rPr>
-              <w:t>Метрика</w:t>
+              <w:t>2. Техническое обслуживание зон</w:t>
             </w:r>
           </w:p>
         </w:tc>
         <w:tc>
           <w:tcPr>
-            <w:tcW w:type="dxa" w:w="4986"/>
-            <w:shd w:fill="C41E3A" w:val="clear"/>
+            <w:tcW w:type="dxa" w:w="2635"/>
+            <w:shd w:fill="2E75B6" w:val="clear"/>
+          </w:tcPr>
+          <w:p/>
+        </w:tc>
+        <w:tc>
+          <w:tcPr>
+            <w:tcW w:type="dxa" w:w="2635"/>
+            <w:shd w:fill="2E75B6" w:val="clear"/>
+          </w:tcPr>
+          <w:p/>
+        </w:tc>
+        <w:tc>
+          <w:tcPr>
+            <w:tcW w:type="dxa" w:w="2635"/>
+            <w:shd w:fill="2E75B6" w:val="clear"/>
+          </w:tcPr>
+          <w:p/>
+        </w:tc>
+      </w:tr>
+      <w:tr>
+        <w:tc>
+          <w:tcPr>
+            <w:tcW w:type="dxa" w:w="2635"/>
+          </w:tcPr>
+          <w:p>
+            <w:r/>
+            <w:r>
+              <w:rPr>
+                <w:rFonts w:ascii="Arial" w:hAnsi="Arial" w:eastAsia="Arial"/>
+                <w:b w:val="0"/>
+                <w:sz w:val="18"/>
+              </w:rPr>
+              <w:t>1. Администратор зоны</w:t>
+            </w:r>
+          </w:p>
+        </w:tc>
+        <w:tc>
+          <w:tcPr>
+            <w:tcW w:type="dxa" w:w="2635"/>
+          </w:tcPr>
+          <w:p>
+            <w:r/>
+            <w:r>
+              <w:rPr>
+                <w:rFonts w:ascii="Arial" w:hAnsi="Arial" w:eastAsia="Arial"/>
+                <w:b w:val="0"/>
+                <w:sz w:val="16"/>
+              </w:rPr>
+              <w:t>Операционное решение административных вопросов на площадке</w:t>
+            </w:r>
+          </w:p>
+        </w:tc>
+        <w:tc>
+          <w:tcPr>
+            <w:tcW w:type="dxa" w:w="2635"/>
+          </w:tcPr>
+          <w:p>
+            <w:r/>
+            <w:r>
+              <w:rPr>
+                <w:rFonts w:ascii="Arial" w:hAnsi="Arial" w:eastAsia="Arial"/>
+                <w:b w:val="0"/>
+                <w:sz w:val="18"/>
+              </w:rPr>
+              <w:t>4 чел.</w:t>
+            </w:r>
+          </w:p>
+        </w:tc>
+        <w:tc>
+          <w:tcPr>
+            <w:tcW w:type="dxa" w:w="2635"/>
+          </w:tcPr>
+          <w:p>
+            <w:r/>
+            <w:r>
+              <w:rPr>
+                <w:rFonts w:ascii="Arial" w:hAnsi="Arial" w:eastAsia="Arial"/>
+                <w:b w:val="0"/>
+                <w:sz w:val="18"/>
+              </w:rPr>
+              <w:t>31 200</w:t>
+            </w:r>
+          </w:p>
+        </w:tc>
+      </w:tr>
+      <w:tr>
+        <w:tc>
+          <w:tcPr>
+            <w:tcW w:type="dxa" w:w="2635"/>
+          </w:tcPr>
+          <w:p>
+            <w:r/>
+            <w:r>
+              <w:rPr>
+                <w:rFonts w:ascii="Arial" w:hAnsi="Arial" w:eastAsia="Arial"/>
+                <w:b w:val="0"/>
+                <w:sz w:val="18"/>
+              </w:rPr>
+              <w:t>2. Технический администратор</w:t>
+            </w:r>
+          </w:p>
+        </w:tc>
+        <w:tc>
+          <w:tcPr>
+            <w:tcW w:type="dxa" w:w="2635"/>
+          </w:tcPr>
+          <w:p>
+            <w:r/>
+            <w:r>
+              <w:rPr>
+                <w:rFonts w:ascii="Arial" w:hAnsi="Arial" w:eastAsia="Arial"/>
+                <w:b w:val="0"/>
+                <w:sz w:val="16"/>
+              </w:rPr>
+              <w:t>Техническое обеспечение: звук, экран, интернет, коммутация</w:t>
+            </w:r>
+          </w:p>
+        </w:tc>
+        <w:tc>
+          <w:tcPr>
+            <w:tcW w:type="dxa" w:w="2635"/>
+          </w:tcPr>
+          <w:p>
+            <w:r/>
+            <w:r>
+              <w:rPr>
+                <w:rFonts w:ascii="Arial" w:hAnsi="Arial" w:eastAsia="Arial"/>
+                <w:b w:val="0"/>
+                <w:sz w:val="18"/>
+              </w:rPr>
+              <w:t>1 чел.</w:t>
+            </w:r>
+          </w:p>
+        </w:tc>
+        <w:tc>
+          <w:tcPr>
+            <w:tcW w:type="dxa" w:w="2635"/>
+          </w:tcPr>
+          <w:p>
+            <w:r/>
+            <w:r>
+              <w:rPr>
+                <w:rFonts w:ascii="Arial" w:hAnsi="Arial" w:eastAsia="Arial"/>
+                <w:b w:val="0"/>
+                <w:sz w:val="18"/>
+              </w:rPr>
+              <w:t>14 400</w:t>
+            </w:r>
+          </w:p>
+        </w:tc>
+      </w:tr>
+      <w:tr>
+        <w:tc>
+          <w:tcPr>
+            <w:tcW w:type="dxa" w:w="2635"/>
+            <w:shd w:fill="D6EAF8" w:val="clear"/>
+          </w:tcPr>
+          <w:p>
+            <w:r/>
+            <w:r>
+              <w:rPr>
+                <w:rFonts w:ascii="Arial" w:hAnsi="Arial" w:eastAsia="Arial"/>
+                <w:b/>
+                <w:sz w:val="18"/>
+              </w:rPr>
+              <w:t>Итого: 2. Техническое обслуживание зон</w:t>
+            </w:r>
+          </w:p>
+        </w:tc>
+        <w:tc>
+          <w:tcPr>
+            <w:tcW w:type="dxa" w:w="2635"/>
+            <w:shd w:fill="D6EAF8" w:val="clear"/>
+          </w:tcPr>
+          <w:p/>
+        </w:tc>
+        <w:tc>
+          <w:tcPr>
+            <w:tcW w:type="dxa" w:w="2635"/>
+            <w:shd w:fill="D6EAF8" w:val="clear"/>
+          </w:tcPr>
+          <w:p/>
+        </w:tc>
+        <w:tc>
+          <w:tcPr>
+            <w:tcW w:type="dxa" w:w="2635"/>
+            <w:shd w:fill="D6EAF8" w:val="clear"/>
+          </w:tcPr>
+          <w:p>
+            <w:r/>
+            <w:r>
+              <w:rPr>
+                <w:rFonts w:ascii="Arial" w:hAnsi="Arial" w:eastAsia="Arial"/>
+                <w:b/>
+                <w:sz w:val="18"/>
+              </w:rPr>
+              <w:t>45 600</w:t>
+            </w:r>
+          </w:p>
+        </w:tc>
+      </w:tr>
+      <w:tr>
+        <w:tc>
+          <w:tcPr>
+            <w:tcW w:type="dxa" w:w="2635"/>
+            <w:shd w:fill="2E75B6" w:val="clear"/>
           </w:tcPr>
           <w:p>
             <w:r>
@@ -1835,9 +547,96 @@
                 <w:rFonts w:ascii="Arial" w:hAnsi="Arial" w:eastAsia="Arial"/>
                 <w:b/>
                 <w:color w:val="FFFFFF"/>
-                <w:sz w:val="20"/>
+                <w:sz w:val="18"/>
               </w:rPr>
-              <w:t>Цель</w:t>
+              <w:t>3. Медиа / трансляция</w:t>
+            </w:r>
+          </w:p>
+        </w:tc>
+        <w:tc>
+          <w:tcPr>
+            <w:tcW w:type="dxa" w:w="2635"/>
+            <w:shd w:fill="2E75B6" w:val="clear"/>
+          </w:tcPr>
+          <w:p/>
+        </w:tc>
+        <w:tc>
+          <w:tcPr>
+            <w:tcW w:type="dxa" w:w="2635"/>
+            <w:shd w:fill="2E75B6" w:val="clear"/>
+          </w:tcPr>
+          <w:p/>
+        </w:tc>
+        <w:tc>
+          <w:tcPr>
+            <w:tcW w:type="dxa" w:w="2635"/>
+            <w:shd w:fill="2E75B6" w:val="clear"/>
+          </w:tcPr>
+          <w:p/>
+        </w:tc>
+      </w:tr>
+      <w:tr>
+        <w:tc>
+          <w:tcPr>
+            <w:tcW w:type="dxa" w:w="2635"/>
+          </w:tcPr>
+          <w:p>
+            <w:r/>
+            <w:r>
+              <w:rPr>
+                <w:rFonts w:ascii="Arial" w:hAnsi="Arial" w:eastAsia="Arial"/>
+                <w:b w:val="0"/>
+                <w:sz w:val="18"/>
+              </w:rPr>
+              <w:t>1. Режиссёр трансляции</w:t>
+            </w:r>
+          </w:p>
+        </w:tc>
+        <w:tc>
+          <w:tcPr>
+            <w:tcW w:type="dxa" w:w="2635"/>
+          </w:tcPr>
+          <w:p>
+            <w:r/>
+            <w:r>
+              <w:rPr>
+                <w:rFonts w:ascii="Arial" w:hAnsi="Arial" w:eastAsia="Arial"/>
+                <w:b w:val="0"/>
+                <w:sz w:val="16"/>
+              </w:rPr>
+              <w:t>Управление эфиром, переключение камер и графики</w:t>
+            </w:r>
+          </w:p>
+        </w:tc>
+        <w:tc>
+          <w:tcPr>
+            <w:tcW w:type="dxa" w:w="2635"/>
+          </w:tcPr>
+          <w:p>
+            <w:r/>
+            <w:r>
+              <w:rPr>
+                <w:rFonts w:ascii="Arial" w:hAnsi="Arial" w:eastAsia="Arial"/>
+                <w:b w:val="0"/>
+                <w:sz w:val="18"/>
+              </w:rPr>
+              <w:t>1 чел.</w:t>
+            </w:r>
+          </w:p>
+        </w:tc>
+        <w:tc>
+          <w:tcPr>
+            <w:tcW w:type="dxa" w:w="2635"/>
+          </w:tcPr>
+          <w:p>
+            <w:r/>
+            <w:r>
+              <w:rPr>
+                <w:rFonts w:ascii="Arial" w:hAnsi="Arial" w:eastAsia="Arial"/>
+                <w:b w:val="0"/>
+                <w:sz w:val="18"/>
+              </w:rPr>
+              <w:t>25 000</w:t>
             </w:r>
           </w:p>
         </w:tc>
@@ -1845,7 +644,7 @@
       <w:tr>
         <w:tc>
           <w:tcPr>
-            <w:tcW w:type="dxa" w:w="4986"/>
+            <w:tcW w:type="dxa" w:w="2635"/>
           </w:tcPr>
           <w:p>
             <w:r/>
@@ -1853,15 +652,15 @@
               <w:rPr>
                 <w:rFonts w:ascii="Arial" w:hAnsi="Arial" w:eastAsia="Arial"/>
                 <w:b w:val="0"/>
-                <w:sz w:val="20"/>
+                <w:sz w:val="18"/>
               </w:rPr>
-              <w:t>Уникальные гости зоны</w:t>
+              <w:t>2. Обсервер</w:t>
             </w:r>
           </w:p>
         </w:tc>
         <w:tc>
           <w:tcPr>
-            <w:tcW w:type="dxa" w:w="4986"/>
+            <w:tcW w:type="dxa" w:w="2635"/>
           </w:tcPr>
           <w:p>
             <w:r/>
@@ -1869,9 +668,41 @@
               <w:rPr>
                 <w:rFonts w:ascii="Arial" w:hAnsi="Arial" w:eastAsia="Arial"/>
                 <w:b w:val="0"/>
-                <w:sz w:val="20"/>
+                <w:sz w:val="16"/>
               </w:rPr>
-              <w:t>500–650</w:t>
+              <w:t>Внутриигровая режиссура</w:t>
+            </w:r>
+          </w:p>
+        </w:tc>
+        <w:tc>
+          <w:tcPr>
+            <w:tcW w:type="dxa" w:w="2635"/>
+          </w:tcPr>
+          <w:p>
+            <w:r/>
+            <w:r>
+              <w:rPr>
+                <w:rFonts w:ascii="Arial" w:hAnsi="Arial" w:eastAsia="Arial"/>
+                <w:b w:val="0"/>
+                <w:sz w:val="18"/>
+              </w:rPr>
+              <w:t>1 чел.</w:t>
+            </w:r>
+          </w:p>
+        </w:tc>
+        <w:tc>
+          <w:tcPr>
+            <w:tcW w:type="dxa" w:w="2635"/>
+          </w:tcPr>
+          <w:p>
+            <w:r/>
+            <w:r>
+              <w:rPr>
+                <w:rFonts w:ascii="Arial" w:hAnsi="Arial" w:eastAsia="Arial"/>
+                <w:b w:val="0"/>
+                <w:sz w:val="18"/>
+              </w:rPr>
+              <w:t>20 000</w:t>
             </w:r>
           </w:p>
         </w:tc>
@@ -1879,8 +710,7 @@
       <w:tr>
         <w:tc>
           <w:tcPr>
-            <w:tcW w:type="dxa" w:w="4986"/>
-            <w:shd w:fill="F7E8E8" w:val="clear"/>
+            <w:tcW w:type="dxa" w:w="2635"/>
           </w:tcPr>
           <w:p>
             <w:r/>
@@ -1888,16 +718,15 @@
               <w:rPr>
                 <w:rFonts w:ascii="Arial" w:hAnsi="Arial" w:eastAsia="Arial"/>
                 <w:b w:val="0"/>
-                <w:sz w:val="20"/>
+                <w:sz w:val="18"/>
               </w:rPr>
-              <w:t>Пик одновременно на зоне</w:t>
+              <w:t>3. Инженер по звуку</w:t>
             </w:r>
           </w:p>
         </w:tc>
         <w:tc>
           <w:tcPr>
-            <w:tcW w:type="dxa" w:w="4986"/>
-            <w:shd w:fill="F7E8E8" w:val="clear"/>
+            <w:tcW w:type="dxa" w:w="2635"/>
           </w:tcPr>
           <w:p>
             <w:r/>
@@ -1905,9 +734,41 @@
               <w:rPr>
                 <w:rFonts w:ascii="Arial" w:hAnsi="Arial" w:eastAsia="Arial"/>
                 <w:b w:val="0"/>
-                <w:sz w:val="20"/>
+                <w:sz w:val="16"/>
               </w:rPr>
-              <w:t>70–90</w:t>
+              <w:t>Звук на площадке и в трансляции</w:t>
+            </w:r>
+          </w:p>
+        </w:tc>
+        <w:tc>
+          <w:tcPr>
+            <w:tcW w:type="dxa" w:w="2635"/>
+          </w:tcPr>
+          <w:p>
+            <w:r/>
+            <w:r>
+              <w:rPr>
+                <w:rFonts w:ascii="Arial" w:hAnsi="Arial" w:eastAsia="Arial"/>
+                <w:b w:val="0"/>
+                <w:sz w:val="18"/>
+              </w:rPr>
+              <w:t>1 чел.</w:t>
+            </w:r>
+          </w:p>
+        </w:tc>
+        <w:tc>
+          <w:tcPr>
+            <w:tcW w:type="dxa" w:w="2635"/>
+          </w:tcPr>
+          <w:p>
+            <w:r/>
+            <w:r>
+              <w:rPr>
+                <w:rFonts w:ascii="Arial" w:hAnsi="Arial" w:eastAsia="Arial"/>
+                <w:b w:val="0"/>
+                <w:sz w:val="18"/>
+              </w:rPr>
+              <w:t>18 000</w:t>
             </w:r>
           </w:p>
         </w:tc>
@@ -1915,7 +776,7 @@
       <w:tr>
         <w:tc>
           <w:tcPr>
-            <w:tcW w:type="dxa" w:w="4986"/>
+            <w:tcW w:type="dxa" w:w="2635"/>
           </w:tcPr>
           <w:p>
             <w:r/>
@@ -1923,15 +784,15 @@
               <w:rPr>
                 <w:rFonts w:ascii="Arial" w:hAnsi="Arial" w:eastAsia="Arial"/>
                 <w:b w:val="0"/>
-                <w:sz w:val="20"/>
+                <w:sz w:val="18"/>
               </w:rPr>
-              <w:t>Команды в турнире 5×5</w:t>
+              <w:t>4. Инженер трансляции</w:t>
             </w:r>
           </w:p>
         </w:tc>
         <w:tc>
           <w:tcPr>
-            <w:tcW w:type="dxa" w:w="4986"/>
+            <w:tcW w:type="dxa" w:w="2635"/>
           </w:tcPr>
           <w:p>
             <w:r/>
@@ -1939,9 +800,41 @@
               <w:rPr>
                 <w:rFonts w:ascii="Arial" w:hAnsi="Arial" w:eastAsia="Arial"/>
                 <w:b w:val="0"/>
-                <w:sz w:val="20"/>
+                <w:sz w:val="16"/>
               </w:rPr>
-              <w:t>8–12</w:t>
+              <w:t>Маршрутизация сигнала, стабильность эфира</w:t>
+            </w:r>
+          </w:p>
+        </w:tc>
+        <w:tc>
+          <w:tcPr>
+            <w:tcW w:type="dxa" w:w="2635"/>
+          </w:tcPr>
+          <w:p>
+            <w:r/>
+            <w:r>
+              <w:rPr>
+                <w:rFonts w:ascii="Arial" w:hAnsi="Arial" w:eastAsia="Arial"/>
+                <w:b w:val="0"/>
+                <w:sz w:val="18"/>
+              </w:rPr>
+              <w:t>1 чел.</w:t>
+            </w:r>
+          </w:p>
+        </w:tc>
+        <w:tc>
+          <w:tcPr>
+            <w:tcW w:type="dxa" w:w="2635"/>
+          </w:tcPr>
+          <w:p>
+            <w:r/>
+            <w:r>
+              <w:rPr>
+                <w:rFonts w:ascii="Arial" w:hAnsi="Arial" w:eastAsia="Arial"/>
+                <w:b w:val="0"/>
+                <w:sz w:val="18"/>
+              </w:rPr>
+              <w:t>25 000</w:t>
             </w:r>
           </w:p>
         </w:tc>
@@ -1949,8 +842,7 @@
       <w:tr>
         <w:tc>
           <w:tcPr>
-            <w:tcW w:type="dxa" w:w="4986"/>
-            <w:shd w:fill="F7E8E8" w:val="clear"/>
+            <w:tcW w:type="dxa" w:w="2635"/>
           </w:tcPr>
           <w:p>
             <w:r/>
@@ -1958,16 +850,15 @@
               <w:rPr>
                 <w:rFonts w:ascii="Arial" w:hAnsi="Arial" w:eastAsia="Arial"/>
                 <w:b w:val="0"/>
-                <w:sz w:val="20"/>
+                <w:sz w:val="18"/>
               </w:rPr>
-              <w:t>Участники «царя горы»</w:t>
+              <w:t>5. Режиссёр по графике</w:t>
             </w:r>
           </w:p>
         </w:tc>
         <w:tc>
           <w:tcPr>
-            <w:tcW w:type="dxa" w:w="4986"/>
-            <w:shd w:fill="F7E8E8" w:val="clear"/>
+            <w:tcW w:type="dxa" w:w="2635"/>
           </w:tcPr>
           <w:p>
             <w:r/>
@@ -1975,9 +866,41 @@
               <w:rPr>
                 <w:rFonts w:ascii="Arial" w:hAnsi="Arial" w:eastAsia="Arial"/>
                 <w:b w:val="0"/>
-                <w:sz w:val="20"/>
+                <w:sz w:val="16"/>
               </w:rPr>
-              <w:t>40–55</w:t>
+              <w:t>Вывод графики в видеопоток</w:t>
+            </w:r>
+          </w:p>
+        </w:tc>
+        <w:tc>
+          <w:tcPr>
+            <w:tcW w:type="dxa" w:w="2635"/>
+          </w:tcPr>
+          <w:p>
+            <w:r/>
+            <w:r>
+              <w:rPr>
+                <w:rFonts w:ascii="Arial" w:hAnsi="Arial" w:eastAsia="Arial"/>
+                <w:b w:val="0"/>
+                <w:sz w:val="18"/>
+              </w:rPr>
+              <w:t>1 чел.</w:t>
+            </w:r>
+          </w:p>
+        </w:tc>
+        <w:tc>
+          <w:tcPr>
+            <w:tcW w:type="dxa" w:w="2635"/>
+          </w:tcPr>
+          <w:p>
+            <w:r/>
+            <w:r>
+              <w:rPr>
+                <w:rFonts w:ascii="Arial" w:hAnsi="Arial" w:eastAsia="Arial"/>
+                <w:b w:val="0"/>
+                <w:sz w:val="18"/>
+              </w:rPr>
+              <w:t>20 000</w:t>
             </w:r>
           </w:p>
         </w:tc>
@@ -1985,7 +908,102 @@
       <w:tr>
         <w:tc>
           <w:tcPr>
-            <w:tcW w:type="dxa" w:w="4986"/>
+            <w:tcW w:type="dxa" w:w="2635"/>
+            <w:shd w:fill="D6EAF8" w:val="clear"/>
+          </w:tcPr>
+          <w:p>
+            <w:r/>
+            <w:r>
+              <w:rPr>
+                <w:rFonts w:ascii="Arial" w:hAnsi="Arial" w:eastAsia="Arial"/>
+                <w:b/>
+                <w:sz w:val="18"/>
+              </w:rPr>
+              <w:t>Итого: 3. Медиа / трансляция</w:t>
+            </w:r>
+          </w:p>
+        </w:tc>
+        <w:tc>
+          <w:tcPr>
+            <w:tcW w:type="dxa" w:w="2635"/>
+            <w:shd w:fill="D6EAF8" w:val="clear"/>
+          </w:tcPr>
+          <w:p/>
+        </w:tc>
+        <w:tc>
+          <w:tcPr>
+            <w:tcW w:type="dxa" w:w="2635"/>
+            <w:shd w:fill="D6EAF8" w:val="clear"/>
+          </w:tcPr>
+          <w:p/>
+        </w:tc>
+        <w:tc>
+          <w:tcPr>
+            <w:tcW w:type="dxa" w:w="2635"/>
+            <w:shd w:fill="D6EAF8" w:val="clear"/>
+          </w:tcPr>
+          <w:p>
+            <w:r/>
+            <w:r>
+              <w:rPr>
+                <w:rFonts w:ascii="Arial" w:hAnsi="Arial" w:eastAsia="Arial"/>
+                <w:b/>
+                <w:sz w:val="18"/>
+              </w:rPr>
+              <w:t>108 000</w:t>
+            </w:r>
+          </w:p>
+        </w:tc>
+      </w:tr>
+      <w:tr>
+        <w:tc>
+          <w:tcPr>
+            <w:tcW w:type="dxa" w:w="2635"/>
+            <w:shd w:fill="2E75B6" w:val="clear"/>
+          </w:tcPr>
+          <w:p>
+            <w:r>
+              <w:rPr>
+                <w:color w:val="FFFFFF"/>
+              </w:rPr>
+            </w:r>
+            <w:r>
+              <w:rPr>
+                <w:rFonts w:ascii="Arial" w:hAnsi="Arial" w:eastAsia="Arial"/>
+                <w:b/>
+                <w:color w:val="FFFFFF"/>
+                <w:sz w:val="18"/>
+              </w:rPr>
+              <w:t>4. Оборудование</w:t>
+            </w:r>
+          </w:p>
+        </w:tc>
+        <w:tc>
+          <w:tcPr>
+            <w:tcW w:type="dxa" w:w="2635"/>
+            <w:shd w:fill="2E75B6" w:val="clear"/>
+          </w:tcPr>
+          <w:p/>
+        </w:tc>
+        <w:tc>
+          <w:tcPr>
+            <w:tcW w:type="dxa" w:w="2635"/>
+            <w:shd w:fill="2E75B6" w:val="clear"/>
+          </w:tcPr>
+          <w:p/>
+        </w:tc>
+        <w:tc>
+          <w:tcPr>
+            <w:tcW w:type="dxa" w:w="2635"/>
+            <w:shd w:fill="2E75B6" w:val="clear"/>
+          </w:tcPr>
+          <w:p/>
+        </w:tc>
+      </w:tr>
+      <w:tr>
+        <w:tc>
+          <w:tcPr>
+            <w:tcW w:type="dxa" w:w="2635"/>
           </w:tcPr>
           <w:p>
             <w:r/>
@@ -1993,15 +1011,15 @@
               <w:rPr>
                 <w:rFonts w:ascii="Arial" w:hAnsi="Arial" w:eastAsia="Arial"/>
                 <w:b w:val="0"/>
-                <w:sz w:val="20"/>
+                <w:sz w:val="18"/>
               </w:rPr>
-              <w:t>Фото у зоны и с косплеем</w:t>
+              <w:t>1. Студийный свет</w:t>
             </w:r>
           </w:p>
         </w:tc>
         <w:tc>
           <w:tcPr>
-            <w:tcW w:type="dxa" w:w="4986"/>
+            <w:tcW w:type="dxa" w:w="2635"/>
           </w:tcPr>
           <w:p>
             <w:r/>
@@ -2009,9 +1027,41 @@
               <w:rPr>
                 <w:rFonts w:ascii="Arial" w:hAnsi="Arial" w:eastAsia="Arial"/>
                 <w:b w:val="0"/>
-                <w:sz w:val="20"/>
+                <w:sz w:val="16"/>
               </w:rPr>
-              <w:t>250–350</w:t>
+              <w:t>Комплект студийного света</w:t>
+            </w:r>
+          </w:p>
+        </w:tc>
+        <w:tc>
+          <w:tcPr>
+            <w:tcW w:type="dxa" w:w="2635"/>
+          </w:tcPr>
+          <w:p>
+            <w:r/>
+            <w:r>
+              <w:rPr>
+                <w:rFonts w:ascii="Arial" w:hAnsi="Arial" w:eastAsia="Arial"/>
+                <w:b w:val="0"/>
+                <w:sz w:val="18"/>
+              </w:rPr>
+              <w:t>1 комплект</w:t>
+            </w:r>
+          </w:p>
+        </w:tc>
+        <w:tc>
+          <w:tcPr>
+            <w:tcW w:type="dxa" w:w="2635"/>
+          </w:tcPr>
+          <w:p>
+            <w:r/>
+            <w:r>
+              <w:rPr>
+                <w:rFonts w:ascii="Arial" w:hAnsi="Arial" w:eastAsia="Arial"/>
+                <w:b w:val="0"/>
+                <w:sz w:val="18"/>
+              </w:rPr>
+              <w:t>26 000</w:t>
             </w:r>
           </w:p>
         </w:tc>
@@ -2019,8 +1069,7 @@
       <w:tr>
         <w:tc>
           <w:tcPr>
-            <w:tcW w:type="dxa" w:w="4986"/>
-            <w:shd w:fill="F7E8E8" w:val="clear"/>
+            <w:tcW w:type="dxa" w:w="2635"/>
           </w:tcPr>
           <w:p>
             <w:r/>
@@ -2028,16 +1077,15 @@
               <w:rPr>
                 <w:rFonts w:ascii="Arial" w:hAnsi="Arial" w:eastAsia="Arial"/>
                 <w:b w:val="0"/>
-                <w:sz w:val="20"/>
+                <w:sz w:val="18"/>
               </w:rPr>
-              <w:t>Гости уголка Genshin Impact</w:t>
+              <w:t>2. Телевизор 65″</w:t>
             </w:r>
           </w:p>
         </w:tc>
         <w:tc>
           <w:tcPr>
-            <w:tcW w:type="dxa" w:w="4986"/>
-            <w:shd w:fill="F7E8E8" w:val="clear"/>
+            <w:tcW w:type="dxa" w:w="2635"/>
           </w:tcPr>
           <w:p>
             <w:r/>
@@ -2045,9 +1093,41 @@
               <w:rPr>
                 <w:rFonts w:ascii="Arial" w:hAnsi="Arial" w:eastAsia="Arial"/>
                 <w:b w:val="0"/>
-                <w:sz w:val="20"/>
+                <w:sz w:val="16"/>
               </w:rPr>
-              <w:t>120–180</w:t>
+              <w:t>Зона Genshin Impact и показ на зоне; смена до 12 ч</w:t>
+            </w:r>
+          </w:p>
+        </w:tc>
+        <w:tc>
+          <w:tcPr>
+            <w:tcW w:type="dxa" w:w="2635"/>
+          </w:tcPr>
+          <w:p>
+            <w:r/>
+            <w:r>
+              <w:rPr>
+                <w:rFonts w:ascii="Arial" w:hAnsi="Arial" w:eastAsia="Arial"/>
+                <w:b w:val="0"/>
+                <w:sz w:val="18"/>
+              </w:rPr>
+              <w:t>2 шт.</w:t>
+            </w:r>
+          </w:p>
+        </w:tc>
+        <w:tc>
+          <w:tcPr>
+            <w:tcW w:type="dxa" w:w="2635"/>
+          </w:tcPr>
+          <w:p>
+            <w:r/>
+            <w:r>
+              <w:rPr>
+                <w:rFonts w:ascii="Arial" w:hAnsi="Arial" w:eastAsia="Arial"/>
+                <w:b w:val="0"/>
+                <w:sz w:val="18"/>
+              </w:rPr>
+              <w:t>6 000</w:t>
             </w:r>
           </w:p>
         </w:tc>
@@ -2055,7 +1135,102 @@
       <w:tr>
         <w:tc>
           <w:tcPr>
-            <w:tcW w:type="dxa" w:w="4986"/>
+            <w:tcW w:type="dxa" w:w="2635"/>
+            <w:shd w:fill="D6EAF8" w:val="clear"/>
+          </w:tcPr>
+          <w:p>
+            <w:r/>
+            <w:r>
+              <w:rPr>
+                <w:rFonts w:ascii="Arial" w:hAnsi="Arial" w:eastAsia="Arial"/>
+                <w:b/>
+                <w:sz w:val="18"/>
+              </w:rPr>
+              <w:t>Итого: 4. Оборудование</w:t>
+            </w:r>
+          </w:p>
+        </w:tc>
+        <w:tc>
+          <w:tcPr>
+            <w:tcW w:type="dxa" w:w="2635"/>
+            <w:shd w:fill="D6EAF8" w:val="clear"/>
+          </w:tcPr>
+          <w:p/>
+        </w:tc>
+        <w:tc>
+          <w:tcPr>
+            <w:tcW w:type="dxa" w:w="2635"/>
+            <w:shd w:fill="D6EAF8" w:val="clear"/>
+          </w:tcPr>
+          <w:p/>
+        </w:tc>
+        <w:tc>
+          <w:tcPr>
+            <w:tcW w:type="dxa" w:w="2635"/>
+            <w:shd w:fill="D6EAF8" w:val="clear"/>
+          </w:tcPr>
+          <w:p>
+            <w:r/>
+            <w:r>
+              <w:rPr>
+                <w:rFonts w:ascii="Arial" w:hAnsi="Arial" w:eastAsia="Arial"/>
+                <w:b/>
+                <w:sz w:val="18"/>
+              </w:rPr>
+              <w:t>32 000</w:t>
+            </w:r>
+          </w:p>
+        </w:tc>
+      </w:tr>
+      <w:tr>
+        <w:tc>
+          <w:tcPr>
+            <w:tcW w:type="dxa" w:w="2635"/>
+            <w:shd w:fill="2E75B6" w:val="clear"/>
+          </w:tcPr>
+          <w:p>
+            <w:r>
+              <w:rPr>
+                <w:color w:val="FFFFFF"/>
+              </w:rPr>
+            </w:r>
+            <w:r>
+              <w:rPr>
+                <w:rFonts w:ascii="Arial" w:hAnsi="Arial" w:eastAsia="Arial"/>
+                <w:b/>
+                <w:color w:val="FFFFFF"/>
+                <w:sz w:val="18"/>
+              </w:rPr>
+              <w:t>5. Менеджмент</w:t>
+            </w:r>
+          </w:p>
+        </w:tc>
+        <w:tc>
+          <w:tcPr>
+            <w:tcW w:type="dxa" w:w="2635"/>
+            <w:shd w:fill="2E75B6" w:val="clear"/>
+          </w:tcPr>
+          <w:p/>
+        </w:tc>
+        <w:tc>
+          <w:tcPr>
+            <w:tcW w:type="dxa" w:w="2635"/>
+            <w:shd w:fill="2E75B6" w:val="clear"/>
+          </w:tcPr>
+          <w:p/>
+        </w:tc>
+        <w:tc>
+          <w:tcPr>
+            <w:tcW w:type="dxa" w:w="2635"/>
+            <w:shd w:fill="2E75B6" w:val="clear"/>
+          </w:tcPr>
+          <w:p/>
+        </w:tc>
+      </w:tr>
+      <w:tr>
+        <w:tc>
+          <w:tcPr>
+            <w:tcW w:type="dxa" w:w="2635"/>
           </w:tcPr>
           <w:p>
             <w:r/>
@@ -2063,15 +1238,15 @@
               <w:rPr>
                 <w:rFonts w:ascii="Arial" w:hAnsi="Arial" w:eastAsia="Arial"/>
                 <w:b w:val="0"/>
-                <w:sz w:val="20"/>
+                <w:sz w:val="18"/>
               </w:rPr>
-              <w:t>Участники викторины и бинго</w:t>
+              <w:t>1. Менеджмент мероприятия</w:t>
             </w:r>
           </w:p>
         </w:tc>
         <w:tc>
           <w:tcPr>
-            <w:tcW w:type="dxa" w:w="4986"/>
+            <w:tcW w:type="dxa" w:w="2635"/>
           </w:tcPr>
           <w:p>
             <w:r/>
@@ -2079,9 +1254,41 @@
               <w:rPr>
                 <w:rFonts w:ascii="Arial" w:hAnsi="Arial" w:eastAsia="Arial"/>
                 <w:b w:val="0"/>
-                <w:sz w:val="20"/>
+                <w:sz w:val="16"/>
               </w:rPr>
-              <w:t>70–100</w:t>
+              <w:t>Координация зоны и программы</w:t>
+            </w:r>
+          </w:p>
+        </w:tc>
+        <w:tc>
+          <w:tcPr>
+            <w:tcW w:type="dxa" w:w="2635"/>
+          </w:tcPr>
+          <w:p>
+            <w:r/>
+            <w:r>
+              <w:rPr>
+                <w:rFonts w:ascii="Arial" w:hAnsi="Arial" w:eastAsia="Arial"/>
+                <w:b w:val="0"/>
+                <w:sz w:val="18"/>
+              </w:rPr>
+              <w:t>1 проект</w:t>
+            </w:r>
+          </w:p>
+        </w:tc>
+        <w:tc>
+          <w:tcPr>
+            <w:tcW w:type="dxa" w:w="2635"/>
+          </w:tcPr>
+          <w:p>
+            <w:r/>
+            <w:r>
+              <w:rPr>
+                <w:rFonts w:ascii="Arial" w:hAnsi="Arial" w:eastAsia="Arial"/>
+                <w:b w:val="0"/>
+                <w:sz w:val="18"/>
+              </w:rPr>
+              <w:t>80 000</w:t>
             </w:r>
           </w:p>
         </w:tc>
@@ -2089,8 +1296,102 @@
       <w:tr>
         <w:tc>
           <w:tcPr>
-            <w:tcW w:type="dxa" w:w="4986"/>
-            <w:shd w:fill="F7E8E8" w:val="clear"/>
+            <w:tcW w:type="dxa" w:w="2635"/>
+            <w:shd w:fill="D6EAF8" w:val="clear"/>
+          </w:tcPr>
+          <w:p>
+            <w:r/>
+            <w:r>
+              <w:rPr>
+                <w:rFonts w:ascii="Arial" w:hAnsi="Arial" w:eastAsia="Arial"/>
+                <w:b/>
+                <w:sz w:val="18"/>
+              </w:rPr>
+              <w:t>Итого: 5. Менеджмент</w:t>
+            </w:r>
+          </w:p>
+        </w:tc>
+        <w:tc>
+          <w:tcPr>
+            <w:tcW w:type="dxa" w:w="2635"/>
+            <w:shd w:fill="D6EAF8" w:val="clear"/>
+          </w:tcPr>
+          <w:p/>
+        </w:tc>
+        <w:tc>
+          <w:tcPr>
+            <w:tcW w:type="dxa" w:w="2635"/>
+            <w:shd w:fill="D6EAF8" w:val="clear"/>
+          </w:tcPr>
+          <w:p/>
+        </w:tc>
+        <w:tc>
+          <w:tcPr>
+            <w:tcW w:type="dxa" w:w="2635"/>
+            <w:shd w:fill="D6EAF8" w:val="clear"/>
+          </w:tcPr>
+          <w:p>
+            <w:r/>
+            <w:r>
+              <w:rPr>
+                <w:rFonts w:ascii="Arial" w:hAnsi="Arial" w:eastAsia="Arial"/>
+                <w:b/>
+                <w:sz w:val="18"/>
+              </w:rPr>
+              <w:t>80 000</w:t>
+            </w:r>
+          </w:p>
+        </w:tc>
+      </w:tr>
+      <w:tr>
+        <w:tc>
+          <w:tcPr>
+            <w:tcW w:type="dxa" w:w="2635"/>
+            <w:shd w:fill="2E75B6" w:val="clear"/>
+          </w:tcPr>
+          <w:p>
+            <w:r>
+              <w:rPr>
+                <w:color w:val="FFFFFF"/>
+              </w:rPr>
+            </w:r>
+            <w:r>
+              <w:rPr>
+                <w:rFonts w:ascii="Arial" w:hAnsi="Arial" w:eastAsia="Arial"/>
+                <w:b/>
+                <w:color w:val="FFFFFF"/>
+                <w:sz w:val="18"/>
+              </w:rPr>
+              <w:t>6. Организация ивента</w:t>
+            </w:r>
+          </w:p>
+        </w:tc>
+        <w:tc>
+          <w:tcPr>
+            <w:tcW w:type="dxa" w:w="2635"/>
+            <w:shd w:fill="2E75B6" w:val="clear"/>
+          </w:tcPr>
+          <w:p/>
+        </w:tc>
+        <w:tc>
+          <w:tcPr>
+            <w:tcW w:type="dxa" w:w="2635"/>
+            <w:shd w:fill="2E75B6" w:val="clear"/>
+          </w:tcPr>
+          <w:p/>
+        </w:tc>
+        <w:tc>
+          <w:tcPr>
+            <w:tcW w:type="dxa" w:w="2635"/>
+            <w:shd w:fill="2E75B6" w:val="clear"/>
+          </w:tcPr>
+          <w:p/>
+        </w:tc>
+      </w:tr>
+      <w:tr>
+        <w:tc>
+          <w:tcPr>
+            <w:tcW w:type="dxa" w:w="2635"/>
           </w:tcPr>
           <w:p>
             <w:r/>
@@ -2098,16 +1399,15 @@
               <w:rPr>
                 <w:rFonts w:ascii="Arial" w:hAnsi="Arial" w:eastAsia="Arial"/>
                 <w:b w:val="0"/>
-                <w:sz w:val="20"/>
+                <w:sz w:val="18"/>
               </w:rPr>
-              <w:t>Длительность трансляции</w:t>
+              <w:t>1. Косплееры Mobile Legends (2 чел.)</w:t>
             </w:r>
           </w:p>
         </w:tc>
         <w:tc>
           <w:tcPr>
-            <w:tcW w:type="dxa" w:w="4986"/>
-            <w:shd w:fill="F7E8E8" w:val="clear"/>
+            <w:tcW w:type="dxa" w:w="2635"/>
           </w:tcPr>
           <w:p>
             <w:r/>
@@ -2115,9 +1415,41 @@
               <w:rPr>
                 <w:rFonts w:ascii="Arial" w:hAnsi="Arial" w:eastAsia="Arial"/>
                 <w:b w:val="0"/>
-                <w:sz w:val="20"/>
+                <w:sz w:val="16"/>
               </w:rPr>
-              <w:t>10–12 ч</w:t>
+              <w:t>Фото весь день</w:t>
+            </w:r>
+          </w:p>
+        </w:tc>
+        <w:tc>
+          <w:tcPr>
+            <w:tcW w:type="dxa" w:w="2635"/>
+          </w:tcPr>
+          <w:p>
+            <w:r/>
+            <w:r>
+              <w:rPr>
+                <w:rFonts w:ascii="Arial" w:hAnsi="Arial" w:eastAsia="Arial"/>
+                <w:b w:val="0"/>
+                <w:sz w:val="18"/>
+              </w:rPr>
+              <w:t>1 проект</w:t>
+            </w:r>
+          </w:p>
+        </w:tc>
+        <w:tc>
+          <w:tcPr>
+            <w:tcW w:type="dxa" w:w="2635"/>
+          </w:tcPr>
+          <w:p>
+            <w:r/>
+            <w:r>
+              <w:rPr>
+                <w:rFonts w:ascii="Arial" w:hAnsi="Arial" w:eastAsia="Arial"/>
+                <w:b w:val="0"/>
+                <w:sz w:val="18"/>
+              </w:rPr>
+              <w:t>45 000</w:t>
             </w:r>
           </w:p>
         </w:tc>
@@ -2125,7 +1457,7 @@
       <w:tr>
         <w:tc>
           <w:tcPr>
-            <w:tcW w:type="dxa" w:w="4986"/>
+            <w:tcW w:type="dxa" w:w="2635"/>
           </w:tcPr>
           <w:p>
             <w:r/>
@@ -2133,15 +1465,15 @@
               <w:rPr>
                 <w:rFonts w:ascii="Arial" w:hAnsi="Arial" w:eastAsia="Arial"/>
                 <w:b w:val="0"/>
-                <w:sz w:val="20"/>
+                <w:sz w:val="18"/>
               </w:rPr>
-              <w:t>Пик зрителей трансляции</w:t>
+              <w:t>2. Косплеерша Genshin Impact (1 чел.)</w:t>
             </w:r>
           </w:p>
         </w:tc>
         <w:tc>
           <w:tcPr>
-            <w:tcW w:type="dxa" w:w="4986"/>
+            <w:tcW w:type="dxa" w:w="2635"/>
           </w:tcPr>
           <w:p>
             <w:r/>
@@ -2149,9 +1481,41 @@
               <w:rPr>
                 <w:rFonts w:ascii="Arial" w:hAnsi="Arial" w:eastAsia="Arial"/>
                 <w:b w:val="0"/>
-                <w:sz w:val="20"/>
+                <w:sz w:val="16"/>
               </w:rPr>
-              <w:t>250–400</w:t>
+              <w:t>Фото весь день</w:t>
+            </w:r>
+          </w:p>
+        </w:tc>
+        <w:tc>
+          <w:tcPr>
+            <w:tcW w:type="dxa" w:w="2635"/>
+          </w:tcPr>
+          <w:p>
+            <w:r/>
+            <w:r>
+              <w:rPr>
+                <w:rFonts w:ascii="Arial" w:hAnsi="Arial" w:eastAsia="Arial"/>
+                <w:b w:val="0"/>
+                <w:sz w:val="18"/>
+              </w:rPr>
+              <w:t>1 проект</w:t>
+            </w:r>
+          </w:p>
+        </w:tc>
+        <w:tc>
+          <w:tcPr>
+            <w:tcW w:type="dxa" w:w="2635"/>
+          </w:tcPr>
+          <w:p>
+            <w:r/>
+            <w:r>
+              <w:rPr>
+                <w:rFonts w:ascii="Arial" w:hAnsi="Arial" w:eastAsia="Arial"/>
+                <w:b w:val="0"/>
+                <w:sz w:val="18"/>
+              </w:rPr>
+              <w:t>25 000</w:t>
             </w:r>
           </w:p>
         </w:tc>
@@ -2159,8 +1523,7 @@
       <w:tr>
         <w:tc>
           <w:tcPr>
-            <w:tcW w:type="dxa" w:w="4986"/>
-            <w:shd w:fill="F7E8E8" w:val="clear"/>
+            <w:tcW w:type="dxa" w:w="2635"/>
           </w:tcPr>
           <w:p>
             <w:r/>
@@ -2168,16 +1531,15 @@
               <w:rPr>
                 <w:rFonts w:ascii="Arial" w:hAnsi="Arial" w:eastAsia="Arial"/>
                 <w:b w:val="0"/>
-                <w:sz w:val="20"/>
+                <w:sz w:val="18"/>
               </w:rPr>
-              <w:t>Уникальные зрители трансляции</w:t>
+              <w:t>3. Фотозона Mobile Legends 3×2 м</w:t>
             </w:r>
           </w:p>
         </w:tc>
         <w:tc>
           <w:tcPr>
-            <w:tcW w:type="dxa" w:w="4986"/>
-            <w:shd w:fill="F7E8E8" w:val="clear"/>
+            <w:tcW w:type="dxa" w:w="2635"/>
           </w:tcPr>
           <w:p>
             <w:r/>
@@ -2185,9 +1547,41 @@
               <w:rPr>
                 <w:rFonts w:ascii="Arial" w:hAnsi="Arial" w:eastAsia="Arial"/>
                 <w:b w:val="0"/>
-                <w:sz w:val="20"/>
+                <w:sz w:val="16"/>
               </w:rPr>
-              <w:t>1 800–3 000</w:t>
+              <w:t>Каркас, печать, монтаж</w:t>
+            </w:r>
+          </w:p>
+        </w:tc>
+        <w:tc>
+          <w:tcPr>
+            <w:tcW w:type="dxa" w:w="2635"/>
+          </w:tcPr>
+          <w:p>
+            <w:r/>
+            <w:r>
+              <w:rPr>
+                <w:rFonts w:ascii="Arial" w:hAnsi="Arial" w:eastAsia="Arial"/>
+                <w:b w:val="0"/>
+                <w:sz w:val="18"/>
+              </w:rPr>
+              <w:t>1 проект</w:t>
+            </w:r>
+          </w:p>
+        </w:tc>
+        <w:tc>
+          <w:tcPr>
+            <w:tcW w:type="dxa" w:w="2635"/>
+          </w:tcPr>
+          <w:p>
+            <w:r/>
+            <w:r>
+              <w:rPr>
+                <w:rFonts w:ascii="Arial" w:hAnsi="Arial" w:eastAsia="Arial"/>
+                <w:b w:val="0"/>
+                <w:sz w:val="18"/>
+              </w:rPr>
+              <w:t>15 000</w:t>
             </w:r>
           </w:p>
         </w:tc>
@@ -2195,7 +1589,7 @@
       <w:tr>
         <w:tc>
           <w:tcPr>
-            <w:tcW w:type="dxa" w:w="4986"/>
+            <w:tcW w:type="dxa" w:w="2635"/>
           </w:tcPr>
           <w:p>
             <w:r/>
@@ -2203,15 +1597,15 @@
               <w:rPr>
                 <w:rFonts w:ascii="Arial" w:hAnsi="Arial" w:eastAsia="Arial"/>
                 <w:b w:val="0"/>
-                <w:sz w:val="20"/>
+                <w:sz w:val="18"/>
               </w:rPr>
-              <w:t>Короткие ролики за неделю</w:t>
+              <w:t>4. Декор зоны Genshin Impact</w:t>
             </w:r>
           </w:p>
         </w:tc>
         <w:tc>
           <w:tcPr>
-            <w:tcW w:type="dxa" w:w="4986"/>
+            <w:tcW w:type="dxa" w:w="2635"/>
           </w:tcPr>
           <w:p>
             <w:r/>
@@ -2219,9 +1613,730 @@
               <w:rPr>
                 <w:rFonts w:ascii="Arial" w:hAnsi="Arial" w:eastAsia="Arial"/>
                 <w:b w:val="0"/>
-                <w:sz w:val="20"/>
+                <w:sz w:val="16"/>
               </w:rPr>
-              <w:t>10–14 шт. / 10–20 тыс. охват</w:t>
+              <w:t>Панели, ткань, фонари, фотофон</w:t>
+            </w:r>
+          </w:p>
+        </w:tc>
+        <w:tc>
+          <w:tcPr>
+            <w:tcW w:type="dxa" w:w="2635"/>
+          </w:tcPr>
+          <w:p>
+            <w:r/>
+            <w:r>
+              <w:rPr>
+                <w:rFonts w:ascii="Arial" w:hAnsi="Arial" w:eastAsia="Arial"/>
+                <w:b w:val="0"/>
+                <w:sz w:val="18"/>
+              </w:rPr>
+              <w:t>1 проект</w:t>
+            </w:r>
+          </w:p>
+        </w:tc>
+        <w:tc>
+          <w:tcPr>
+            <w:tcW w:type="dxa" w:w="2635"/>
+          </w:tcPr>
+          <w:p>
+            <w:r/>
+            <w:r>
+              <w:rPr>
+                <w:rFonts w:ascii="Arial" w:hAnsi="Arial" w:eastAsia="Arial"/>
+                <w:b w:val="0"/>
+                <w:sz w:val="18"/>
+              </w:rPr>
+              <w:t>30 000</w:t>
+            </w:r>
+          </w:p>
+        </w:tc>
+      </w:tr>
+      <w:tr>
+        <w:tc>
+          <w:tcPr>
+            <w:tcW w:type="dxa" w:w="2635"/>
+          </w:tcPr>
+          <w:p>
+            <w:r/>
+            <w:r>
+              <w:rPr>
+                <w:rFonts w:ascii="Arial" w:hAnsi="Arial" w:eastAsia="Arial"/>
+                <w:b w:val="0"/>
+                <w:sz w:val="18"/>
+              </w:rPr>
+              <w:t>5. Декор под Китайский Новый год</w:t>
+            </w:r>
+          </w:p>
+        </w:tc>
+        <w:tc>
+          <w:tcPr>
+            <w:tcW w:type="dxa" w:w="2635"/>
+          </w:tcPr>
+          <w:p>
+            <w:r/>
+            <w:r>
+              <w:rPr>
+                <w:rFonts w:ascii="Arial" w:hAnsi="Arial" w:eastAsia="Arial"/>
+                <w:b w:val="0"/>
+                <w:sz w:val="16"/>
+              </w:rPr>
+              <w:t>Зона Mobile Legends и проходы</w:t>
+            </w:r>
+          </w:p>
+        </w:tc>
+        <w:tc>
+          <w:tcPr>
+            <w:tcW w:type="dxa" w:w="2635"/>
+          </w:tcPr>
+          <w:p>
+            <w:r/>
+            <w:r>
+              <w:rPr>
+                <w:rFonts w:ascii="Arial" w:hAnsi="Arial" w:eastAsia="Arial"/>
+                <w:b w:val="0"/>
+                <w:sz w:val="18"/>
+              </w:rPr>
+              <w:t>1 проект</w:t>
+            </w:r>
+          </w:p>
+        </w:tc>
+        <w:tc>
+          <w:tcPr>
+            <w:tcW w:type="dxa" w:w="2635"/>
+          </w:tcPr>
+          <w:p>
+            <w:r/>
+            <w:r>
+              <w:rPr>
+                <w:rFonts w:ascii="Arial" w:hAnsi="Arial" w:eastAsia="Arial"/>
+                <w:b w:val="0"/>
+                <w:sz w:val="18"/>
+              </w:rPr>
+              <w:t>25 000</w:t>
+            </w:r>
+          </w:p>
+        </w:tc>
+      </w:tr>
+      <w:tr>
+        <w:tc>
+          <w:tcPr>
+            <w:tcW w:type="dxa" w:w="2635"/>
+          </w:tcPr>
+          <w:p>
+            <w:r/>
+            <w:r>
+              <w:rPr>
+                <w:rFonts w:ascii="Arial" w:hAnsi="Arial" w:eastAsia="Arial"/>
+                <w:b w:val="0"/>
+                <w:sz w:val="18"/>
+              </w:rPr>
+              <w:t>6. Ведущий</w:t>
+            </w:r>
+          </w:p>
+        </w:tc>
+        <w:tc>
+          <w:tcPr>
+            <w:tcW w:type="dxa" w:w="2635"/>
+          </w:tcPr>
+          <w:p>
+            <w:r/>
+            <w:r>
+              <w:rPr>
+                <w:rFonts w:ascii="Arial" w:hAnsi="Arial" w:eastAsia="Arial"/>
+                <w:b w:val="0"/>
+                <w:sz w:val="16"/>
+              </w:rPr>
+            </w:r>
+          </w:p>
+        </w:tc>
+        <w:tc>
+          <w:tcPr>
+            <w:tcW w:type="dxa" w:w="2635"/>
+          </w:tcPr>
+          <w:p>
+            <w:r/>
+            <w:r>
+              <w:rPr>
+                <w:rFonts w:ascii="Arial" w:hAnsi="Arial" w:eastAsia="Arial"/>
+                <w:b w:val="0"/>
+                <w:sz w:val="18"/>
+              </w:rPr>
+              <w:t>1 проект</w:t>
+            </w:r>
+          </w:p>
+        </w:tc>
+        <w:tc>
+          <w:tcPr>
+            <w:tcW w:type="dxa" w:w="2635"/>
+          </w:tcPr>
+          <w:p>
+            <w:r/>
+            <w:r>
+              <w:rPr>
+                <w:rFonts w:ascii="Arial" w:hAnsi="Arial" w:eastAsia="Arial"/>
+                <w:b w:val="0"/>
+                <w:sz w:val="18"/>
+              </w:rPr>
+              <w:t>25 000</w:t>
+            </w:r>
+          </w:p>
+        </w:tc>
+      </w:tr>
+      <w:tr>
+        <w:tc>
+          <w:tcPr>
+            <w:tcW w:type="dxa" w:w="2635"/>
+          </w:tcPr>
+          <w:p>
+            <w:r/>
+            <w:r>
+              <w:rPr>
+                <w:rFonts w:ascii="Arial" w:hAnsi="Arial" w:eastAsia="Arial"/>
+                <w:b w:val="0"/>
+                <w:sz w:val="18"/>
+              </w:rPr>
+              <w:t>7. Алмазы Mobile Legends 15 000 шт.</w:t>
+            </w:r>
+          </w:p>
+        </w:tc>
+        <w:tc>
+          <w:tcPr>
+            <w:tcW w:type="dxa" w:w="2635"/>
+          </w:tcPr>
+          <w:p>
+            <w:r/>
+            <w:r>
+              <w:rPr>
+                <w:rFonts w:ascii="Arial" w:hAnsi="Arial" w:eastAsia="Arial"/>
+                <w:b w:val="0"/>
+                <w:sz w:val="16"/>
+              </w:rPr>
+              <w:t>Призы</w:t>
+            </w:r>
+          </w:p>
+        </w:tc>
+        <w:tc>
+          <w:tcPr>
+            <w:tcW w:type="dxa" w:w="2635"/>
+          </w:tcPr>
+          <w:p>
+            <w:r/>
+            <w:r>
+              <w:rPr>
+                <w:rFonts w:ascii="Arial" w:hAnsi="Arial" w:eastAsia="Arial"/>
+                <w:b w:val="0"/>
+                <w:sz w:val="18"/>
+              </w:rPr>
+              <w:t>1 проект</w:t>
+            </w:r>
+          </w:p>
+        </w:tc>
+        <w:tc>
+          <w:tcPr>
+            <w:tcW w:type="dxa" w:w="2635"/>
+          </w:tcPr>
+          <w:p>
+            <w:r/>
+            <w:r>
+              <w:rPr>
+                <w:rFonts w:ascii="Arial" w:hAnsi="Arial" w:eastAsia="Arial"/>
+                <w:b w:val="0"/>
+                <w:sz w:val="18"/>
+              </w:rPr>
+              <w:t>24 150</w:t>
+            </w:r>
+          </w:p>
+        </w:tc>
+      </w:tr>
+      <w:tr>
+        <w:tc>
+          <w:tcPr>
+            <w:tcW w:type="dxa" w:w="2635"/>
+          </w:tcPr>
+          <w:p>
+            <w:r/>
+            <w:r>
+              <w:rPr>
+                <w:rFonts w:ascii="Arial" w:hAnsi="Arial" w:eastAsia="Arial"/>
+                <w:b w:val="0"/>
+                <w:sz w:val="18"/>
+              </w:rPr>
+              <w:t>8. Денежный приз турнира 5×5</w:t>
+            </w:r>
+          </w:p>
+        </w:tc>
+        <w:tc>
+          <w:tcPr>
+            <w:tcW w:type="dxa" w:w="2635"/>
+          </w:tcPr>
+          <w:p>
+            <w:r/>
+            <w:r>
+              <w:rPr>
+                <w:rFonts w:ascii="Arial" w:hAnsi="Arial" w:eastAsia="Arial"/>
+                <w:b w:val="0"/>
+                <w:sz w:val="16"/>
+              </w:rPr>
+            </w:r>
+          </w:p>
+        </w:tc>
+        <w:tc>
+          <w:tcPr>
+            <w:tcW w:type="dxa" w:w="2635"/>
+          </w:tcPr>
+          <w:p>
+            <w:r/>
+            <w:r>
+              <w:rPr>
+                <w:rFonts w:ascii="Arial" w:hAnsi="Arial" w:eastAsia="Arial"/>
+                <w:b w:val="0"/>
+                <w:sz w:val="18"/>
+              </w:rPr>
+              <w:t>1 проект</w:t>
+            </w:r>
+          </w:p>
+        </w:tc>
+        <w:tc>
+          <w:tcPr>
+            <w:tcW w:type="dxa" w:w="2635"/>
+          </w:tcPr>
+          <w:p>
+            <w:r/>
+            <w:r>
+              <w:rPr>
+                <w:rFonts w:ascii="Arial" w:hAnsi="Arial" w:eastAsia="Arial"/>
+                <w:b w:val="0"/>
+                <w:sz w:val="18"/>
+              </w:rPr>
+              <w:t>25 000</w:t>
+            </w:r>
+          </w:p>
+        </w:tc>
+      </w:tr>
+      <w:tr>
+        <w:tc>
+          <w:tcPr>
+            <w:tcW w:type="dxa" w:w="2635"/>
+          </w:tcPr>
+          <w:p>
+            <w:r/>
+            <w:r>
+              <w:rPr>
+                <w:rFonts w:ascii="Arial" w:hAnsi="Arial" w:eastAsia="Arial"/>
+                <w:b w:val="0"/>
+                <w:sz w:val="18"/>
+              </w:rPr>
+              <w:t>9. Бинго и расходники</w:t>
+            </w:r>
+          </w:p>
+        </w:tc>
+        <w:tc>
+          <w:tcPr>
+            <w:tcW w:type="dxa" w:w="2635"/>
+          </w:tcPr>
+          <w:p>
+            <w:r/>
+            <w:r>
+              <w:rPr>
+                <w:rFonts w:ascii="Arial" w:hAnsi="Arial" w:eastAsia="Arial"/>
+                <w:b w:val="0"/>
+                <w:sz w:val="16"/>
+              </w:rPr>
+            </w:r>
+          </w:p>
+        </w:tc>
+        <w:tc>
+          <w:tcPr>
+            <w:tcW w:type="dxa" w:w="2635"/>
+          </w:tcPr>
+          <w:p>
+            <w:r/>
+            <w:r>
+              <w:rPr>
+                <w:rFonts w:ascii="Arial" w:hAnsi="Arial" w:eastAsia="Arial"/>
+                <w:b w:val="0"/>
+                <w:sz w:val="18"/>
+              </w:rPr>
+              <w:t>1 проект</w:t>
+            </w:r>
+          </w:p>
+        </w:tc>
+        <w:tc>
+          <w:tcPr>
+            <w:tcW w:type="dxa" w:w="2635"/>
+          </w:tcPr>
+          <w:p>
+            <w:r/>
+            <w:r>
+              <w:rPr>
+                <w:rFonts w:ascii="Arial" w:hAnsi="Arial" w:eastAsia="Arial"/>
+                <w:b w:val="0"/>
+                <w:sz w:val="18"/>
+              </w:rPr>
+              <w:t>6 000</w:t>
+            </w:r>
+          </w:p>
+        </w:tc>
+      </w:tr>
+      <w:tr>
+        <w:tc>
+          <w:tcPr>
+            <w:tcW w:type="dxa" w:w="2635"/>
+          </w:tcPr>
+          <w:p>
+            <w:r/>
+            <w:r>
+              <w:rPr>
+                <w:rFonts w:ascii="Arial" w:hAnsi="Arial" w:eastAsia="Arial"/>
+                <w:b w:val="0"/>
+                <w:sz w:val="18"/>
+              </w:rPr>
+              <w:t>10. Покупки в Genshin Impact для зоны</w:t>
+            </w:r>
+          </w:p>
+        </w:tc>
+        <w:tc>
+          <w:tcPr>
+            <w:tcW w:type="dxa" w:w="2635"/>
+          </w:tcPr>
+          <w:p>
+            <w:r/>
+            <w:r>
+              <w:rPr>
+                <w:rFonts w:ascii="Arial" w:hAnsi="Arial" w:eastAsia="Arial"/>
+                <w:b w:val="0"/>
+                <w:sz w:val="16"/>
+              </w:rPr>
+              <w:t>Валюта и оформление</w:t>
+            </w:r>
+          </w:p>
+        </w:tc>
+        <w:tc>
+          <w:tcPr>
+            <w:tcW w:type="dxa" w:w="2635"/>
+          </w:tcPr>
+          <w:p>
+            <w:r/>
+            <w:r>
+              <w:rPr>
+                <w:rFonts w:ascii="Arial" w:hAnsi="Arial" w:eastAsia="Arial"/>
+                <w:b w:val="0"/>
+                <w:sz w:val="18"/>
+              </w:rPr>
+              <w:t>1 проект</w:t>
+            </w:r>
+          </w:p>
+        </w:tc>
+        <w:tc>
+          <w:tcPr>
+            <w:tcW w:type="dxa" w:w="2635"/>
+          </w:tcPr>
+          <w:p>
+            <w:r/>
+            <w:r>
+              <w:rPr>
+                <w:rFonts w:ascii="Arial" w:hAnsi="Arial" w:eastAsia="Arial"/>
+                <w:b w:val="0"/>
+                <w:sz w:val="18"/>
+              </w:rPr>
+              <w:t>5 000</w:t>
+            </w:r>
+          </w:p>
+        </w:tc>
+      </w:tr>
+      <w:tr>
+        <w:tc>
+          <w:tcPr>
+            <w:tcW w:type="dxa" w:w="2635"/>
+          </w:tcPr>
+          <w:p>
+            <w:r/>
+            <w:r>
+              <w:rPr>
+                <w:rFonts w:ascii="Arial" w:hAnsi="Arial" w:eastAsia="Arial"/>
+                <w:b w:val="0"/>
+                <w:sz w:val="18"/>
+              </w:rPr>
+              <w:t>11. Аренда 14 смартфонов</w:t>
+            </w:r>
+          </w:p>
+        </w:tc>
+        <w:tc>
+          <w:tcPr>
+            <w:tcW w:type="dxa" w:w="2635"/>
+          </w:tcPr>
+          <w:p>
+            <w:r/>
+            <w:r>
+              <w:rPr>
+                <w:rFonts w:ascii="Arial" w:hAnsi="Arial" w:eastAsia="Arial"/>
+                <w:b w:val="0"/>
+                <w:sz w:val="16"/>
+              </w:rPr>
+              <w:t>2 суток, с резервом</w:t>
+            </w:r>
+          </w:p>
+        </w:tc>
+        <w:tc>
+          <w:tcPr>
+            <w:tcW w:type="dxa" w:w="2635"/>
+          </w:tcPr>
+          <w:p>
+            <w:r/>
+            <w:r>
+              <w:rPr>
+                <w:rFonts w:ascii="Arial" w:hAnsi="Arial" w:eastAsia="Arial"/>
+                <w:b w:val="0"/>
+                <w:sz w:val="18"/>
+              </w:rPr>
+              <w:t>1 проект</w:t>
+            </w:r>
+          </w:p>
+        </w:tc>
+        <w:tc>
+          <w:tcPr>
+            <w:tcW w:type="dxa" w:w="2635"/>
+          </w:tcPr>
+          <w:p>
+            <w:r/>
+            <w:r>
+              <w:rPr>
+                <w:rFonts w:ascii="Arial" w:hAnsi="Arial" w:eastAsia="Arial"/>
+                <w:b w:val="0"/>
+                <w:sz w:val="18"/>
+              </w:rPr>
+              <w:t>15 900</w:t>
+            </w:r>
+          </w:p>
+        </w:tc>
+      </w:tr>
+      <w:tr>
+        <w:tc>
+          <w:tcPr>
+            <w:tcW w:type="dxa" w:w="2635"/>
+          </w:tcPr>
+          <w:p>
+            <w:r/>
+            <w:r>
+              <w:rPr>
+                <w:rFonts w:ascii="Arial" w:hAnsi="Arial" w:eastAsia="Arial"/>
+                <w:b w:val="0"/>
+                <w:sz w:val="18"/>
+              </w:rPr>
+              <w:t>12. Медийный гость</w:t>
+            </w:r>
+          </w:p>
+        </w:tc>
+        <w:tc>
+          <w:tcPr>
+            <w:tcW w:type="dxa" w:w="2635"/>
+          </w:tcPr>
+          <w:p>
+            <w:r/>
+            <w:r>
+              <w:rPr>
+                <w:rFonts w:ascii="Arial" w:hAnsi="Arial" w:eastAsia="Arial"/>
+                <w:b w:val="0"/>
+                <w:sz w:val="16"/>
+              </w:rPr>
+            </w:r>
+          </w:p>
+        </w:tc>
+        <w:tc>
+          <w:tcPr>
+            <w:tcW w:type="dxa" w:w="2635"/>
+          </w:tcPr>
+          <w:p>
+            <w:r/>
+            <w:r>
+              <w:rPr>
+                <w:rFonts w:ascii="Arial" w:hAnsi="Arial" w:eastAsia="Arial"/>
+                <w:b w:val="0"/>
+                <w:sz w:val="18"/>
+              </w:rPr>
+              <w:t>1 проект</w:t>
+            </w:r>
+          </w:p>
+        </w:tc>
+        <w:tc>
+          <w:tcPr>
+            <w:tcW w:type="dxa" w:w="2635"/>
+          </w:tcPr>
+          <w:p>
+            <w:r/>
+            <w:r>
+              <w:rPr>
+                <w:rFonts w:ascii="Arial" w:hAnsi="Arial" w:eastAsia="Arial"/>
+                <w:b w:val="0"/>
+                <w:sz w:val="18"/>
+              </w:rPr>
+              <w:t>25 000</w:t>
+            </w:r>
+          </w:p>
+        </w:tc>
+      </w:tr>
+      <w:tr>
+        <w:tc>
+          <w:tcPr>
+            <w:tcW w:type="dxa" w:w="2635"/>
+          </w:tcPr>
+          <w:p>
+            <w:r/>
+            <w:r>
+              <w:rPr>
+                <w:rFonts w:ascii="Arial" w:hAnsi="Arial" w:eastAsia="Arial"/>
+                <w:b w:val="0"/>
+                <w:sz w:val="18"/>
+              </w:rPr>
+              <w:t>13. Запас на непредвиденное</w:t>
+            </w:r>
+          </w:p>
+        </w:tc>
+        <w:tc>
+          <w:tcPr>
+            <w:tcW w:type="dxa" w:w="2635"/>
+          </w:tcPr>
+          <w:p>
+            <w:r/>
+            <w:r>
+              <w:rPr>
+                <w:rFonts w:ascii="Arial" w:hAnsi="Arial" w:eastAsia="Arial"/>
+                <w:b w:val="0"/>
+                <w:sz w:val="16"/>
+              </w:rPr>
+            </w:r>
+          </w:p>
+        </w:tc>
+        <w:tc>
+          <w:tcPr>
+            <w:tcW w:type="dxa" w:w="2635"/>
+          </w:tcPr>
+          <w:p>
+            <w:r/>
+            <w:r>
+              <w:rPr>
+                <w:rFonts w:ascii="Arial" w:hAnsi="Arial" w:eastAsia="Arial"/>
+                <w:b w:val="0"/>
+                <w:sz w:val="18"/>
+              </w:rPr>
+              <w:t>1 проект</w:t>
+            </w:r>
+          </w:p>
+        </w:tc>
+        <w:tc>
+          <w:tcPr>
+            <w:tcW w:type="dxa" w:w="2635"/>
+          </w:tcPr>
+          <w:p>
+            <w:r/>
+            <w:r>
+              <w:rPr>
+                <w:rFonts w:ascii="Arial" w:hAnsi="Arial" w:eastAsia="Arial"/>
+                <w:b w:val="0"/>
+                <w:sz w:val="18"/>
+              </w:rPr>
+              <w:t>20 350</w:t>
+            </w:r>
+          </w:p>
+        </w:tc>
+      </w:tr>
+      <w:tr>
+        <w:tc>
+          <w:tcPr>
+            <w:tcW w:type="dxa" w:w="2635"/>
+            <w:shd w:fill="D6EAF8" w:val="clear"/>
+          </w:tcPr>
+          <w:p>
+            <w:r/>
+            <w:r>
+              <w:rPr>
+                <w:rFonts w:ascii="Arial" w:hAnsi="Arial" w:eastAsia="Arial"/>
+                <w:b/>
+                <w:sz w:val="18"/>
+              </w:rPr>
+              <w:t>Итого: 6. Организация ивента</w:t>
+            </w:r>
+          </w:p>
+        </w:tc>
+        <w:tc>
+          <w:tcPr>
+            <w:tcW w:type="dxa" w:w="2635"/>
+            <w:shd w:fill="D6EAF8" w:val="clear"/>
+          </w:tcPr>
+          <w:p/>
+        </w:tc>
+        <w:tc>
+          <w:tcPr>
+            <w:tcW w:type="dxa" w:w="2635"/>
+            <w:shd w:fill="D6EAF8" w:val="clear"/>
+          </w:tcPr>
+          <w:p/>
+        </w:tc>
+        <w:tc>
+          <w:tcPr>
+            <w:tcW w:type="dxa" w:w="2635"/>
+            <w:shd w:fill="D6EAF8" w:val="clear"/>
+          </w:tcPr>
+          <w:p>
+            <w:r/>
+            <w:r>
+              <w:rPr>
+                <w:rFonts w:ascii="Arial" w:hAnsi="Arial" w:eastAsia="Arial"/>
+                <w:b/>
+                <w:sz w:val="18"/>
+              </w:rPr>
+              <w:t>286 400</w:t>
+            </w:r>
+          </w:p>
+        </w:tc>
+      </w:tr>
+      <w:tr>
+        <w:tc>
+          <w:tcPr>
+            <w:tcW w:type="dxa" w:w="2635"/>
+            <w:shd w:fill="FFF2CC" w:val="clear"/>
+          </w:tcPr>
+          <w:p>
+            <w:r/>
+            <w:r>
+              <w:rPr>
+                <w:rFonts w:ascii="Arial" w:hAnsi="Arial" w:eastAsia="Arial"/>
+                <w:b/>
+                <w:sz w:val="18"/>
+              </w:rPr>
+              <w:t>ИТОГО</w:t>
+            </w:r>
+          </w:p>
+        </w:tc>
+        <w:tc>
+          <w:tcPr>
+            <w:tcW w:type="dxa" w:w="2635"/>
+            <w:shd w:fill="FFF2CC" w:val="clear"/>
+          </w:tcPr>
+          <w:p/>
+        </w:tc>
+        <w:tc>
+          <w:tcPr>
+            <w:tcW w:type="dxa" w:w="2635"/>
+            <w:shd w:fill="FFF2CC" w:val="clear"/>
+          </w:tcPr>
+          <w:p/>
+        </w:tc>
+        <w:tc>
+          <w:tcPr>
+            <w:tcW w:type="dxa" w:w="2635"/>
+            <w:shd w:fill="FFF2CC" w:val="clear"/>
+          </w:tcPr>
+          <w:p>
+            <w:r/>
+            <w:r>
+              <w:rPr>
+                <w:rFonts w:ascii="Arial" w:hAnsi="Arial" w:eastAsia="Arial"/>
+                <w:b/>
+                <w:sz w:val="18"/>
+              </w:rPr>
+              <w:t>900 000</w:t>
             </w:r>
           </w:p>
         </w:tc>
@@ -2229,7 +2344,7 @@
     </w:tbl>
     <w:sectPr>
       <w:pgSz w:w="12240" w:h="15840"/>
-      <w:pgMar w:top="1134" w:right="1134" w:bottom="1134" w:left="1134" w:header="720" w:footer="720" w:gutter="0"/>
+      <w:pgMar w:top="850" w:right="850" w:bottom="850" w:left="850" w:header="720" w:footer="720" w:gutter="0"/>
       <w:cols w:space="720"/>
       <w:docGrid w:linePitch="360"/>
     </w:sectPr>

</xml_diff>

<commit_message>
Drop contingency, add 4 Genshin PCs, end day at 18:00
Move reserve into four gaming PCs for the Genshin zone, trim event
production lines to keep 900k, and compress the schedule to close at 18:00.

Co-authored-by: harakirijkee <harakirijkee@gmail.com>
</commit_message>
<xml_diff>
--- a/MLBB_CyberSaturday_CNY_Brief_Budget.docx
+++ b/MLBB_CyberSaturday_CNY_Brief_Budget.docx
@@ -27,7 +27,7 @@
           <w:color w:val="505050"/>
           <w:sz w:val="22"/>
         </w:rPr>
-        <w:t>Киберсуббота · Сколково · 6 февраля 2027 · 900 000 ₽</w:t>
+        <w:t>Киберсуббота · Сколково · 6 февраля 2027 · до 18:00 · 900 000 ₽</w:t>
       </w:r>
     </w:p>
     <w:p>
@@ -37,7 +37,471 @@
           <w:b w:val="0"/>
           <w:sz w:val="20"/>
         </w:rPr>
-        <w:t>Команды на турнир 5×5 регистрируются заранее. Активности доступны всё время работы зоны. Ивент получит размещение в официальных пабликах Mobile Legends. Компьютеры не арендуем.</w:t>
+        <w:t>Команды на турнир 5×5 регистрируются заранее. Зона работает до 18:00. Активности доступны всё время. Ивент получит размещение в официальных пабликах Mobile Legends. На зоне Genshin Impact — 4 компьютера.</w:t>
+      </w:r>
+    </w:p>
+    <w:p>
+      <w:r>
+        <w:rPr>
+          <w:rFonts w:ascii="Arial" w:hAnsi="Arial" w:eastAsia="Arial"/>
+          <w:b/>
+          <w:color w:val="1F4E79"/>
+          <w:sz w:val="26"/>
+        </w:rPr>
+        <w:t>Расписание</w:t>
+      </w:r>
+    </w:p>
+    <w:tbl>
+      <w:tblPr>
+        <w:tblStyle w:val="TableGrid"/>
+        <w:tblW w:type="auto" w:w="0"/>
+        <w:tblLook w:firstColumn="1" w:firstRow="1" w:lastColumn="0" w:lastRow="0" w:noHBand="0" w:noVBand="1" w:val="04A0"/>
+      </w:tblPr>
+      <w:tblGrid>
+        <w:gridCol w:w="5270"/>
+        <w:gridCol w:w="5270"/>
+      </w:tblGrid>
+      <w:tr>
+        <w:tc>
+          <w:tcPr>
+            <w:tcW w:type="dxa" w:w="5270"/>
+            <w:shd w:fill="1F4E79" w:val="clear"/>
+          </w:tcPr>
+          <w:p>
+            <w:r>
+              <w:rPr>
+                <w:color w:val="FFFFFF"/>
+              </w:rPr>
+            </w:r>
+            <w:r>
+              <w:rPr>
+                <w:rFonts w:ascii="Arial" w:hAnsi="Arial" w:eastAsia="Arial"/>
+                <w:b/>
+                <w:color w:val="FFFFFF"/>
+                <w:sz w:val="18"/>
+              </w:rPr>
+              <w:t>Время</w:t>
+            </w:r>
+          </w:p>
+        </w:tc>
+        <w:tc>
+          <w:tcPr>
+            <w:tcW w:type="dxa" w:w="5270"/>
+            <w:shd w:fill="1F4E79" w:val="clear"/>
+          </w:tcPr>
+          <w:p>
+            <w:r>
+              <w:rPr>
+                <w:color w:val="FFFFFF"/>
+              </w:rPr>
+            </w:r>
+            <w:r>
+              <w:rPr>
+                <w:rFonts w:ascii="Arial" w:hAnsi="Arial" w:eastAsia="Arial"/>
+                <w:b/>
+                <w:color w:val="FFFFFF"/>
+                <w:sz w:val="18"/>
+              </w:rPr>
+              <w:t>Активность</w:t>
+            </w:r>
+          </w:p>
+        </w:tc>
+      </w:tr>
+      <w:tr>
+        <w:tc>
+          <w:tcPr>
+            <w:tcW w:type="dxa" w:w="5270"/>
+          </w:tcPr>
+          <w:p>
+            <w:r/>
+            <w:r>
+              <w:rPr>
+                <w:rFonts w:ascii="Arial" w:hAnsi="Arial" w:eastAsia="Arial"/>
+                <w:b/>
+                <w:sz w:val="18"/>
+              </w:rPr>
+              <w:t>10:00–11:00</w:t>
+            </w:r>
+          </w:p>
+        </w:tc>
+        <w:tc>
+          <w:tcPr>
+            <w:tcW w:type="dxa" w:w="5270"/>
+          </w:tcPr>
+          <w:p>
+            <w:r/>
+            <w:r>
+              <w:rPr>
+                <w:rFonts w:ascii="Arial" w:hAnsi="Arial" w:eastAsia="Arial"/>
+                <w:b w:val="0"/>
+                <w:sz w:val="18"/>
+              </w:rPr>
+              <w:t>Подготовка зоны, проверка техники, брифинг</w:t>
+            </w:r>
+          </w:p>
+        </w:tc>
+      </w:tr>
+      <w:tr>
+        <w:tc>
+          <w:tcPr>
+            <w:tcW w:type="dxa" w:w="5270"/>
+            <w:shd w:fill="D6EAF8" w:val="clear"/>
+          </w:tcPr>
+          <w:p>
+            <w:r/>
+            <w:r>
+              <w:rPr>
+                <w:rFonts w:ascii="Arial" w:hAnsi="Arial" w:eastAsia="Arial"/>
+                <w:b/>
+                <w:sz w:val="18"/>
+              </w:rPr>
+              <w:t>11:00</w:t>
+            </w:r>
+          </w:p>
+        </w:tc>
+        <w:tc>
+          <w:tcPr>
+            <w:tcW w:type="dxa" w:w="5270"/>
+            <w:shd w:fill="D6EAF8" w:val="clear"/>
+          </w:tcPr>
+          <w:p>
+            <w:r/>
+            <w:r>
+              <w:rPr>
+                <w:rFonts w:ascii="Arial" w:hAnsi="Arial" w:eastAsia="Arial"/>
+                <w:b w:val="0"/>
+                <w:sz w:val="18"/>
+              </w:rPr>
+              <w:t>Открытие зоны</w:t>
+            </w:r>
+          </w:p>
+        </w:tc>
+      </w:tr>
+      <w:tr>
+        <w:tc>
+          <w:tcPr>
+            <w:tcW w:type="dxa" w:w="5270"/>
+          </w:tcPr>
+          <w:p>
+            <w:r/>
+            <w:r>
+              <w:rPr>
+                <w:rFonts w:ascii="Arial" w:hAnsi="Arial" w:eastAsia="Arial"/>
+                <w:b/>
+                <w:sz w:val="18"/>
+              </w:rPr>
+              <w:t>12:00</w:t>
+            </w:r>
+          </w:p>
+        </w:tc>
+        <w:tc>
+          <w:tcPr>
+            <w:tcW w:type="dxa" w:w="5270"/>
+          </w:tcPr>
+          <w:p>
+            <w:r/>
+            <w:r>
+              <w:rPr>
+                <w:rFonts w:ascii="Arial" w:hAnsi="Arial" w:eastAsia="Arial"/>
+                <w:b w:val="0"/>
+                <w:sz w:val="18"/>
+              </w:rPr>
+              <w:t>Сверка команд турнира 5×5 и публикация сетки</w:t>
+            </w:r>
+          </w:p>
+        </w:tc>
+      </w:tr>
+      <w:tr>
+        <w:tc>
+          <w:tcPr>
+            <w:tcW w:type="dxa" w:w="5270"/>
+            <w:shd w:fill="D6EAF8" w:val="clear"/>
+          </w:tcPr>
+          <w:p>
+            <w:r/>
+            <w:r>
+              <w:rPr>
+                <w:rFonts w:ascii="Arial" w:hAnsi="Arial" w:eastAsia="Arial"/>
+                <w:b/>
+                <w:sz w:val="18"/>
+              </w:rPr>
+              <w:t>12:30</w:t>
+            </w:r>
+          </w:p>
+        </w:tc>
+        <w:tc>
+          <w:tcPr>
+            <w:tcW w:type="dxa" w:w="5270"/>
+            <w:shd w:fill="D6EAF8" w:val="clear"/>
+          </w:tcPr>
+          <w:p>
+            <w:r/>
+            <w:r>
+              <w:rPr>
+                <w:rFonts w:ascii="Arial" w:hAnsi="Arial" w:eastAsia="Arial"/>
+                <w:b w:val="0"/>
+                <w:sz w:val="18"/>
+              </w:rPr>
+              <w:t>Старт турнира 5×5</w:t>
+            </w:r>
+          </w:p>
+        </w:tc>
+      </w:tr>
+      <w:tr>
+        <w:tc>
+          <w:tcPr>
+            <w:tcW w:type="dxa" w:w="5270"/>
+          </w:tcPr>
+          <w:p>
+            <w:r/>
+            <w:r>
+              <w:rPr>
+                <w:rFonts w:ascii="Arial" w:hAnsi="Arial" w:eastAsia="Arial"/>
+                <w:b/>
+                <w:sz w:val="18"/>
+              </w:rPr>
+              <w:t>14:00</w:t>
+            </w:r>
+          </w:p>
+        </w:tc>
+        <w:tc>
+          <w:tcPr>
+            <w:tcW w:type="dxa" w:w="5270"/>
+          </w:tcPr>
+          <w:p>
+            <w:r/>
+            <w:r>
+              <w:rPr>
+                <w:rFonts w:ascii="Arial" w:hAnsi="Arial" w:eastAsia="Arial"/>
+                <w:b w:val="0"/>
+                <w:sz w:val="18"/>
+              </w:rPr>
+              <w:t>Бинго и викторина</w:t>
+            </w:r>
+          </w:p>
+        </w:tc>
+      </w:tr>
+      <w:tr>
+        <w:tc>
+          <w:tcPr>
+            <w:tcW w:type="dxa" w:w="5270"/>
+            <w:shd w:fill="D6EAF8" w:val="clear"/>
+          </w:tcPr>
+          <w:p>
+            <w:r/>
+            <w:r>
+              <w:rPr>
+                <w:rFonts w:ascii="Arial" w:hAnsi="Arial" w:eastAsia="Arial"/>
+                <w:b/>
+                <w:sz w:val="18"/>
+              </w:rPr>
+              <w:t>14:45</w:t>
+            </w:r>
+          </w:p>
+        </w:tc>
+        <w:tc>
+          <w:tcPr>
+            <w:tcW w:type="dxa" w:w="5270"/>
+            <w:shd w:fill="D6EAF8" w:val="clear"/>
+          </w:tcPr>
+          <w:p>
+            <w:r/>
+            <w:r>
+              <w:rPr>
+                <w:rFonts w:ascii="Arial" w:hAnsi="Arial" w:eastAsia="Arial"/>
+                <w:b w:val="0"/>
+                <w:sz w:val="18"/>
+              </w:rPr>
+              <w:t>Медийный гость на зоне</w:t>
+            </w:r>
+          </w:p>
+        </w:tc>
+      </w:tr>
+      <w:tr>
+        <w:tc>
+          <w:tcPr>
+            <w:tcW w:type="dxa" w:w="5270"/>
+          </w:tcPr>
+          <w:p>
+            <w:r/>
+            <w:r>
+              <w:rPr>
+                <w:rFonts w:ascii="Arial" w:hAnsi="Arial" w:eastAsia="Arial"/>
+                <w:b/>
+                <w:sz w:val="18"/>
+              </w:rPr>
+              <w:t>15:15</w:t>
+            </w:r>
+          </w:p>
+        </w:tc>
+        <w:tc>
+          <w:tcPr>
+            <w:tcW w:type="dxa" w:w="5270"/>
+          </w:tcPr>
+          <w:p>
+            <w:r/>
+            <w:r>
+              <w:rPr>
+                <w:rFonts w:ascii="Arial" w:hAnsi="Arial" w:eastAsia="Arial"/>
+                <w:b w:val="0"/>
+                <w:sz w:val="18"/>
+              </w:rPr>
+              <w:t>Игры на вылет, турнир 5×5</w:t>
+            </w:r>
+          </w:p>
+        </w:tc>
+      </w:tr>
+      <w:tr>
+        <w:tc>
+          <w:tcPr>
+            <w:tcW w:type="dxa" w:w="5270"/>
+            <w:shd w:fill="D6EAF8" w:val="clear"/>
+          </w:tcPr>
+          <w:p>
+            <w:r/>
+            <w:r>
+              <w:rPr>
+                <w:rFonts w:ascii="Arial" w:hAnsi="Arial" w:eastAsia="Arial"/>
+                <w:b/>
+                <w:sz w:val="18"/>
+              </w:rPr>
+              <w:t>16:15</w:t>
+            </w:r>
+          </w:p>
+        </w:tc>
+        <w:tc>
+          <w:tcPr>
+            <w:tcW w:type="dxa" w:w="5270"/>
+            <w:shd w:fill="D6EAF8" w:val="clear"/>
+          </w:tcPr>
+          <w:p>
+            <w:r/>
+            <w:r>
+              <w:rPr>
+                <w:rFonts w:ascii="Arial" w:hAnsi="Arial" w:eastAsia="Arial"/>
+                <w:b w:val="0"/>
+                <w:sz w:val="18"/>
+              </w:rPr>
+              <w:t>Полуфиналы</w:t>
+            </w:r>
+          </w:p>
+        </w:tc>
+      </w:tr>
+      <w:tr>
+        <w:tc>
+          <w:tcPr>
+            <w:tcW w:type="dxa" w:w="5270"/>
+          </w:tcPr>
+          <w:p>
+            <w:r/>
+            <w:r>
+              <w:rPr>
+                <w:rFonts w:ascii="Arial" w:hAnsi="Arial" w:eastAsia="Arial"/>
+                <w:b/>
+                <w:sz w:val="18"/>
+              </w:rPr>
+              <w:t>17:00</w:t>
+            </w:r>
+          </w:p>
+        </w:tc>
+        <w:tc>
+          <w:tcPr>
+            <w:tcW w:type="dxa" w:w="5270"/>
+          </w:tcPr>
+          <w:p>
+            <w:r/>
+            <w:r>
+              <w:rPr>
+                <w:rFonts w:ascii="Arial" w:hAnsi="Arial" w:eastAsia="Arial"/>
+                <w:b w:val="0"/>
+                <w:sz w:val="18"/>
+              </w:rPr>
+              <w:t>Финал</w:t>
+            </w:r>
+          </w:p>
+        </w:tc>
+      </w:tr>
+      <w:tr>
+        <w:tc>
+          <w:tcPr>
+            <w:tcW w:type="dxa" w:w="5270"/>
+            <w:shd w:fill="D6EAF8" w:val="clear"/>
+          </w:tcPr>
+          <w:p>
+            <w:r/>
+            <w:r>
+              <w:rPr>
+                <w:rFonts w:ascii="Arial" w:hAnsi="Arial" w:eastAsia="Arial"/>
+                <w:b/>
+                <w:sz w:val="18"/>
+              </w:rPr>
+              <w:t>17:30</w:t>
+            </w:r>
+          </w:p>
+        </w:tc>
+        <w:tc>
+          <w:tcPr>
+            <w:tcW w:type="dxa" w:w="5270"/>
+            <w:shd w:fill="D6EAF8" w:val="clear"/>
+          </w:tcPr>
+          <w:p>
+            <w:r/>
+            <w:r>
+              <w:rPr>
+                <w:rFonts w:ascii="Arial" w:hAnsi="Arial" w:eastAsia="Arial"/>
+                <w:b w:val="0"/>
+                <w:sz w:val="18"/>
+              </w:rPr>
+              <w:t>Награждение</w:t>
+            </w:r>
+          </w:p>
+        </w:tc>
+      </w:tr>
+      <w:tr>
+        <w:tc>
+          <w:tcPr>
+            <w:tcW w:type="dxa" w:w="5270"/>
+          </w:tcPr>
+          <w:p>
+            <w:r/>
+            <w:r>
+              <w:rPr>
+                <w:rFonts w:ascii="Arial" w:hAnsi="Arial" w:eastAsia="Arial"/>
+                <w:b/>
+                <w:sz w:val="18"/>
+              </w:rPr>
+              <w:t>18:00</w:t>
+            </w:r>
+          </w:p>
+        </w:tc>
+        <w:tc>
+          <w:tcPr>
+            <w:tcW w:type="dxa" w:w="5270"/>
+          </w:tcPr>
+          <w:p>
+            <w:r/>
+            <w:r>
+              <w:rPr>
+                <w:rFonts w:ascii="Arial" w:hAnsi="Arial" w:eastAsia="Arial"/>
+                <w:b w:val="0"/>
+                <w:sz w:val="18"/>
+              </w:rPr>
+              <w:t>Закрытие зоны</w:t>
+            </w:r>
+          </w:p>
+        </w:tc>
+      </w:tr>
+    </w:tbl>
+    <w:p/>
+    <w:p>
+      <w:r>
+        <w:rPr>
+          <w:rFonts w:ascii="Arial" w:hAnsi="Arial" w:eastAsia="Arial"/>
+          <w:b/>
+          <w:color w:val="1F4E79"/>
+          <w:sz w:val="26"/>
+        </w:rPr>
+        <w:t>Смета</w:t>
       </w:r>
     </w:p>
     <w:tbl>
@@ -1079,7 +1543,73 @@
                 <w:b w:val="0"/>
                 <w:sz w:val="18"/>
               </w:rPr>
-              <w:t>2. Телевизор 65″</w:t>
+              <w:t>2. Игровой компьютер</w:t>
+            </w:r>
+          </w:p>
+        </w:tc>
+        <w:tc>
+          <w:tcPr>
+            <w:tcW w:type="dxa" w:w="2635"/>
+          </w:tcPr>
+          <w:p>
+            <w:r/>
+            <w:r>
+              <w:rPr>
+                <w:rFonts w:ascii="Arial" w:hAnsi="Arial" w:eastAsia="Arial"/>
+                <w:b w:val="0"/>
+                <w:sz w:val="16"/>
+              </w:rPr>
+              <w:t>Зона Genshin Impact, мини-игры; смена до 12 ч</w:t>
+            </w:r>
+          </w:p>
+        </w:tc>
+        <w:tc>
+          <w:tcPr>
+            <w:tcW w:type="dxa" w:w="2635"/>
+          </w:tcPr>
+          <w:p>
+            <w:r/>
+            <w:r>
+              <w:rPr>
+                <w:rFonts w:ascii="Arial" w:hAnsi="Arial" w:eastAsia="Arial"/>
+                <w:b w:val="0"/>
+                <w:sz w:val="18"/>
+              </w:rPr>
+              <w:t>4 шт.</w:t>
+            </w:r>
+          </w:p>
+        </w:tc>
+        <w:tc>
+          <w:tcPr>
+            <w:tcW w:type="dxa" w:w="2635"/>
+          </w:tcPr>
+          <w:p>
+            <w:r/>
+            <w:r>
+              <w:rPr>
+                <w:rFonts w:ascii="Arial" w:hAnsi="Arial" w:eastAsia="Arial"/>
+                <w:b w:val="0"/>
+                <w:sz w:val="18"/>
+              </w:rPr>
+              <w:t>41 760</w:t>
+            </w:r>
+          </w:p>
+        </w:tc>
+      </w:tr>
+      <w:tr>
+        <w:tc>
+          <w:tcPr>
+            <w:tcW w:type="dxa" w:w="2635"/>
+          </w:tcPr>
+          <w:p>
+            <w:r/>
+            <w:r>
+              <w:rPr>
+                <w:rFonts w:ascii="Arial" w:hAnsi="Arial" w:eastAsia="Arial"/>
+                <w:b w:val="0"/>
+                <w:sz w:val="18"/>
+              </w:rPr>
+              <w:t>3. Телевизор 65″</w:t>
             </w:r>
           </w:p>
         </w:tc>
@@ -1177,7 +1707,7 @@
                 <w:b/>
                 <w:sz w:val="18"/>
               </w:rPr>
-              <w:t>32 000</w:t>
+              <w:t>73 760</w:t>
             </w:r>
           </w:p>
         </w:tc>
@@ -1449,7 +1979,7 @@
                 <w:b w:val="0"/>
                 <w:sz w:val="18"/>
               </w:rPr>
-              <w:t>45 000</w:t>
+              <w:t>40 000</w:t>
             </w:r>
           </w:p>
         </w:tc>
@@ -1713,7 +2243,7 @@
                 <w:b w:val="0"/>
                 <w:sz w:val="18"/>
               </w:rPr>
-              <w:t>25 000</w:t>
+              <w:t>21 590</w:t>
             </w:r>
           </w:p>
         </w:tc>
@@ -1778,7 +2308,7 @@
                 <w:b w:val="0"/>
                 <w:sz w:val="18"/>
               </w:rPr>
-              <w:t>25 000</w:t>
+              <w:t>22 000</w:t>
             </w:r>
           </w:p>
         </w:tc>
@@ -1909,7 +2439,7 @@
                 <w:b w:val="0"/>
                 <w:sz w:val="18"/>
               </w:rPr>
-              <w:t>25 000</w:t>
+              <w:t>20 000</w:t>
             </w:r>
           </w:p>
         </w:tc>
@@ -2171,72 +2701,7 @@
                 <w:b w:val="0"/>
                 <w:sz w:val="18"/>
               </w:rPr>
-              <w:t>25 000</w:t>
-            </w:r>
-          </w:p>
-        </w:tc>
-      </w:tr>
-      <w:tr>
-        <w:tc>
-          <w:tcPr>
-            <w:tcW w:type="dxa" w:w="2635"/>
-          </w:tcPr>
-          <w:p>
-            <w:r/>
-            <w:r>
-              <w:rPr>
-                <w:rFonts w:ascii="Arial" w:hAnsi="Arial" w:eastAsia="Arial"/>
-                <w:b w:val="0"/>
-                <w:sz w:val="18"/>
-              </w:rPr>
-              <w:t>13. Запас на непредвиденное</w:t>
-            </w:r>
-          </w:p>
-        </w:tc>
-        <w:tc>
-          <w:tcPr>
-            <w:tcW w:type="dxa" w:w="2635"/>
-          </w:tcPr>
-          <w:p>
-            <w:r/>
-            <w:r>
-              <w:rPr>
-                <w:rFonts w:ascii="Arial" w:hAnsi="Arial" w:eastAsia="Arial"/>
-                <w:b w:val="0"/>
-                <w:sz w:val="16"/>
-              </w:rPr>
-            </w:r>
-          </w:p>
-        </w:tc>
-        <w:tc>
-          <w:tcPr>
-            <w:tcW w:type="dxa" w:w="2635"/>
-          </w:tcPr>
-          <w:p>
-            <w:r/>
-            <w:r>
-              <w:rPr>
-                <w:rFonts w:ascii="Arial" w:hAnsi="Arial" w:eastAsia="Arial"/>
-                <w:b w:val="0"/>
-                <w:sz w:val="18"/>
-              </w:rPr>
-              <w:t>1 проект</w:t>
-            </w:r>
-          </w:p>
-        </w:tc>
-        <w:tc>
-          <w:tcPr>
-            <w:tcW w:type="dxa" w:w="2635"/>
-          </w:tcPr>
-          <w:p>
-            <w:r/>
-            <w:r>
-              <w:rPr>
-                <w:rFonts w:ascii="Arial" w:hAnsi="Arial" w:eastAsia="Arial"/>
-                <w:b w:val="0"/>
-                <w:sz w:val="18"/>
-              </w:rPr>
-              <w:t>20 350</w:t>
+              <w:t>20 000</w:t>
             </w:r>
           </w:p>
         </w:tc>
@@ -2286,7 +2751,7 @@
                 <w:b/>
                 <w:sz w:val="18"/>
               </w:rPr>
-              <w:t>286 400</w:t>
+              <w:t>244 640</w:t>
             </w:r>
           </w:p>
         </w:tc>

</xml_diff>